<commit_message>
generacion especifica de graficos burbuja
</commit_message>
<xml_diff>
--- a/resultados/analisis_datasets.docx
+++ b/resultados/analisis_datasets.docx
@@ -1,6 +1,6 @@
 
 <file path=word/document.xml><?xml version="1.0" encoding="utf-8"?>
-<w:document xmlns:wpc="http://schemas.microsoft.com/office/word/2010/wordprocessingCanvas" xmlns:cx="http://schemas.microsoft.com/office/drawing/2014/chartex" xmlns:cx1="http://schemas.microsoft.com/office/drawing/2015/9/8/chartex" xmlns:cx2="http://schemas.microsoft.com/office/drawing/2015/10/21/chartex" xmlns:cx3="http://schemas.microsoft.com/office/drawing/2016/5/9/chartex" xmlns:cx4="http://schemas.microsoft.com/office/drawing/2016/5/10/chartex" xmlns:cx5="http://schemas.microsoft.com/office/drawing/2016/5/11/chartex" xmlns:cx6="http://schemas.microsoft.com/office/drawing/2016/5/12/chartex" xmlns:cx7="http://schemas.microsoft.com/office/drawing/2016/5/13/chartex" xmlns:cx8="http://schemas.microsoft.com/office/drawing/2016/5/14/chartex" xmlns:mc="http://schemas.openxmlformats.org/markup-compatibility/2006" xmlns:aink="http://schemas.microsoft.com/office/drawing/2016/ink" xmlns:am3d="http://schemas.microsoft.com/office/drawing/2017/model3d" xmlns:o="urn:schemas-microsoft-com:office:office" xmlns:oel="http://schemas.microsoft.com/office/2019/extlst" xmlns:r="http://schemas.openxmlformats.org/officeDocument/2006/relationships" xmlns:m="http://schemas.openxmlformats.org/officeDocument/2006/math" xmlns:v="urn:schemas-microsoft-com:vml" xmlns:wp14="http://schemas.microsoft.com/office/word/2010/wordprocessingDrawing" xmlns:wp="http://schemas.openxmlformats.org/drawingml/2006/wordprocessingDrawing" xmlns:w10="urn:schemas-microsoft-com:office:word" xmlns:w="http://schemas.openxmlformats.org/wordprocessingml/2006/main" xmlns:w14="http://schemas.microsoft.com/office/word/2010/wordml" xmlns:w15="http://schemas.microsoft.com/office/word/2012/wordml" xmlns:w16cex="http://schemas.microsoft.com/office/word/2018/wordml/cex" xmlns:w16cid="http://schemas.microsoft.com/office/word/2016/wordml/cid" xmlns:w16="http://schemas.microsoft.com/office/word/2018/wordml" xmlns:w16du="http://schemas.microsoft.com/office/word/2023/wordml/word16du" xmlns:w16sdtdh="http://schemas.microsoft.com/office/word/2020/wordml/sdtdatahash" xmlns:w16sdtfl="http://schemas.microsoft.com/office/word/2024/wordml/sdtformatlock" xmlns:w16se="http://schemas.microsoft.com/office/word/2015/wordml/symex" xmlns:wpg="http://schemas.microsoft.com/office/word/2010/wordprocessingGroup" xmlns:wpi="http://schemas.microsoft.com/office/word/2010/wordprocessingInk" xmlns:wne="http://schemas.microsoft.com/office/word/2006/wordml" xmlns:wps="http://schemas.microsoft.com/office/word/2010/wordprocessingShape" mc:Ignorable="w14 w15 w16se w16cid w16 w16cex w16sdtdh w16sdtfl w16du wp14">
+<w:document xmlns:wpc="http://schemas.microsoft.com/office/word/2010/wordprocessingCanvas" xmlns:cx="http://schemas.microsoft.com/office/drawing/2014/chartex" xmlns:mc="http://schemas.openxmlformats.org/markup-compatibility/2006" xmlns:o="urn:schemas-microsoft-com:office:office" xmlns:r="http://schemas.openxmlformats.org/officeDocument/2006/relationships" xmlns:m="http://schemas.openxmlformats.org/officeDocument/2006/math" xmlns:v="urn:schemas-microsoft-com:vml" xmlns:wp14="http://schemas.microsoft.com/office/word/2010/wordprocessingDrawing" xmlns:wp="http://schemas.openxmlformats.org/drawingml/2006/wordprocessingDrawing" xmlns:w10="urn:schemas-microsoft-com:office:word" xmlns:w="http://schemas.openxmlformats.org/wordprocessingml/2006/main" xmlns:w14="http://schemas.microsoft.com/office/word/2010/wordml" xmlns:w15="http://schemas.microsoft.com/office/word/2012/wordml" xmlns:w16se="http://schemas.microsoft.com/office/word/2015/wordml/symex" xmlns:wpg="http://schemas.microsoft.com/office/word/2010/wordprocessingGroup" xmlns:wpi="http://schemas.microsoft.com/office/word/2010/wordprocessingInk" xmlns:wne="http://schemas.microsoft.com/office/word/2006/wordml" xmlns:wps="http://schemas.microsoft.com/office/word/2010/wordprocessingShape" mc:Ignorable="w14 w15 w16se wp14">
   <w:body>
     <w:p>
       <w:pPr>
@@ -67,196 +67,42 @@
                 <w:numId w:val="1"/>
               </w:numPr>
               <w:rPr>
-                <w:lang w:val="es-ES"/>
+                <w:lang w:val="en-US"/>
               </w:rPr>
             </w:pPr>
             <w:r>
               <w:rPr>
                 <w:lang w:val="es-ES"/>
               </w:rPr>
-              <w:t xml:space="preserve"> Valores únicos del </w:t>
-            </w:r>
-            <w:proofErr w:type="gramStart"/>
-            <w:r>
-              <w:rPr>
-                <w:lang w:val="es-ES"/>
-              </w:rPr>
-              <w:t>target</w:t>
-            </w:r>
-            <w:proofErr w:type="gramEnd"/>
-            <w:r>
-              <w:rPr>
-                <w:lang w:val="es-ES"/>
-              </w:rPr>
-              <w:t xml:space="preserve">: ['No </w:t>
+              <w:t xml:space="preserve"> </w:t>
             </w:r>
             <w:proofErr w:type="spellStart"/>
             <w:r>
               <w:rPr>
-                <w:lang w:val="es-ES"/>
-              </w:rPr>
-              <w:t>Failure</w:t>
+                <w:lang w:val="en-US"/>
+              </w:rPr>
+              <w:t>Valores</w:t>
             </w:r>
             <w:proofErr w:type="spellEnd"/>
             <w:r>
               <w:rPr>
-                <w:lang w:val="es-ES"/>
-              </w:rPr>
-              <w:t>', '</w:t>
+                <w:lang w:val="en-US"/>
+              </w:rPr>
+              <w:t xml:space="preserve"> </w:t>
             </w:r>
             <w:proofErr w:type="spellStart"/>
             <w:r>
               <w:rPr>
-                <w:lang w:val="es-ES"/>
-              </w:rPr>
-              <w:t>Heat</w:t>
+                <w:lang w:val="en-US"/>
+              </w:rPr>
+              <w:t>únicos</w:t>
             </w:r>
             <w:proofErr w:type="spellEnd"/>
             <w:r>
               <w:rPr>
-                <w:lang w:val="es-ES"/>
-              </w:rPr>
-              <w:t xml:space="preserve"> </w:t>
-            </w:r>
-            <w:proofErr w:type="spellStart"/>
-            <w:r>
-              <w:rPr>
-                <w:lang w:val="es-ES"/>
-              </w:rPr>
-              <w:t>Dissipation</w:t>
-            </w:r>
-            <w:proofErr w:type="spellEnd"/>
-            <w:r>
-              <w:rPr>
-                <w:lang w:val="es-ES"/>
-              </w:rPr>
-              <w:t xml:space="preserve"> </w:t>
-            </w:r>
-            <w:proofErr w:type="spellStart"/>
-            <w:r>
-              <w:rPr>
-                <w:lang w:val="es-ES"/>
-              </w:rPr>
-              <w:t>Failure</w:t>
-            </w:r>
-            <w:proofErr w:type="spellEnd"/>
-            <w:r>
-              <w:rPr>
-                <w:lang w:val="es-ES"/>
-              </w:rPr>
-              <w:t>', '</w:t>
-            </w:r>
-            <w:proofErr w:type="spellStart"/>
-            <w:r>
-              <w:rPr>
-                <w:lang w:val="es-ES"/>
-              </w:rPr>
-              <w:t>Power</w:t>
-            </w:r>
-            <w:proofErr w:type="spellEnd"/>
-            <w:r>
-              <w:rPr>
-                <w:lang w:val="es-ES"/>
-              </w:rPr>
-              <w:t xml:space="preserve"> </w:t>
-            </w:r>
-            <w:proofErr w:type="spellStart"/>
-            <w:r>
-              <w:rPr>
-                <w:lang w:val="es-ES"/>
-              </w:rPr>
-              <w:t>Failure</w:t>
-            </w:r>
-            <w:proofErr w:type="spellEnd"/>
-            <w:r>
-              <w:rPr>
-                <w:lang w:val="es-ES"/>
-              </w:rPr>
-              <w:t>', '</w:t>
-            </w:r>
-            <w:proofErr w:type="spellStart"/>
-            <w:r>
-              <w:rPr>
-                <w:lang w:val="es-ES"/>
-              </w:rPr>
-              <w:t>Overstrain</w:t>
-            </w:r>
-            <w:proofErr w:type="spellEnd"/>
-            <w:r>
-              <w:rPr>
-                <w:lang w:val="es-ES"/>
-              </w:rPr>
-              <w:t xml:space="preserve"> </w:t>
-            </w:r>
-            <w:proofErr w:type="spellStart"/>
-            <w:r>
-              <w:rPr>
-                <w:lang w:val="es-ES"/>
-              </w:rPr>
-              <w:t>Failure</w:t>
-            </w:r>
-            <w:proofErr w:type="spellEnd"/>
-            <w:r>
-              <w:rPr>
-                <w:lang w:val="es-ES"/>
-              </w:rPr>
-              <w:t xml:space="preserve">', 'Tool </w:t>
-            </w:r>
-            <w:proofErr w:type="spellStart"/>
-            <w:r>
-              <w:rPr>
-                <w:lang w:val="es-ES"/>
-              </w:rPr>
-              <w:t>Wear</w:t>
-            </w:r>
-            <w:proofErr w:type="spellEnd"/>
-            <w:r>
-              <w:rPr>
-                <w:lang w:val="es-ES"/>
-              </w:rPr>
-              <w:t xml:space="preserve"> </w:t>
-            </w:r>
-            <w:proofErr w:type="spellStart"/>
-            <w:r>
-              <w:rPr>
-                <w:lang w:val="es-ES"/>
-              </w:rPr>
-              <w:t>Failure</w:t>
-            </w:r>
-            <w:proofErr w:type="spellEnd"/>
-            <w:r>
-              <w:rPr>
-                <w:lang w:val="es-ES"/>
-              </w:rPr>
-              <w:t>', '</w:t>
-            </w:r>
-            <w:proofErr w:type="spellStart"/>
-            <w:r>
-              <w:rPr>
-                <w:lang w:val="es-ES"/>
-              </w:rPr>
-              <w:t>Random</w:t>
-            </w:r>
-            <w:proofErr w:type="spellEnd"/>
-            <w:r>
-              <w:rPr>
-                <w:lang w:val="es-ES"/>
-              </w:rPr>
-              <w:t xml:space="preserve"> </w:t>
-            </w:r>
-            <w:proofErr w:type="spellStart"/>
-            <w:r>
-              <w:rPr>
-                <w:lang w:val="es-ES"/>
-              </w:rPr>
-              <w:t>Failures</w:t>
-            </w:r>
-            <w:proofErr w:type="spellEnd"/>
-            <w:r>
-              <w:rPr>
-                <w:lang w:val="es-ES"/>
-              </w:rPr>
-              <w:t>']</w:t>
+                <w:lang w:val="en-US"/>
+              </w:rPr>
+              <w:t xml:space="preserve"> del target: ['No Failure', 'Heat Dissipation Failure', 'Power Failure', 'Overstrain Failure', 'Tool Wear Failure', 'Random Failures']</w:t>
             </w:r>
           </w:p>
           <w:p>
@@ -454,11 +300,19 @@
                 <w:lang w:val="es-ES"/>
               </w:rPr>
             </w:pPr>
-            <w:r>
-              <w:rPr>
-                <w:lang w:val="es-ES"/>
-              </w:rPr>
-              <w:t xml:space="preserve">Tool </w:t>
+            <w:proofErr w:type="spellStart"/>
+            <w:r>
+              <w:rPr>
+                <w:lang w:val="es-ES"/>
+              </w:rPr>
+              <w:t>Tool</w:t>
+            </w:r>
+            <w:proofErr w:type="spellEnd"/>
+            <w:r>
+              <w:rPr>
+                <w:lang w:val="es-ES"/>
+              </w:rPr>
+              <w:t xml:space="preserve"> </w:t>
             </w:r>
             <w:proofErr w:type="spellStart"/>
             <w:r>
@@ -550,13 +404,27 @@
         <w:rPr>
           <w:lang w:val="es-ES"/>
         </w:rPr>
-        <w:t xml:space="preserve">Análisis de los logs de </w:t>
+        <w:t xml:space="preserve">Análisis de los </w:t>
       </w:r>
       <w:proofErr w:type="spellStart"/>
       <w:r>
         <w:rPr>
           <w:lang w:val="es-ES"/>
         </w:rPr>
+        <w:t>logs</w:t>
+      </w:r>
+      <w:proofErr w:type="spellEnd"/>
+      <w:r>
+        <w:rPr>
+          <w:lang w:val="es-ES"/>
+        </w:rPr>
+        <w:t xml:space="preserve"> de </w:t>
+      </w:r>
+      <w:proofErr w:type="spellStart"/>
+      <w:r>
+        <w:rPr>
+          <w:lang w:val="es-ES"/>
+        </w:rPr>
         <w:t>pcsmote</w:t>
       </w:r>
       <w:proofErr w:type="spellEnd"/>
@@ -574,112 +442,6 @@
           <w:lang w:val="es-ES"/>
         </w:rPr>
       </w:pPr>
-      <w:r>
-        <w:rPr>
-          <w:noProof/>
-        </w:rPr>
-        <w:drawing>
-          <wp:inline distT="0" distB="0" distL="0" distR="0" wp14:anchorId="78DCF9F9" wp14:editId="4C1470A5">
-            <wp:extent cx="4618302" cy="2406650"/>
-            <wp:effectExtent l="0" t="0" r="0" b="0"/>
-            <wp:docPr id="879668021" name="Imagen 2" descr="Gráfico, Gráfico de dispersión, Gráfico de burbujas&#10;&#10;El contenido generado por IA puede ser incorrecto."/>
-            <wp:cNvGraphicFramePr>
-              <a:graphicFrameLocks xmlns:a="http://schemas.openxmlformats.org/drawingml/2006/main" noChangeAspect="1"/>
-            </wp:cNvGraphicFramePr>
-            <a:graphic xmlns:a="http://schemas.openxmlformats.org/drawingml/2006/main">
-              <a:graphicData uri="http://schemas.openxmlformats.org/drawingml/2006/picture">
-                <pic:pic xmlns:pic="http://schemas.openxmlformats.org/drawingml/2006/picture">
-                  <pic:nvPicPr>
-                    <pic:cNvPr id="879668021" name="Imagen 2" descr="Gráfico, Gráfico de dispersión, Gráfico de burbujas&#10;&#10;El contenido generado por IA puede ser incorrecto."/>
-                    <pic:cNvPicPr>
-                      <a:picLocks noChangeAspect="1" noChangeArrowheads="1"/>
-                    </pic:cNvPicPr>
-                  </pic:nvPicPr>
-                  <pic:blipFill>
-                    <a:blip r:embed="rId5" cstate="print">
-                      <a:extLst>
-                        <a:ext uri="{28A0092B-C50C-407E-A947-70E740481C1C}">
-                          <a14:useLocalDpi xmlns:a14="http://schemas.microsoft.com/office/drawing/2010/main" val="0"/>
-                        </a:ext>
-                      </a:extLst>
-                    </a:blip>
-                    <a:srcRect/>
-                    <a:stretch>
-                      <a:fillRect/>
-                    </a:stretch>
-                  </pic:blipFill>
-                  <pic:spPr bwMode="auto">
-                    <a:xfrm>
-                      <a:off x="0" y="0"/>
-                      <a:ext cx="4697220" cy="2447775"/>
-                    </a:xfrm>
-                    <a:prstGeom prst="rect">
-                      <a:avLst/>
-                    </a:prstGeom>
-                    <a:noFill/>
-                    <a:ln>
-                      <a:noFill/>
-                    </a:ln>
-                  </pic:spPr>
-                </pic:pic>
-              </a:graphicData>
-            </a:graphic>
-          </wp:inline>
-        </w:drawing>
-      </w:r>
-      <w:r>
-        <w:rPr>
-          <w:noProof/>
-        </w:rPr>
-        <w:drawing>
-          <wp:inline distT="0" distB="0" distL="0" distR="0" wp14:anchorId="506ECF53" wp14:editId="24279F05">
-            <wp:extent cx="4559300" cy="2846502"/>
-            <wp:effectExtent l="0" t="0" r="0" b="0"/>
-            <wp:docPr id="605723203" name="Imagen 1" descr="Gráfico&#10;&#10;El contenido generado por IA puede ser incorrecto."/>
-            <wp:cNvGraphicFramePr>
-              <a:graphicFrameLocks xmlns:a="http://schemas.openxmlformats.org/drawingml/2006/main" noChangeAspect="1"/>
-            </wp:cNvGraphicFramePr>
-            <a:graphic xmlns:a="http://schemas.openxmlformats.org/drawingml/2006/main">
-              <a:graphicData uri="http://schemas.openxmlformats.org/drawingml/2006/picture">
-                <pic:pic xmlns:pic="http://schemas.openxmlformats.org/drawingml/2006/picture">
-                  <pic:nvPicPr>
-                    <pic:cNvPr id="605723203" name="Imagen 1" descr="Gráfico&#10;&#10;El contenido generado por IA puede ser incorrecto."/>
-                    <pic:cNvPicPr>
-                      <a:picLocks noChangeAspect="1" noChangeArrowheads="1"/>
-                    </pic:cNvPicPr>
-                  </pic:nvPicPr>
-                  <pic:blipFill>
-                    <a:blip r:embed="rId6">
-                      <a:extLst>
-                        <a:ext uri="{28A0092B-C50C-407E-A947-70E740481C1C}">
-                          <a14:useLocalDpi xmlns:a14="http://schemas.microsoft.com/office/drawing/2010/main" val="0"/>
-                        </a:ext>
-                      </a:extLst>
-                    </a:blip>
-                    <a:srcRect/>
-                    <a:stretch>
-                      <a:fillRect/>
-                    </a:stretch>
-                  </pic:blipFill>
-                  <pic:spPr bwMode="auto">
-                    <a:xfrm>
-                      <a:off x="0" y="0"/>
-                      <a:ext cx="4664064" cy="2911909"/>
-                    </a:xfrm>
-                    <a:prstGeom prst="rect">
-                      <a:avLst/>
-                    </a:prstGeom>
-                    <a:noFill/>
-                    <a:ln>
-                      <a:noFill/>
-                    </a:ln>
-                  </pic:spPr>
-                </pic:pic>
-              </a:graphicData>
-            </a:graphic>
-          </wp:inline>
-        </w:drawing>
-      </w:r>
     </w:p>
     <w:p>
       <w:pPr>
@@ -901,7 +663,6 @@
               <w:rPr>
                 <w:lang w:val="es-ES"/>
               </w:rPr>
-              <w:lastRenderedPageBreak/>
               <w:t xml:space="preserve">Grado de </w:t>
             </w:r>
             <w:proofErr w:type="spellStart"/>
@@ -1261,7 +1022,9 @@
       <w:r>
         <w:rPr>
           <w:noProof/>
-        </w:rPr>
+          <w:lang w:val="en-US"/>
+        </w:rPr>
+        <w:lastRenderedPageBreak/>
         <w:drawing>
           <wp:inline distT="0" distB="0" distL="0" distR="0" wp14:anchorId="0E64E22A" wp14:editId="207DC6CA">
             <wp:extent cx="6945011" cy="2828925"/>
@@ -1280,7 +1043,7 @@
                     </pic:cNvPicPr>
                   </pic:nvPicPr>
                   <pic:blipFill>
-                    <a:blip r:embed="rId7">
+                    <a:blip r:embed="rId5">
                       <a:extLst>
                         <a:ext uri="{28A0092B-C50C-407E-A947-70E740481C1C}">
                           <a14:useLocalDpi xmlns:a14="http://schemas.microsoft.com/office/drawing/2010/main" val="0"/>
@@ -1529,6 +1292,7 @@
       <w:r>
         <w:rPr>
           <w:noProof/>
+          <w:lang w:val="en-US"/>
         </w:rPr>
         <w:lastRenderedPageBreak/>
         <w:drawing>
@@ -1555,7 +1319,7 @@
                     <pic:cNvPicPr/>
                   </pic:nvPicPr>
                   <pic:blipFill>
-                    <a:blip r:embed="rId8" cstate="print">
+                    <a:blip r:embed="rId6" cstate="print">
                       <a:duotone>
                         <a:prstClr val="black"/>
                         <a:srgbClr val="D9C3A5">
@@ -1844,6 +1608,7 @@
       <w:r>
         <w:rPr>
           <w:noProof/>
+          <w:lang w:val="en-US"/>
         </w:rPr>
         <w:drawing>
           <wp:inline distT="0" distB="0" distL="0" distR="0" wp14:anchorId="0E8403AA" wp14:editId="515A6956">
@@ -1863,7 +1628,7 @@
                     </pic:cNvPicPr>
                   </pic:nvPicPr>
                   <pic:blipFill>
-                    <a:blip r:embed="rId9">
+                    <a:blip r:embed="rId7">
                       <a:extLst>
                         <a:ext uri="{28A0092B-C50C-407E-A947-70E740481C1C}">
                           <a14:useLocalDpi xmlns:a14="http://schemas.microsoft.com/office/drawing/2010/main" val="0"/>
@@ -1969,6 +1734,7 @@
       <w:r>
         <w:rPr>
           <w:noProof/>
+          <w:lang w:val="en-US"/>
         </w:rPr>
         <w:lastRenderedPageBreak/>
         <w:drawing>
@@ -1989,7 +1755,7 @@
                     </pic:cNvPicPr>
                   </pic:nvPicPr>
                   <pic:blipFill>
-                    <a:blip r:embed="rId10">
+                    <a:blip r:embed="rId8">
                       <a:extLst>
                         <a:ext uri="{28A0092B-C50C-407E-A947-70E740481C1C}">
                           <a14:useLocalDpi xmlns:a14="http://schemas.microsoft.com/office/drawing/2010/main" val="0"/>
@@ -2137,6 +1903,7 @@
       <w:r>
         <w:rPr>
           <w:noProof/>
+          <w:lang w:val="en-US"/>
         </w:rPr>
         <w:drawing>
           <wp:inline distT="0" distB="0" distL="0" distR="0" wp14:anchorId="0726A4A6" wp14:editId="015637D6">
@@ -2156,7 +1923,7 @@
                     </pic:cNvPicPr>
                   </pic:nvPicPr>
                   <pic:blipFill>
-                    <a:blip r:embed="rId11">
+                    <a:blip r:embed="rId9">
                       <a:extLst>
                         <a:ext uri="{28A0092B-C50C-407E-A947-70E740481C1C}">
                           <a14:useLocalDpi xmlns:a14="http://schemas.microsoft.com/office/drawing/2010/main" val="0"/>
@@ -2242,7 +2009,12 @@
         <w:t>Análisis en performance:</w:t>
       </w:r>
       <w:r>
-        <w:t xml:space="preserve"> se puede observar un salto en performance donde se redujo el porcentaje en el umbral de densidad, lo cual permitió captar 5 semillas candidatas, si bien no genero mas sintéticos, se redistribuyeron mejor la generación de sintéticos permitiendo generar esa mejora marginal en el rendimiento del clasificador. </w:t>
+        <w:t xml:space="preserve"> se puede observar un salto en performance donde se redujo el porcentaje en el umbral de densidad, lo cual permitió captar 5 semillas candidatas, si bien no genero mas sintéticos, se redistribuyeron mejor la generación de sintéticos permitiendo generar esa mejora marg</w:t>
+      </w:r>
+      <w:bookmarkStart w:id="0" w:name="_GoBack"/>
+      <w:bookmarkEnd w:id="0"/>
+      <w:r>
+        <w:t xml:space="preserve">inal en el rendimiento del clasificador. </w:t>
       </w:r>
     </w:p>
     <w:p>
@@ -2273,6 +2045,7 @@
       <w:r>
         <w:rPr>
           <w:noProof/>
+          <w:lang w:val="en-US"/>
         </w:rPr>
         <w:drawing>
           <wp:inline distT="0" distB="0" distL="0" distR="0" wp14:anchorId="4386EE95" wp14:editId="1A5F4DAD">
@@ -2292,7 +2065,7 @@
                     </pic:cNvPicPr>
                   </pic:nvPicPr>
                   <pic:blipFill>
-                    <a:blip r:embed="rId12">
+                    <a:blip r:embed="rId10">
                       <a:extLst>
                         <a:ext uri="{28A0092B-C50C-407E-A947-70E740481C1C}">
                           <a14:useLocalDpi xmlns:a14="http://schemas.microsoft.com/office/drawing/2010/main" val="0"/>
@@ -2478,6 +2251,7 @@
       <w:r>
         <w:rPr>
           <w:noProof/>
+          <w:lang w:val="en-US"/>
         </w:rPr>
         <w:drawing>
           <wp:inline distT="0" distB="0" distL="0" distR="0" wp14:anchorId="436AF295" wp14:editId="767A2648">
@@ -2497,7 +2271,7 @@
                     </pic:cNvPicPr>
                   </pic:nvPicPr>
                   <pic:blipFill>
-                    <a:blip r:embed="rId13">
+                    <a:blip r:embed="rId11">
                       <a:extLst>
                         <a:ext uri="{28A0092B-C50C-407E-A947-70E740481C1C}">
                           <a14:useLocalDpi xmlns:a14="http://schemas.microsoft.com/office/drawing/2010/main" val="0"/>
@@ -2666,6 +2440,7 @@
       <w:r>
         <w:rPr>
           <w:noProof/>
+          <w:lang w:val="en-US"/>
         </w:rPr>
         <w:drawing>
           <wp:inline distT="0" distB="0" distL="0" distR="0" wp14:anchorId="21B43002" wp14:editId="5CCA7DC2">
@@ -2685,7 +2460,7 @@
                     </pic:cNvPicPr>
                   </pic:nvPicPr>
                   <pic:blipFill>
-                    <a:blip r:embed="rId14">
+                    <a:blip r:embed="rId12">
                       <a:extLst>
                         <a:ext uri="{28A0092B-C50C-407E-A947-70E740481C1C}">
                           <a14:useLocalDpi xmlns:a14="http://schemas.microsoft.com/office/drawing/2010/main" val="0"/>
@@ -2728,7 +2503,7 @@
 </file>
 
 <file path=word/numbering.xml><?xml version="1.0" encoding="utf-8"?>
-<w:numbering xmlns:wpc="http://schemas.microsoft.com/office/word/2010/wordprocessingCanvas" xmlns:cx="http://schemas.microsoft.com/office/drawing/2014/chartex" xmlns:cx1="http://schemas.microsoft.com/office/drawing/2015/9/8/chartex" xmlns:cx2="http://schemas.microsoft.com/office/drawing/2015/10/21/chartex" xmlns:cx3="http://schemas.microsoft.com/office/drawing/2016/5/9/chartex" xmlns:cx4="http://schemas.microsoft.com/office/drawing/2016/5/10/chartex" xmlns:cx5="http://schemas.microsoft.com/office/drawing/2016/5/11/chartex" xmlns:cx6="http://schemas.microsoft.com/office/drawing/2016/5/12/chartex" xmlns:cx7="http://schemas.microsoft.com/office/drawing/2016/5/13/chartex" xmlns:cx8="http://schemas.microsoft.com/office/drawing/2016/5/14/chartex" xmlns:mc="http://schemas.openxmlformats.org/markup-compatibility/2006" xmlns:aink="http://schemas.microsoft.com/office/drawing/2016/ink" xmlns:am3d="http://schemas.microsoft.com/office/drawing/2017/model3d" xmlns:o="urn:schemas-microsoft-com:office:office" xmlns:oel="http://schemas.microsoft.com/office/2019/extlst" xmlns:r="http://schemas.openxmlformats.org/officeDocument/2006/relationships" xmlns:m="http://schemas.openxmlformats.org/officeDocument/2006/math" xmlns:v="urn:schemas-microsoft-com:vml" xmlns:wp14="http://schemas.microsoft.com/office/word/2010/wordprocessingDrawing" xmlns:wp="http://schemas.openxmlformats.org/drawingml/2006/wordprocessingDrawing" xmlns:w10="urn:schemas-microsoft-com:office:word" xmlns:w="http://schemas.openxmlformats.org/wordprocessingml/2006/main" xmlns:w14="http://schemas.microsoft.com/office/word/2010/wordml" xmlns:w15="http://schemas.microsoft.com/office/word/2012/wordml" xmlns:w16cex="http://schemas.microsoft.com/office/word/2018/wordml/cex" xmlns:w16cid="http://schemas.microsoft.com/office/word/2016/wordml/cid" xmlns:w16="http://schemas.microsoft.com/office/word/2018/wordml" xmlns:w16du="http://schemas.microsoft.com/office/word/2023/wordml/word16du" xmlns:w16sdtdh="http://schemas.microsoft.com/office/word/2020/wordml/sdtdatahash" xmlns:w16sdtfl="http://schemas.microsoft.com/office/word/2024/wordml/sdtformatlock" xmlns:w16se="http://schemas.microsoft.com/office/word/2015/wordml/symex" xmlns:wpg="http://schemas.microsoft.com/office/word/2010/wordprocessingGroup" xmlns:wpi="http://schemas.microsoft.com/office/word/2010/wordprocessingInk" xmlns:wne="http://schemas.microsoft.com/office/word/2006/wordml" xmlns:wps="http://schemas.microsoft.com/office/word/2010/wordprocessingShape" mc:Ignorable="w14 w15 w16se w16cid w16 w16cex w16sdtdh w16sdtfl w16du wp14">
+<w:numbering xmlns:wpc="http://schemas.microsoft.com/office/word/2010/wordprocessingCanvas" xmlns:cx="http://schemas.microsoft.com/office/drawing/2014/chartex" xmlns:mc="http://schemas.openxmlformats.org/markup-compatibility/2006" xmlns:o="urn:schemas-microsoft-com:office:office" xmlns:r="http://schemas.openxmlformats.org/officeDocument/2006/relationships" xmlns:m="http://schemas.openxmlformats.org/officeDocument/2006/math" xmlns:v="urn:schemas-microsoft-com:vml" xmlns:wp14="http://schemas.microsoft.com/office/word/2010/wordprocessingDrawing" xmlns:wp="http://schemas.openxmlformats.org/drawingml/2006/wordprocessingDrawing" xmlns:w10="urn:schemas-microsoft-com:office:word" xmlns:w="http://schemas.openxmlformats.org/wordprocessingml/2006/main" xmlns:w14="http://schemas.microsoft.com/office/word/2010/wordml" xmlns:w15="http://schemas.microsoft.com/office/word/2012/wordml" xmlns:w16se="http://schemas.microsoft.com/office/word/2015/wordml/symex" xmlns:wpg="http://schemas.microsoft.com/office/word/2010/wordprocessingGroup" xmlns:wpi="http://schemas.microsoft.com/office/word/2010/wordprocessingInk" xmlns:wne="http://schemas.microsoft.com/office/word/2006/wordml" xmlns:wps="http://schemas.microsoft.com/office/word/2010/wordprocessingShape" mc:Ignorable="w14 w15 w16se wp14">
   <w:abstractNum w:abstractNumId="0" w15:restartNumberingAfterBreak="0">
     <w:nsid w:val="5F102902"/>
     <w:multiLevelType w:val="hybridMultilevel"/>
@@ -2842,14 +2617,14 @@
       </w:rPr>
     </w:lvl>
   </w:abstractNum>
-  <w:num w:numId="1" w16cid:durableId="1032654623">
+  <w:num w:numId="1">
     <w:abstractNumId w:val="0"/>
   </w:num>
 </w:numbering>
 </file>
 
 <file path=word/styles.xml><?xml version="1.0" encoding="utf-8"?>
-<w:styles xmlns:mc="http://schemas.openxmlformats.org/markup-compatibility/2006" xmlns:r="http://schemas.openxmlformats.org/officeDocument/2006/relationships" xmlns:w="http://schemas.openxmlformats.org/wordprocessingml/2006/main" xmlns:w14="http://schemas.microsoft.com/office/word/2010/wordml" xmlns:w15="http://schemas.microsoft.com/office/word/2012/wordml" xmlns:w16cex="http://schemas.microsoft.com/office/word/2018/wordml/cex" xmlns:w16cid="http://schemas.microsoft.com/office/word/2016/wordml/cid" xmlns:w16="http://schemas.microsoft.com/office/word/2018/wordml" xmlns:w16du="http://schemas.microsoft.com/office/word/2023/wordml/word16du" xmlns:w16sdtdh="http://schemas.microsoft.com/office/word/2020/wordml/sdtdatahash" xmlns:w16sdtfl="http://schemas.microsoft.com/office/word/2024/wordml/sdtformatlock" xmlns:w16se="http://schemas.microsoft.com/office/word/2015/wordml/symex" mc:Ignorable="w14 w15 w16se w16cid w16 w16cex w16sdtdh w16sdtfl w16du">
+<w:styles xmlns:mc="http://schemas.openxmlformats.org/markup-compatibility/2006" xmlns:r="http://schemas.openxmlformats.org/officeDocument/2006/relationships" xmlns:w="http://schemas.openxmlformats.org/wordprocessingml/2006/main" xmlns:w14="http://schemas.microsoft.com/office/word/2010/wordml" xmlns:w15="http://schemas.microsoft.com/office/word/2012/wordml" xmlns:w16se="http://schemas.microsoft.com/office/word/2015/wordml/symex" mc:Ignorable="w14 w15 w16se">
   <w:docDefaults>
     <w:rPrDefault>
       <w:rPr>
@@ -2865,7 +2640,7 @@
       </w:pPr>
     </w:pPrDefault>
   </w:docDefaults>
-  <w:latentStyles w:defLockedState="0" w:defUIPriority="99" w:defSemiHidden="0" w:defUnhideWhenUsed="0" w:defQFormat="0" w:count="376">
+  <w:latentStyles w:defLockedState="0" w:defUIPriority="99" w:defSemiHidden="0" w:defUnhideWhenUsed="0" w:defQFormat="0" w:count="371">
     <w:lsdException w:name="Normal" w:uiPriority="0" w:qFormat="1"/>
     <w:lsdException w:name="heading 1" w:uiPriority="9" w:qFormat="1"/>
     <w:lsdException w:name="heading 2" w:semiHidden="1" w:uiPriority="9" w:unhideWhenUsed="1" w:qFormat="1"/>
@@ -3237,11 +3012,6 @@
     <w:lsdException w:name="List Table 5 Dark Accent 6" w:uiPriority="50"/>
     <w:lsdException w:name="List Table 6 Colorful Accent 6" w:uiPriority="51"/>
     <w:lsdException w:name="List Table 7 Colorful Accent 6" w:uiPriority="52"/>
-    <w:lsdException w:name="Mention" w:semiHidden="1" w:unhideWhenUsed="1"/>
-    <w:lsdException w:name="Smart Hyperlink" w:semiHidden="1" w:unhideWhenUsed="1"/>
-    <w:lsdException w:name="Hashtag" w:semiHidden="1" w:unhideWhenUsed="1"/>
-    <w:lsdException w:name="Unresolved Mention" w:semiHidden="1" w:unhideWhenUsed="1"/>
-    <w:lsdException w:name="Smart Link" w:semiHidden="1" w:unhideWhenUsed="1"/>
   </w:latentStyles>
   <w:style w:type="paragraph" w:default="1" w:styleId="Normal">
     <w:name w:val="Normal"/>

</xml_diff>

<commit_message>
trabajando sobre grafico radar
aumentando nivel de interpretacion de la grafica
</commit_message>
<xml_diff>
--- a/resultados/analisis_datasets.docx
+++ b/resultados/analisis_datasets.docx
@@ -481,15 +481,7 @@
         <w:rPr>
           <w:lang w:val="es-ES"/>
         </w:rPr>
-        <w:t xml:space="preserve">, la relación entre la cantidad de semillas válidas (SV) y la cantidad total de muestras sintéticas generadas (SG), utilizando el tamaño de la burbuja </w:t>
-      </w:r>
-      <w:bookmarkStart w:id="0" w:name="_GoBack"/>
-      <w:bookmarkEnd w:id="0"/>
-      <w:r>
-        <w:rPr>
-          <w:lang w:val="es-ES"/>
-        </w:rPr>
-        <w:t xml:space="preserve">para codificar el cociente SG/SV. Este diseño permite evaluar simultáneamente la </w:t>
+        <w:t xml:space="preserve">, la relación entre la cantidad de semillas válidas (SV) y la cantidad total de muestras sintéticas generadas (SG), utilizando el tamaño de la burbuja para codificar el cociente SG/SV. Este diseño permite evaluar simultáneamente la </w:t>
       </w:r>
       <w:r>
         <w:rPr>
@@ -832,8 +824,11 @@
         <w:rPr>
           <w:lang w:val="es-ES"/>
         </w:rPr>
+        <w:lastRenderedPageBreak/>
         <w:br w:type="textWrapping" w:clear="all"/>
       </w:r>
+      <w:bookmarkStart w:id="0" w:name="_GoBack"/>
+      <w:bookmarkEnd w:id="0"/>
     </w:p>
     <w:p>
       <w:pPr>
@@ -948,7 +943,6 @@
           <w:bCs/>
           <w:lang w:val="es-ES"/>
         </w:rPr>
-        <w:lastRenderedPageBreak/>
         <w:t xml:space="preserve">ANALISIS DE PERFORMANCE sobre </w:t>
       </w:r>
       <w:proofErr w:type="spellStart"/>
@@ -1516,6 +1510,7 @@
           <w:noProof/>
           <w:lang w:val="en-US"/>
         </w:rPr>
+        <w:lastRenderedPageBreak/>
         <w:drawing>
           <wp:inline distT="0" distB="0" distL="0" distR="0" wp14:anchorId="0E64E22A" wp14:editId="207DC6CA">
             <wp:extent cx="6945011" cy="2828925"/>
@@ -2193,36 +2188,101 @@
     <w:p>
       <w:pPr>
         <w:rPr>
-          <w:lang w:val="es-ES"/>
-        </w:rPr>
-      </w:pPr>
-      <w:r>
-        <w:rPr>
           <w:b/>
           <w:bCs/>
           <w:lang w:val="es-ES"/>
         </w:rPr>
-        <w:t>Análisis en performance</w:t>
-      </w:r>
-      <w:r>
-        <w:rPr>
-          <w:lang w:val="es-ES"/>
-        </w:rPr>
-        <w:t>: se puede observar que aumentando el percentil radio distancia permitió pasar mas semillas validas haciendo una diferencia en el f1_macro</w:t>
-      </w:r>
-    </w:p>
-    <w:p>
-      <w:pPr>
-        <w:rPr>
-          <w:lang w:val="es-ES"/>
-        </w:rPr>
-      </w:pPr>
-      <w:r>
-        <w:rPr>
+      </w:pPr>
+      <w:r>
+        <w:rPr>
+          <w:b/>
+          <w:bCs/>
           <w:noProof/>
           <w:lang w:val="en-US"/>
         </w:rPr>
         <w:lastRenderedPageBreak/>
+        <w:drawing>
+          <wp:inline distT="0" distB="0" distL="0" distR="0" wp14:anchorId="6F732FF6" wp14:editId="3F8BC21F">
+            <wp:extent cx="3784949" cy="2157984"/>
+            <wp:effectExtent l="0" t="0" r="6350" b="0"/>
+            <wp:docPr id="4" name="Imagen 4" descr="C:\Users\FamiliaNatelloMedina\Desktop\codigo\datasets\datasets_aumentados\logs\pcsmote\por_muestras\graficos\telco_churn__radar_configs.png"/>
+            <wp:cNvGraphicFramePr>
+              <a:graphicFrameLocks xmlns:a="http://schemas.openxmlformats.org/drawingml/2006/main" noChangeAspect="1"/>
+            </wp:cNvGraphicFramePr>
+            <a:graphic xmlns:a="http://schemas.openxmlformats.org/drawingml/2006/main">
+              <a:graphicData uri="http://schemas.openxmlformats.org/drawingml/2006/picture">
+                <pic:pic xmlns:pic="http://schemas.openxmlformats.org/drawingml/2006/picture">
+                  <pic:nvPicPr>
+                    <pic:cNvPr id="0" name="Picture 1" descr="C:\Users\FamiliaNatelloMedina\Desktop\codigo\datasets\datasets_aumentados\logs\pcsmote\por_muestras\graficos\telco_churn__radar_configs.png"/>
+                    <pic:cNvPicPr>
+                      <a:picLocks noChangeAspect="1" noChangeArrowheads="1"/>
+                    </pic:cNvPicPr>
+                  </pic:nvPicPr>
+                  <pic:blipFill>
+                    <a:blip r:embed="rId10" cstate="print">
+                      <a:extLst>
+                        <a:ext uri="{28A0092B-C50C-407E-A947-70E740481C1C}">
+                          <a14:useLocalDpi xmlns:a14="http://schemas.microsoft.com/office/drawing/2010/main" val="0"/>
+                        </a:ext>
+                      </a:extLst>
+                    </a:blip>
+                    <a:srcRect/>
+                    <a:stretch>
+                      <a:fillRect/>
+                    </a:stretch>
+                  </pic:blipFill>
+                  <pic:spPr bwMode="auto">
+                    <a:xfrm>
+                      <a:off x="0" y="0"/>
+                      <a:ext cx="3792120" cy="2162072"/>
+                    </a:xfrm>
+                    <a:prstGeom prst="rect">
+                      <a:avLst/>
+                    </a:prstGeom>
+                    <a:noFill/>
+                    <a:ln>
+                      <a:noFill/>
+                    </a:ln>
+                  </pic:spPr>
+                </pic:pic>
+              </a:graphicData>
+            </a:graphic>
+          </wp:inline>
+        </w:drawing>
+      </w:r>
+    </w:p>
+    <w:p>
+      <w:pPr>
+        <w:rPr>
+          <w:lang w:val="es-ES"/>
+        </w:rPr>
+      </w:pPr>
+      <w:r>
+        <w:rPr>
+          <w:b/>
+          <w:bCs/>
+          <w:lang w:val="es-ES"/>
+        </w:rPr>
+        <w:t>Análisis en performance</w:t>
+      </w:r>
+      <w:r>
+        <w:rPr>
+          <w:lang w:val="es-ES"/>
+        </w:rPr>
+        <w:t>: se puede observar que aumentando el percentil radio distancia permitió pasar mas semillas validas haciendo una diferencia en el f1_macro</w:t>
+      </w:r>
+    </w:p>
+    <w:p>
+      <w:pPr>
+        <w:rPr>
+          <w:lang w:val="es-ES"/>
+        </w:rPr>
+      </w:pPr>
+      <w:r>
+        <w:rPr>
+          <w:noProof/>
+          <w:lang w:val="en-US"/>
+        </w:rPr>
         <w:drawing>
           <wp:inline distT="0" distB="0" distL="0" distR="0" wp14:anchorId="6B5E3BCC" wp14:editId="2F329279">
             <wp:extent cx="6759569" cy="2162175"/>
@@ -2241,7 +2301,7 @@
                     </pic:cNvPicPr>
                   </pic:nvPicPr>
                   <pic:blipFill>
-                    <a:blip r:embed="rId10">
+                    <a:blip r:embed="rId11">
                       <a:extLst>
                         <a:ext uri="{28A0092B-C50C-407E-A947-70E740481C1C}">
                           <a14:useLocalDpi xmlns:a14="http://schemas.microsoft.com/office/drawing/2010/main" val="0"/>
@@ -2409,7 +2469,7 @@
                     </pic:cNvPicPr>
                   </pic:nvPicPr>
                   <pic:blipFill>
-                    <a:blip r:embed="rId11">
+                    <a:blip r:embed="rId12">
                       <a:extLst>
                         <a:ext uri="{28A0092B-C50C-407E-A947-70E740481C1C}">
                           <a14:useLocalDpi xmlns:a14="http://schemas.microsoft.com/office/drawing/2010/main" val="0"/>
@@ -2492,6 +2552,7 @@
           <w:bCs/>
           <w:lang w:val="es-ES"/>
         </w:rPr>
+        <w:lastRenderedPageBreak/>
         <w:t>Análisis en performance:</w:t>
       </w:r>
       <w:r>
@@ -2546,7 +2607,7 @@
                     </pic:cNvPicPr>
                   </pic:nvPicPr>
                   <pic:blipFill>
-                    <a:blip r:embed="rId12">
+                    <a:blip r:embed="rId13">
                       <a:extLst>
                         <a:ext uri="{28A0092B-C50C-407E-A947-70E740481C1C}">
                           <a14:useLocalDpi xmlns:a14="http://schemas.microsoft.com/office/drawing/2010/main" val="0"/>
@@ -2752,7 +2813,7 @@
                     </pic:cNvPicPr>
                   </pic:nvPicPr>
                   <pic:blipFill>
-                    <a:blip r:embed="rId13">
+                    <a:blip r:embed="rId14">
                       <a:extLst>
                         <a:ext uri="{28A0092B-C50C-407E-A947-70E740481C1C}">
                           <a14:useLocalDpi xmlns:a14="http://schemas.microsoft.com/office/drawing/2010/main" val="0"/>
@@ -2941,7 +3002,7 @@
                     </pic:cNvPicPr>
                   </pic:nvPicPr>
                   <pic:blipFill>
-                    <a:blip r:embed="rId14">
+                    <a:blip r:embed="rId15">
                       <a:extLst>
                         <a:ext uri="{28A0092B-C50C-407E-A947-70E740481C1C}">
                           <a14:useLocalDpi xmlns:a14="http://schemas.microsoft.com/office/drawing/2010/main" val="0"/>

</xml_diff>

<commit_message>
avance sobre analisis de pcsmote
</commit_message>
<xml_diff>
--- a/resultados/analisis_datasets.docx
+++ b/resultados/analisis_datasets.docx
@@ -1,6 +1,6 @@
 
 <file path=word/document.xml><?xml version="1.0" encoding="utf-8"?>
-<w:document xmlns:wpc="http://schemas.microsoft.com/office/word/2010/wordprocessingCanvas" xmlns:cx="http://schemas.microsoft.com/office/drawing/2014/chartex" xmlns:cx1="http://schemas.microsoft.com/office/drawing/2015/9/8/chartex" xmlns:cx2="http://schemas.microsoft.com/office/drawing/2015/10/21/chartex" xmlns:cx3="http://schemas.microsoft.com/office/drawing/2016/5/9/chartex" xmlns:cx4="http://schemas.microsoft.com/office/drawing/2016/5/10/chartex" xmlns:cx5="http://schemas.microsoft.com/office/drawing/2016/5/11/chartex" xmlns:cx6="http://schemas.microsoft.com/office/drawing/2016/5/12/chartex" xmlns:cx7="http://schemas.microsoft.com/office/drawing/2016/5/13/chartex" xmlns:cx8="http://schemas.microsoft.com/office/drawing/2016/5/14/chartex" xmlns:mc="http://schemas.openxmlformats.org/markup-compatibility/2006" xmlns:aink="http://schemas.microsoft.com/office/drawing/2016/ink" xmlns:am3d="http://schemas.microsoft.com/office/drawing/2017/model3d" xmlns:o="urn:schemas-microsoft-com:office:office" xmlns:r="http://schemas.openxmlformats.org/officeDocument/2006/relationships" xmlns:m="http://schemas.openxmlformats.org/officeDocument/2006/math" xmlns:v="urn:schemas-microsoft-com:vml" xmlns:wp14="http://schemas.microsoft.com/office/word/2010/wordprocessingDrawing" xmlns:wp="http://schemas.openxmlformats.org/drawingml/2006/wordprocessingDrawing" xmlns:w10="urn:schemas-microsoft-com:office:word" xmlns:w="http://schemas.openxmlformats.org/wordprocessingml/2006/main" xmlns:w14="http://schemas.microsoft.com/office/word/2010/wordml" xmlns:w15="http://schemas.microsoft.com/office/word/2012/wordml" xmlns:w16cex="http://schemas.microsoft.com/office/word/2018/wordml/cex" xmlns:w16cid="http://schemas.microsoft.com/office/word/2016/wordml/cid" xmlns:w16="http://schemas.microsoft.com/office/word/2018/wordml" xmlns:w16sdtdh="http://schemas.microsoft.com/office/word/2020/wordml/sdtdatahash" xmlns:w16se="http://schemas.microsoft.com/office/word/2015/wordml/symex" xmlns:wpg="http://schemas.microsoft.com/office/word/2010/wordprocessingGroup" xmlns:wpi="http://schemas.microsoft.com/office/word/2010/wordprocessingInk" xmlns:wne="http://schemas.microsoft.com/office/word/2006/wordml" xmlns:wps="http://schemas.microsoft.com/office/word/2010/wordprocessingShape" mc:Ignorable="w14 w15 w16se w16cid w16 w16cex w16sdtdh wp14">
+<w:document xmlns:wpc="http://schemas.microsoft.com/office/word/2010/wordprocessingCanvas" xmlns:cx="http://schemas.microsoft.com/office/drawing/2014/chartex" xmlns:cx1="http://schemas.microsoft.com/office/drawing/2015/9/8/chartex" xmlns:cx2="http://schemas.microsoft.com/office/drawing/2015/10/21/chartex" xmlns:cx3="http://schemas.microsoft.com/office/drawing/2016/5/9/chartex" xmlns:cx4="http://schemas.microsoft.com/office/drawing/2016/5/10/chartex" xmlns:cx5="http://schemas.microsoft.com/office/drawing/2016/5/11/chartex" xmlns:cx6="http://schemas.microsoft.com/office/drawing/2016/5/12/chartex" xmlns:cx7="http://schemas.microsoft.com/office/drawing/2016/5/13/chartex" xmlns:cx8="http://schemas.microsoft.com/office/drawing/2016/5/14/chartex" xmlns:mc="http://schemas.openxmlformats.org/markup-compatibility/2006" xmlns:aink="http://schemas.microsoft.com/office/drawing/2016/ink" xmlns:am3d="http://schemas.microsoft.com/office/drawing/2017/model3d" xmlns:o="urn:schemas-microsoft-com:office:office" xmlns:oel="http://schemas.microsoft.com/office/2019/extlst" xmlns:r="http://schemas.openxmlformats.org/officeDocument/2006/relationships" xmlns:m="http://schemas.openxmlformats.org/officeDocument/2006/math" xmlns:v="urn:schemas-microsoft-com:vml" xmlns:wp14="http://schemas.microsoft.com/office/word/2010/wordprocessingDrawing" xmlns:wp="http://schemas.openxmlformats.org/drawingml/2006/wordprocessingDrawing" xmlns:w10="urn:schemas-microsoft-com:office:word" xmlns:w="http://schemas.openxmlformats.org/wordprocessingml/2006/main" xmlns:w14="http://schemas.microsoft.com/office/word/2010/wordml" xmlns:w15="http://schemas.microsoft.com/office/word/2012/wordml" xmlns:w16cex="http://schemas.microsoft.com/office/word/2018/wordml/cex" xmlns:w16cid="http://schemas.microsoft.com/office/word/2016/wordml/cid" xmlns:w16="http://schemas.microsoft.com/office/word/2018/wordml" xmlns:w16du="http://schemas.microsoft.com/office/word/2023/wordml/word16du" xmlns:w16sdtdh="http://schemas.microsoft.com/office/word/2020/wordml/sdtdatahash" xmlns:w16sdtfl="http://schemas.microsoft.com/office/word/2024/wordml/sdtformatlock" xmlns:w16se="http://schemas.microsoft.com/office/word/2015/wordml/symex" xmlns:wpg="http://schemas.microsoft.com/office/word/2010/wordprocessingGroup" xmlns:wpi="http://schemas.microsoft.com/office/word/2010/wordprocessingInk" xmlns:wne="http://schemas.microsoft.com/office/word/2006/wordml" xmlns:wps="http://schemas.microsoft.com/office/word/2010/wordprocessingShape" mc:Ignorable="w14 w15 w16se w16cid w16 w16cex w16sdtdh w16sdtfl w16du wp14">
   <w:body>
     <w:p>
       <w:pPr>
@@ -16,7 +16,7 @@
         <w:tblLook w:val="04A0" w:firstRow="1" w:lastRow="0" w:firstColumn="1" w:lastColumn="0" w:noHBand="0" w:noVBand="1"/>
       </w:tblPr>
       <w:tblGrid>
-        <w:gridCol w:w="10790"/>
+        <w:gridCol w:w="10456"/>
       </w:tblGrid>
       <w:tr>
         <w:tc>
@@ -29,11 +29,19 @@
                 <w:lang w:val="es-ES"/>
               </w:rPr>
             </w:pPr>
+            <w:proofErr w:type="spellStart"/>
             <w:r>
               <w:rPr>
                 <w:lang w:val="es-ES"/>
               </w:rPr>
-              <w:t xml:space="preserve">Dataset: </w:t>
+              <w:t>Dataset</w:t>
+            </w:r>
+            <w:proofErr w:type="spellEnd"/>
+            <w:r>
+              <w:rPr>
+                <w:lang w:val="es-ES"/>
+              </w:rPr>
+              <w:t xml:space="preserve">: </w:t>
             </w:r>
             <w:r>
               <w:rPr>
@@ -72,7 +80,21 @@
               <w:rPr>
                 <w:lang w:val="en-US"/>
               </w:rPr>
-              <w:t>Valores únicos del target: ['No Failure', 'Heat Dissipation Failure', 'Power Failure', 'Overstrain Failure', 'Tool Wear Failure', 'Random Failures']</w:t>
+              <w:t xml:space="preserve">Valores </w:t>
+            </w:r>
+            <w:proofErr w:type="spellStart"/>
+            <w:r>
+              <w:rPr>
+                <w:lang w:val="en-US"/>
+              </w:rPr>
+              <w:t>únicos</w:t>
+            </w:r>
+            <w:proofErr w:type="spellEnd"/>
+            <w:r>
+              <w:rPr>
+                <w:lang w:val="en-US"/>
+              </w:rPr>
+              <w:t xml:space="preserve"> del target: ['No Failure', 'Heat Dissipation Failure', 'Power Failure', 'Overstrain Failure', 'Tool Wear Failure', 'Random Failures']</w:t>
             </w:r>
           </w:p>
           <w:p>
@@ -108,7 +130,21 @@
               <w:rPr>
                 <w:lang w:val="es-ES"/>
               </w:rPr>
-              <w:t>No Failure: 9652 (96.52%)</w:t>
+              <w:t xml:space="preserve">No </w:t>
+            </w:r>
+            <w:proofErr w:type="spellStart"/>
+            <w:r>
+              <w:rPr>
+                <w:lang w:val="es-ES"/>
+              </w:rPr>
+              <w:t>Failure</w:t>
+            </w:r>
+            <w:proofErr w:type="spellEnd"/>
+            <w:r>
+              <w:rPr>
+                <w:lang w:val="es-ES"/>
+              </w:rPr>
+              <w:t>: 9652 (96.52%)</w:t>
             </w:r>
           </w:p>
           <w:p>
@@ -122,11 +158,47 @@
                 <w:lang w:val="es-ES"/>
               </w:rPr>
             </w:pPr>
+            <w:proofErr w:type="spellStart"/>
             <w:r>
               <w:rPr>
                 <w:lang w:val="es-ES"/>
               </w:rPr>
-              <w:t>Heat Dissipation Failure: 112 (1.12%)</w:t>
+              <w:t>Heat</w:t>
+            </w:r>
+            <w:proofErr w:type="spellEnd"/>
+            <w:r>
+              <w:rPr>
+                <w:lang w:val="es-ES"/>
+              </w:rPr>
+              <w:t xml:space="preserve"> </w:t>
+            </w:r>
+            <w:proofErr w:type="spellStart"/>
+            <w:r>
+              <w:rPr>
+                <w:lang w:val="es-ES"/>
+              </w:rPr>
+              <w:t>Dissipation</w:t>
+            </w:r>
+            <w:proofErr w:type="spellEnd"/>
+            <w:r>
+              <w:rPr>
+                <w:lang w:val="es-ES"/>
+              </w:rPr>
+              <w:t xml:space="preserve"> </w:t>
+            </w:r>
+            <w:proofErr w:type="spellStart"/>
+            <w:r>
+              <w:rPr>
+                <w:lang w:val="es-ES"/>
+              </w:rPr>
+              <w:t>Failure</w:t>
+            </w:r>
+            <w:proofErr w:type="spellEnd"/>
+            <w:r>
+              <w:rPr>
+                <w:lang w:val="es-ES"/>
+              </w:rPr>
+              <w:t>: 112 (1.12%)</w:t>
             </w:r>
           </w:p>
           <w:p>
@@ -144,7 +216,21 @@
               <w:rPr>
                 <w:lang w:val="es-ES"/>
               </w:rPr>
-              <w:t>Power Failure: 95 (0.95%)</w:t>
+              <w:t xml:space="preserve">Power </w:t>
+            </w:r>
+            <w:proofErr w:type="spellStart"/>
+            <w:r>
+              <w:rPr>
+                <w:lang w:val="es-ES"/>
+              </w:rPr>
+              <w:t>Failure</w:t>
+            </w:r>
+            <w:proofErr w:type="spellEnd"/>
+            <w:r>
+              <w:rPr>
+                <w:lang w:val="es-ES"/>
+              </w:rPr>
+              <w:t>: 95 (0.95%)</w:t>
             </w:r>
           </w:p>
           <w:p>
@@ -158,11 +244,33 @@
                 <w:lang w:val="es-ES"/>
               </w:rPr>
             </w:pPr>
+            <w:proofErr w:type="spellStart"/>
             <w:r>
               <w:rPr>
                 <w:lang w:val="es-ES"/>
               </w:rPr>
-              <w:t>Overstrain Failure: 78 (0.78%)</w:t>
+              <w:t>Overstrain</w:t>
+            </w:r>
+            <w:proofErr w:type="spellEnd"/>
+            <w:r>
+              <w:rPr>
+                <w:lang w:val="es-ES"/>
+              </w:rPr>
+              <w:t xml:space="preserve"> </w:t>
+            </w:r>
+            <w:proofErr w:type="spellStart"/>
+            <w:r>
+              <w:rPr>
+                <w:lang w:val="es-ES"/>
+              </w:rPr>
+              <w:t>Failure</w:t>
+            </w:r>
+            <w:proofErr w:type="spellEnd"/>
+            <w:r>
+              <w:rPr>
+                <w:lang w:val="es-ES"/>
+              </w:rPr>
+              <w:t>: 78 (0.78%)</w:t>
             </w:r>
           </w:p>
           <w:p>
@@ -180,7 +288,21 @@
               <w:rPr>
                 <w:lang w:val="es-ES"/>
               </w:rPr>
-              <w:t>Tool Wear Failure: 45 (0.45%)</w:t>
+              <w:t xml:space="preserve">Tool Wear </w:t>
+            </w:r>
+            <w:proofErr w:type="spellStart"/>
+            <w:r>
+              <w:rPr>
+                <w:lang w:val="es-ES"/>
+              </w:rPr>
+              <w:t>Failure</w:t>
+            </w:r>
+            <w:proofErr w:type="spellEnd"/>
+            <w:r>
+              <w:rPr>
+                <w:lang w:val="es-ES"/>
+              </w:rPr>
+              <w:t>: 45 (0.45%)</w:t>
             </w:r>
           </w:p>
           <w:p>
@@ -198,7 +320,21 @@
               <w:rPr>
                 <w:lang w:val="es-ES"/>
               </w:rPr>
-              <w:t>Random Failures: 18 (0.18%)</w:t>
+              <w:t xml:space="preserve">Random </w:t>
+            </w:r>
+            <w:proofErr w:type="spellStart"/>
+            <w:r>
+              <w:rPr>
+                <w:lang w:val="es-ES"/>
+              </w:rPr>
+              <w:t>Failures</w:t>
+            </w:r>
+            <w:proofErr w:type="spellEnd"/>
+            <w:r>
+              <w:rPr>
+                <w:lang w:val="es-ES"/>
+              </w:rPr>
+              <w:t>: 18 (0.18%)</w:t>
             </w:r>
           </w:p>
         </w:tc>
@@ -232,13 +368,21 @@
         <w:pStyle w:val="NormalWeb"/>
         <w:jc w:val="both"/>
         <w:rPr>
-          <w:lang w:val="es-ES"/>
-        </w:rPr>
-      </w:pPr>
-      <w:r>
-        <w:rPr>
+          <w:rFonts w:asciiTheme="minorHAnsi" w:eastAsiaTheme="minorHAnsi" w:hAnsiTheme="minorHAnsi" w:cstheme="minorBidi"/>
+          <w:sz w:val="22"/>
+          <w:szCs w:val="22"/>
+          <w:lang w:val="es-ES"/>
+        </w:rPr>
+      </w:pPr>
+      <w:r>
+        <w:rPr>
+          <w:rFonts w:asciiTheme="minorHAnsi" w:eastAsiaTheme="minorHAnsi" w:hAnsiTheme="minorHAnsi" w:cstheme="minorBidi"/>
           <w:b/>
-          <w:noProof/>
+          <w:bCs/>
+          <w:sz w:val="22"/>
+          <w:szCs w:val="22"/>
+          <w:u w:val="single"/>
+          <w:lang w:val="es-ES"/>
         </w:rPr>
         <w:pict w14:anchorId="21C3C8C0">
           <v:shapetype id="_x0000_t75" coordsize="21600,21600" o:spt="75" o:preferrelative="t" path="m@4@5l@4@11@9@11@9@5xe" filled="f" stroked="f">
@@ -260,7 +404,7 @@
             <v:path o:extrusionok="f" gradientshapeok="t" o:connecttype="rect"/>
             <o:lock v:ext="edit" aspectratio="t"/>
           </v:shapetype>
-          <v:shape id="_x0000_s1028" type="#_x0000_t75" style="position:absolute;left:0;text-align:left;margin-left:180.05pt;margin-top:207pt;width:359.9pt;height:212.85pt;z-index:251660288;mso-position-horizontal-relative:margin;mso-position-vertical-relative:margin" stroked="t" strokecolor="black [3213]">
+          <v:shape id="_x0000_s1028" type="#_x0000_t75" style="position:absolute;left:0;text-align:left;margin-left:163.85pt;margin-top:207pt;width:359.9pt;height:212.85pt;z-index:251660288;mso-position-horizontal-relative:margin;mso-position-vertical-relative:margin" stroked="t" strokecolor="black [3213]">
             <v:imagedata r:id="rId5" o:title="predict_faults__prd85_pr50_cpprop_ud050_ur055_upp045_i0__burbuja_sv_vs_sg"/>
             <w10:wrap type="square" anchorx="margin" anchory="margin"/>
           </v:shape>
@@ -268,58 +412,131 @@
       </w:r>
       <w:r>
         <w:rPr>
-          <w:lang w:val="es-ES"/>
-        </w:rPr>
-        <w:t xml:space="preserve">El gráfico de burbujas representa, para cada clase del dataset </w:t>
-      </w:r>
-      <w:r>
-        <w:rPr>
-          <w:rStyle w:val="nfasis"/>
-          <w:lang w:val="es-ES"/>
+          <w:rFonts w:asciiTheme="minorHAnsi" w:eastAsiaTheme="minorHAnsi" w:hAnsiTheme="minorHAnsi" w:cstheme="minorBidi"/>
+          <w:b/>
+          <w:bCs/>
+          <w:sz w:val="22"/>
+          <w:szCs w:val="22"/>
+          <w:u w:val="single"/>
+          <w:lang w:val="es-ES"/>
+        </w:rPr>
+        <w:t>El gráfico de burbujas</w:t>
+      </w:r>
+      <w:r>
+        <w:rPr>
+          <w:rFonts w:asciiTheme="minorHAnsi" w:eastAsiaTheme="minorHAnsi" w:hAnsiTheme="minorHAnsi" w:cstheme="minorBidi"/>
+          <w:sz w:val="22"/>
+          <w:szCs w:val="22"/>
+          <w:lang w:val="es-ES"/>
+        </w:rPr>
+        <w:t xml:space="preserve"> representa, para cada clase del </w:t>
+      </w:r>
+      <w:proofErr w:type="spellStart"/>
+      <w:r>
+        <w:rPr>
+          <w:rFonts w:asciiTheme="minorHAnsi" w:eastAsiaTheme="minorHAnsi" w:hAnsiTheme="minorHAnsi" w:cstheme="minorBidi"/>
+          <w:sz w:val="22"/>
+          <w:szCs w:val="22"/>
+          <w:lang w:val="es-ES"/>
+        </w:rPr>
+        <w:t>dataset</w:t>
+      </w:r>
+      <w:proofErr w:type="spellEnd"/>
+      <w:r>
+        <w:rPr>
+          <w:rFonts w:asciiTheme="minorHAnsi" w:eastAsiaTheme="minorHAnsi" w:hAnsiTheme="minorHAnsi" w:cstheme="minorBidi"/>
+          <w:sz w:val="22"/>
+          <w:szCs w:val="22"/>
+          <w:lang w:val="es-ES"/>
+        </w:rPr>
+        <w:t xml:space="preserve"> </w:t>
+      </w:r>
+      <w:proofErr w:type="spellStart"/>
+      <w:r>
+        <w:rPr>
+          <w:rFonts w:asciiTheme="minorHAnsi" w:eastAsiaTheme="minorHAnsi" w:hAnsiTheme="minorHAnsi" w:cstheme="minorBidi"/>
+          <w:i/>
+          <w:iCs/>
+          <w:sz w:val="22"/>
+          <w:szCs w:val="22"/>
         </w:rPr>
         <w:t>predict_faults</w:t>
       </w:r>
-      <w:r>
-        <w:rPr>
+      <w:proofErr w:type="spellEnd"/>
+      <w:r>
+        <w:rPr>
+          <w:rFonts w:asciiTheme="minorHAnsi" w:eastAsiaTheme="minorHAnsi" w:hAnsiTheme="minorHAnsi" w:cstheme="minorBidi"/>
+          <w:sz w:val="22"/>
+          <w:szCs w:val="22"/>
           <w:lang w:val="es-ES"/>
         </w:rPr>
         <w:t xml:space="preserve">, la relación entre la cantidad de semillas válidas (SV) y la cantidad total de muestras sintéticas generadas (SG), utilizando el tamaño de la burbuja para codificar el cociente SG/SV. Este diseño permite evaluar simultáneamente la </w:t>
       </w:r>
       <w:r>
         <w:rPr>
-          <w:rStyle w:val="Textoennegrita"/>
-          <w:lang w:val="es-ES"/>
+          <w:rFonts w:asciiTheme="minorHAnsi" w:eastAsiaTheme="minorHAnsi" w:hAnsiTheme="minorHAnsi" w:cstheme="minorBidi"/>
+          <w:b/>
+          <w:bCs/>
+          <w:sz w:val="22"/>
+          <w:szCs w:val="22"/>
         </w:rPr>
         <w:t>capacidad de generación</w:t>
       </w:r>
       <w:r>
         <w:rPr>
+          <w:rFonts w:asciiTheme="minorHAnsi" w:eastAsiaTheme="minorHAnsi" w:hAnsiTheme="minorHAnsi" w:cstheme="minorBidi"/>
+          <w:sz w:val="22"/>
+          <w:szCs w:val="22"/>
           <w:lang w:val="es-ES"/>
         </w:rPr>
         <w:t xml:space="preserve">, la </w:t>
       </w:r>
       <w:r>
         <w:rPr>
-          <w:rStyle w:val="Textoennegrita"/>
-          <w:lang w:val="es-ES"/>
+          <w:rFonts w:asciiTheme="minorHAnsi" w:eastAsiaTheme="minorHAnsi" w:hAnsiTheme="minorHAnsi" w:cstheme="minorBidi"/>
+          <w:b/>
+          <w:bCs/>
+          <w:sz w:val="22"/>
+          <w:szCs w:val="22"/>
         </w:rPr>
         <w:t>distribución de semillas</w:t>
       </w:r>
       <w:r>
         <w:rPr>
+          <w:rFonts w:asciiTheme="minorHAnsi" w:eastAsiaTheme="minorHAnsi" w:hAnsiTheme="minorHAnsi" w:cstheme="minorBidi"/>
+          <w:sz w:val="22"/>
+          <w:szCs w:val="22"/>
           <w:lang w:val="es-ES"/>
         </w:rPr>
         <w:t xml:space="preserve"> y el </w:t>
       </w:r>
       <w:r>
         <w:rPr>
-          <w:rStyle w:val="Textoennegrita"/>
-          <w:lang w:val="es-ES"/>
-        </w:rPr>
-        <w:t>grado de concentración del proceso de sobremuestreo</w:t>
-      </w:r>
-      <w:r>
-        <w:rPr>
+          <w:rFonts w:asciiTheme="minorHAnsi" w:eastAsiaTheme="minorHAnsi" w:hAnsiTheme="minorHAnsi" w:cstheme="minorBidi"/>
+          <w:b/>
+          <w:bCs/>
+          <w:sz w:val="22"/>
+          <w:szCs w:val="22"/>
+        </w:rPr>
+        <w:t xml:space="preserve">grado de concentración del proceso de </w:t>
+      </w:r>
+      <w:proofErr w:type="spellStart"/>
+      <w:r>
+        <w:rPr>
+          <w:rFonts w:asciiTheme="minorHAnsi" w:eastAsiaTheme="minorHAnsi" w:hAnsiTheme="minorHAnsi" w:cstheme="minorBidi"/>
+          <w:b/>
+          <w:bCs/>
+          <w:sz w:val="22"/>
+          <w:szCs w:val="22"/>
+        </w:rPr>
+        <w:t>sobremuestreo</w:t>
+      </w:r>
+      <w:proofErr w:type="spellEnd"/>
+      <w:r>
+        <w:rPr>
+          <w:rFonts w:asciiTheme="minorHAnsi" w:eastAsiaTheme="minorHAnsi" w:hAnsiTheme="minorHAnsi" w:cstheme="minorBidi"/>
+          <w:sz w:val="22"/>
+          <w:szCs w:val="22"/>
           <w:lang w:val="es-ES"/>
         </w:rPr>
         <w:t>.</w:t>
@@ -330,11 +547,17 @@
         <w:pStyle w:val="NormalWeb"/>
         <w:jc w:val="both"/>
         <w:rPr>
-          <w:lang w:val="es-ES"/>
-        </w:rPr>
-      </w:pPr>
-      <w:r>
-        <w:rPr>
+          <w:rFonts w:asciiTheme="minorHAnsi" w:eastAsiaTheme="minorHAnsi" w:hAnsiTheme="minorHAnsi" w:cstheme="minorBidi"/>
+          <w:sz w:val="22"/>
+          <w:szCs w:val="22"/>
+          <w:lang w:val="es-ES"/>
+        </w:rPr>
+      </w:pPr>
+      <w:r>
+        <w:rPr>
+          <w:rFonts w:asciiTheme="minorHAnsi" w:eastAsiaTheme="minorHAnsi" w:hAnsiTheme="minorHAnsi" w:cstheme="minorBidi"/>
+          <w:sz w:val="22"/>
+          <w:szCs w:val="22"/>
           <w:lang w:val="es-ES"/>
         </w:rPr>
         <w:t>Se observa que todas las clases activas presentan un número reducido de semillas válidas, mientras que la cantidad de sintéticos generados alcanza valores elevados. En particular, clases con menor cantidad de SV logran producir volúmenes comparables o incluso superiores de SG, lo cual se manifiesta en burbujas de mayor tamaño. Esto indica que la generación de sintéticos no se distribuye homogéneamente entre semillas, sino que se concentra en un subconjunto limitado de instancias.</w:t>
@@ -345,105 +568,123 @@
         <w:pStyle w:val="NormalWeb"/>
         <w:jc w:val="both"/>
         <w:rPr>
-          <w:lang w:val="es-ES"/>
-        </w:rPr>
-      </w:pPr>
-      <w:r>
-        <w:rPr>
+          <w:rFonts w:asciiTheme="minorHAnsi" w:eastAsiaTheme="minorHAnsi" w:hAnsiTheme="minorHAnsi" w:cstheme="minorBidi"/>
+          <w:sz w:val="22"/>
+          <w:szCs w:val="22"/>
+          <w:lang w:val="es-ES"/>
+        </w:rPr>
+      </w:pPr>
+      <w:r>
+        <w:rPr>
+          <w:rFonts w:asciiTheme="minorHAnsi" w:eastAsiaTheme="minorHAnsi" w:hAnsiTheme="minorHAnsi" w:cstheme="minorBidi"/>
+          <w:sz w:val="22"/>
+          <w:szCs w:val="22"/>
           <w:lang w:val="es-ES"/>
         </w:rPr>
         <w:t xml:space="preserve">Desde el punto de vista geométrico, este comportamiento sugiere la existencia de regiones locales altamente productivas, rodeadas por áreas del espacio de características donde no se satisfacen los criterios de validez del algoritmo. En consecuencia, el gráfico pone en evidencia una </w:t>
       </w:r>
       <w:r>
         <w:rPr>
-          <w:rStyle w:val="Textoennegrita"/>
-          <w:lang w:val="es-ES"/>
+          <w:rFonts w:asciiTheme="minorHAnsi" w:eastAsiaTheme="minorHAnsi" w:hAnsiTheme="minorHAnsi" w:cstheme="minorBidi"/>
+          <w:b/>
+          <w:bCs/>
+          <w:sz w:val="22"/>
+          <w:szCs w:val="22"/>
         </w:rPr>
         <w:t>estructura fragmentada del espacio</w:t>
       </w:r>
       <w:r>
         <w:rPr>
-          <w:lang w:val="es-ES"/>
-        </w:rPr>
-        <w:t>, en la que pocas semillas concentran gran parte de la capacidad generativa. Este patrón es indicativo de una baja estabilidad de la vecindad local, condición que limita la efectividad de técnicas de sobremuestreo basadas en vecinos cercanos.</w:t>
-      </w:r>
-    </w:p>
-    <w:p>
-      <w:pPr>
-        <w:pStyle w:val="NormalWeb"/>
-        <w:rPr>
-          <w:lang w:val="es-ES"/>
-        </w:rPr>
-      </w:pPr>
-    </w:p>
-    <w:p>
-      <w:pPr>
-        <w:pStyle w:val="NormalWeb"/>
-        <w:rPr>
-          <w:lang w:val="es-ES"/>
-        </w:rPr>
-      </w:pPr>
-    </w:p>
-    <w:p>
-      <w:pPr>
-        <w:pStyle w:val="NormalWeb"/>
-        <w:rPr>
-          <w:lang w:val="es-ES"/>
-        </w:rPr>
-      </w:pPr>
-    </w:p>
-    <w:p>
-      <w:pPr>
-        <w:pStyle w:val="NormalWeb"/>
-        <w:rPr>
-          <w:lang w:val="es-ES"/>
-        </w:rPr>
-      </w:pPr>
-    </w:p>
-    <w:p>
-      <w:pPr>
-        <w:pStyle w:val="NormalWeb"/>
-        <w:rPr>
-          <w:lang w:val="es-ES"/>
-        </w:rPr>
-      </w:pPr>
+          <w:rFonts w:asciiTheme="minorHAnsi" w:eastAsiaTheme="minorHAnsi" w:hAnsiTheme="minorHAnsi" w:cstheme="minorBidi"/>
+          <w:sz w:val="22"/>
+          <w:szCs w:val="22"/>
+          <w:lang w:val="es-ES"/>
+        </w:rPr>
+        <w:t xml:space="preserve">, en la que pocas semillas concentran gran parte de la capacidad generativa. Este patrón es indicativo de una baja estabilidad de la vecindad local, condición que limita la efectividad de técnicas de </w:t>
+      </w:r>
+      <w:proofErr w:type="spellStart"/>
+      <w:r>
+        <w:rPr>
+          <w:rFonts w:asciiTheme="minorHAnsi" w:eastAsiaTheme="minorHAnsi" w:hAnsiTheme="minorHAnsi" w:cstheme="minorBidi"/>
+          <w:sz w:val="22"/>
+          <w:szCs w:val="22"/>
+          <w:lang w:val="es-ES"/>
+        </w:rPr>
+        <w:t>sobremuestreo</w:t>
+      </w:r>
+      <w:proofErr w:type="spellEnd"/>
+      <w:r>
+        <w:rPr>
+          <w:rFonts w:asciiTheme="minorHAnsi" w:eastAsiaTheme="minorHAnsi" w:hAnsiTheme="minorHAnsi" w:cstheme="minorBidi"/>
+          <w:sz w:val="22"/>
+          <w:szCs w:val="22"/>
+          <w:lang w:val="es-ES"/>
+        </w:rPr>
+        <w:t xml:space="preserve"> basadas en vecinos cercanos.</w:t>
+      </w:r>
     </w:p>
     <w:p>
       <w:pPr>
         <w:pStyle w:val="NormalWeb"/>
         <w:jc w:val="both"/>
         <w:rPr>
-          <w:lang w:val="es-ES"/>
-        </w:rPr>
-      </w:pPr>
-      <w:r>
-        <w:rPr>
+          <w:rFonts w:asciiTheme="minorHAnsi" w:eastAsiaTheme="minorHAnsi" w:hAnsiTheme="minorHAnsi" w:cstheme="minorBidi"/>
+          <w:sz w:val="22"/>
+          <w:szCs w:val="22"/>
+          <w:lang w:val="es-ES"/>
+        </w:rPr>
+      </w:pPr>
+      <w:r>
+        <w:rPr>
+          <w:rFonts w:asciiTheme="minorHAnsi" w:eastAsiaTheme="minorHAnsi" w:hAnsiTheme="minorHAnsi" w:cstheme="minorBidi"/>
+          <w:b/>
+          <w:bCs/>
+          <w:sz w:val="22"/>
+          <w:szCs w:val="22"/>
+          <w:u w:val="single"/>
           <w:lang w:val="es-ES"/>
         </w:rPr>
         <w:t xml:space="preserve">El gráfico de líneas tipo </w:t>
       </w:r>
-      <w:r>
-        <w:rPr>
-          <w:rStyle w:val="nfasis"/>
-          <w:lang w:val="es-ES"/>
+      <w:proofErr w:type="spellStart"/>
+      <w:r>
+        <w:rPr>
+          <w:rFonts w:asciiTheme="minorHAnsi" w:eastAsiaTheme="minorHAnsi" w:hAnsiTheme="minorHAnsi" w:cstheme="minorBidi"/>
+          <w:b/>
+          <w:bCs/>
+          <w:i/>
+          <w:iCs/>
+          <w:sz w:val="22"/>
+          <w:szCs w:val="22"/>
+          <w:u w:val="single"/>
         </w:rPr>
         <w:t>dumbbell</w:t>
       </w:r>
-      <w:r>
-        <w:rPr>
+      <w:proofErr w:type="spellEnd"/>
+      <w:r>
+        <w:rPr>
+          <w:rFonts w:asciiTheme="minorHAnsi" w:eastAsiaTheme="minorHAnsi" w:hAnsiTheme="minorHAnsi" w:cstheme="minorBidi"/>
+          <w:sz w:val="22"/>
+          <w:szCs w:val="22"/>
           <w:lang w:val="es-ES"/>
         </w:rPr>
         <w:t xml:space="preserve"> muestra, para cada clase, la diferencia entre la cantidad de semillas válidas (SV) y la cantidad de muestras sintéticas generadas (SG), utilizando una escala logarítmica en el eje horizontal. Esta representación enfatiza la </w:t>
       </w:r>
       <w:r>
         <w:rPr>
-          <w:rStyle w:val="Textoennegrita"/>
-          <w:lang w:val="es-ES"/>
+          <w:rFonts w:asciiTheme="minorHAnsi" w:eastAsiaTheme="minorHAnsi" w:hAnsiTheme="minorHAnsi" w:cstheme="minorBidi"/>
+          <w:b/>
+          <w:bCs/>
+          <w:sz w:val="22"/>
+          <w:szCs w:val="22"/>
         </w:rPr>
         <w:t>magnitud del desbalance</w:t>
       </w:r>
       <w:r>
         <w:rPr>
+          <w:rFonts w:asciiTheme="minorHAnsi" w:eastAsiaTheme="minorHAnsi" w:hAnsiTheme="minorHAnsi" w:cstheme="minorBidi"/>
+          <w:sz w:val="22"/>
+          <w:szCs w:val="22"/>
           <w:lang w:val="es-ES"/>
         </w:rPr>
         <w:t xml:space="preserve"> entre ambos valores y permite comparar órdenes de magnitud entre clases.</w:t>
@@ -454,13 +695,20 @@
         <w:pStyle w:val="NormalWeb"/>
         <w:jc w:val="both"/>
         <w:rPr>
-          <w:lang w:val="es-ES"/>
-        </w:rPr>
-      </w:pPr>
-      <w:r>
-        <w:rPr>
-          <w:noProof/>
-        </w:rPr>
+          <w:rFonts w:asciiTheme="minorHAnsi" w:eastAsiaTheme="minorHAnsi" w:hAnsiTheme="minorHAnsi" w:cstheme="minorBidi"/>
+          <w:sz w:val="22"/>
+          <w:szCs w:val="22"/>
+          <w:lang w:val="es-ES"/>
+        </w:rPr>
+      </w:pPr>
+      <w:r>
+        <w:rPr>
+          <w:rFonts w:asciiTheme="minorHAnsi" w:eastAsiaTheme="minorHAnsi" w:hAnsiTheme="minorHAnsi" w:cstheme="minorBidi"/>
+          <w:sz w:val="22"/>
+          <w:szCs w:val="22"/>
+          <w:lang w:val="es-ES"/>
+        </w:rPr>
+        <w:lastRenderedPageBreak/>
         <w:drawing>
           <wp:anchor distT="0" distB="0" distL="114300" distR="114300" simplePos="0" relativeHeight="251662336" behindDoc="0" locked="0" layoutInCell="1" allowOverlap="1" wp14:anchorId="7CB5190D" wp14:editId="6B309BC7">
             <wp:simplePos x="0" y="0"/>
@@ -528,6 +776,9 @@
       </w:r>
       <w:r>
         <w:rPr>
+          <w:rFonts w:asciiTheme="minorHAnsi" w:eastAsiaTheme="minorHAnsi" w:hAnsiTheme="minorHAnsi" w:cstheme="minorBidi"/>
+          <w:sz w:val="22"/>
+          <w:szCs w:val="22"/>
           <w:lang w:val="es-ES"/>
         </w:rPr>
         <w:t>Para todas las clases consideradas, la distancia entre los puntos correspondientes a SV y SG es considerable, alcanzando factores de multiplicación del orden de cientos de sintéticos por semilla. Este resultado evidencia que el algoritmo, una vez identificadas las semillas válidas, genera una cantidad de muestras sintéticas desproporcionadamente alta respecto del número de instancias originales que actúan como base del proceso.</w:t>
@@ -538,42 +789,93 @@
         <w:pStyle w:val="NormalWeb"/>
         <w:jc w:val="both"/>
         <w:rPr>
-          <w:lang w:val="es-ES"/>
-        </w:rPr>
-      </w:pPr>
-      <w:r>
-        <w:rPr>
+          <w:rFonts w:asciiTheme="minorHAnsi" w:eastAsiaTheme="minorHAnsi" w:hAnsiTheme="minorHAnsi" w:cstheme="minorBidi"/>
+          <w:sz w:val="22"/>
+          <w:szCs w:val="22"/>
+          <w:lang w:val="es-ES"/>
+        </w:rPr>
+      </w:pPr>
+      <w:r>
+        <w:rPr>
+          <w:rFonts w:asciiTheme="minorHAnsi" w:eastAsiaTheme="minorHAnsi" w:hAnsiTheme="minorHAnsi" w:cstheme="minorBidi"/>
+          <w:sz w:val="22"/>
+          <w:szCs w:val="22"/>
           <w:lang w:val="es-ES"/>
         </w:rPr>
         <w:t xml:space="preserve">Desde una perspectiva metodológica, este comportamiento revela que la capacidad de generación depende críticamente de un conjunto extremadamente reducido de semillas. Tal dependencia implica un riesgo de </w:t>
       </w:r>
       <w:r>
         <w:rPr>
-          <w:rStyle w:val="Textoennegrita"/>
-          <w:lang w:val="es-ES"/>
-        </w:rPr>
-        <w:t>sobreexplotación de regiones locales específicas</w:t>
-      </w:r>
-      <w:r>
-        <w:rPr>
-          <w:lang w:val="es-ES"/>
-        </w:rPr>
-        <w:t>, lo cual puede amplificar patrones idiosincráticos del conjunto de entrenamiento y reducir la representatividad global de los datos sintéticos generados. En este sentido, el gráfico de líneas aporta evidencia cuantitativa de que el proceso de sobremuestreo se apoya en una base estructural limitada, reforzando la hipótesis de que el dataset no presenta una geometría favorable para métodos fundamentados en vecindad local.</w:t>
-      </w:r>
-    </w:p>
-    <w:p>
-      <w:pPr>
-        <w:rPr>
+          <w:rFonts w:asciiTheme="minorHAnsi" w:eastAsiaTheme="minorHAnsi" w:hAnsiTheme="minorHAnsi" w:cstheme="minorBidi"/>
           <w:b/>
           <w:bCs/>
-          <w:lang w:val="es-ES"/>
-        </w:rPr>
-      </w:pPr>
-      <w:r>
-        <w:rPr>
-          <w:lang w:val="es-ES"/>
-        </w:rPr>
-        <w:lastRenderedPageBreak/>
+          <w:sz w:val="22"/>
+          <w:szCs w:val="22"/>
+        </w:rPr>
+        <w:t>sobreexplotación de regiones locales específicas</w:t>
+      </w:r>
+      <w:r>
+        <w:rPr>
+          <w:rFonts w:asciiTheme="minorHAnsi" w:eastAsiaTheme="minorHAnsi" w:hAnsiTheme="minorHAnsi" w:cstheme="minorBidi"/>
+          <w:sz w:val="22"/>
+          <w:szCs w:val="22"/>
+          <w:lang w:val="es-ES"/>
+        </w:rPr>
+        <w:t xml:space="preserve">, lo cual puede amplificar patrones idiosincráticos del conjunto de entrenamiento y reducir la representatividad global de los datos sintéticos generados. En este sentido, el gráfico de líneas aporta evidencia cuantitativa de que el proceso de </w:t>
+      </w:r>
+      <w:proofErr w:type="spellStart"/>
+      <w:r>
+        <w:rPr>
+          <w:rFonts w:asciiTheme="minorHAnsi" w:eastAsiaTheme="minorHAnsi" w:hAnsiTheme="minorHAnsi" w:cstheme="minorBidi"/>
+          <w:sz w:val="22"/>
+          <w:szCs w:val="22"/>
+          <w:lang w:val="es-ES"/>
+        </w:rPr>
+        <w:t>sobremuestreo</w:t>
+      </w:r>
+      <w:proofErr w:type="spellEnd"/>
+      <w:r>
+        <w:rPr>
+          <w:rFonts w:asciiTheme="minorHAnsi" w:eastAsiaTheme="minorHAnsi" w:hAnsiTheme="minorHAnsi" w:cstheme="minorBidi"/>
+          <w:sz w:val="22"/>
+          <w:szCs w:val="22"/>
+          <w:lang w:val="es-ES"/>
+        </w:rPr>
+        <w:t xml:space="preserve"> se apoya en una base estructural limitada, reforzando la hipótesis de que el </w:t>
+      </w:r>
+      <w:proofErr w:type="spellStart"/>
+      <w:r>
+        <w:rPr>
+          <w:rFonts w:asciiTheme="minorHAnsi" w:eastAsiaTheme="minorHAnsi" w:hAnsiTheme="minorHAnsi" w:cstheme="minorBidi"/>
+          <w:sz w:val="22"/>
+          <w:szCs w:val="22"/>
+          <w:lang w:val="es-ES"/>
+        </w:rPr>
+        <w:t>dataset</w:t>
+      </w:r>
+      <w:proofErr w:type="spellEnd"/>
+      <w:r>
+        <w:rPr>
+          <w:rFonts w:asciiTheme="minorHAnsi" w:eastAsiaTheme="minorHAnsi" w:hAnsiTheme="minorHAnsi" w:cstheme="minorBidi"/>
+          <w:sz w:val="22"/>
+          <w:szCs w:val="22"/>
+          <w:lang w:val="es-ES"/>
+        </w:rPr>
+        <w:t xml:space="preserve"> no presenta una geometría favorable para métodos fundamentados en vecindad local.</w:t>
+      </w:r>
+    </w:p>
+    <w:p>
+      <w:pPr>
+        <w:rPr>
+          <w:b/>
+          <w:bCs/>
+          <w:lang w:val="es-ES"/>
+        </w:rPr>
+      </w:pPr>
+      <w:r>
+        <w:rPr>
+          <w:lang w:val="es-ES"/>
+        </w:rPr>
         <w:br w:type="textWrapping" w:clear="all"/>
       </w:r>
       <w:r>
@@ -632,12 +934,201 @@
     </w:p>
     <w:p>
       <w:pPr>
+        <w:jc w:val="both"/>
+        <w:rPr>
+          <w:lang w:val="es-ES"/>
+        </w:rPr>
+      </w:pPr>
+      <w:r>
         <w:rPr>
           <w:b/>
           <w:bCs/>
-          <w:lang w:val="es-ES"/>
-        </w:rPr>
-      </w:pPr>
+          <w:u w:val="single"/>
+          <w:lang w:val="es-ES"/>
+        </w:rPr>
+        <w:t>El grafico de radar</w:t>
+      </w:r>
+      <w:r>
+        <w:rPr>
+          <w:lang w:val="es-ES"/>
+        </w:rPr>
+        <w:t xml:space="preserve"> muestra un </w:t>
+      </w:r>
+      <w:r>
+        <w:rPr>
+          <w:lang w:val="es-ES"/>
+        </w:rPr>
+        <w:t xml:space="preserve">comportamiento </w:t>
+      </w:r>
+      <w:r>
+        <w:rPr>
+          <w:lang w:val="es-ES"/>
+        </w:rPr>
+        <w:t xml:space="preserve">que </w:t>
+      </w:r>
+      <w:r>
+        <w:rPr>
+          <w:lang w:val="es-ES"/>
+        </w:rPr>
+        <w:t xml:space="preserve">no responde principalmente al desbalance extremo, sino a una inadecuación estructural del </w:t>
+      </w:r>
+      <w:proofErr w:type="spellStart"/>
+      <w:r>
+        <w:rPr>
+          <w:lang w:val="es-ES"/>
+        </w:rPr>
+        <w:t>dataset</w:t>
+      </w:r>
+      <w:proofErr w:type="spellEnd"/>
+      <w:r>
+        <w:rPr>
+          <w:lang w:val="es-ES"/>
+        </w:rPr>
+        <w:t xml:space="preserve"> para técnicas basadas en vecindad; al observar se nota que la mayoría de las configuraciones </w:t>
+      </w:r>
+      <w:r>
+        <w:rPr>
+          <w:lang w:val="es-ES"/>
+        </w:rPr>
+        <w:t xml:space="preserve">pasan densidad con valores altos y estables, pasan riesgo con valores medios-altos, no así con pureza donde tienen valores muy bajos, lo cual hace que las semillas candidatas sean extremadamente bajas. </w:t>
+      </w:r>
+    </w:p>
+    <w:p>
+      <w:pPr>
+        <w:jc w:val="both"/>
+        <w:rPr>
+          <w:lang w:val="es-ES"/>
+        </w:rPr>
+      </w:pPr>
+      <w:r>
+        <w:rPr>
+          <w:lang w:val="es-ES"/>
+        </w:rPr>
+        <w:lastRenderedPageBreak/>
+        <w:t xml:space="preserve">La equidad </w:t>
+      </w:r>
+      <w:r>
+        <w:rPr>
+          <w:lang w:val="es-ES"/>
+        </w:rPr>
+        <w:t>alta es engañosa</w:t>
+      </w:r>
+      <w:r>
+        <w:rPr>
+          <w:lang w:val="es-ES"/>
+        </w:rPr>
+        <w:t xml:space="preserve">, pero si se observa la cobertura generativa, se deduce que la equidad de generación es sobre las clases que logra </w:t>
+      </w:r>
+      <w:proofErr w:type="spellStart"/>
+      <w:r>
+        <w:rPr>
+          <w:lang w:val="es-ES"/>
+        </w:rPr>
+        <w:t>resamplear</w:t>
+      </w:r>
+      <w:proofErr w:type="spellEnd"/>
+      <w:r>
+        <w:rPr>
+          <w:lang w:val="es-ES"/>
+        </w:rPr>
+        <w:t xml:space="preserve">, sin </w:t>
+      </w:r>
+      <w:r>
+        <w:rPr>
+          <w:lang w:val="es-ES"/>
+        </w:rPr>
+        <w:t>embargo,</w:t>
+      </w:r>
+      <w:r>
+        <w:rPr>
+          <w:lang w:val="es-ES"/>
+        </w:rPr>
+        <w:t xml:space="preserve"> queda casi la mitad de </w:t>
+      </w:r>
+      <w:r>
+        <w:rPr>
+          <w:lang w:val="es-ES"/>
+        </w:rPr>
+        <w:t>las clases</w:t>
+      </w:r>
+      <w:r>
+        <w:rPr>
+          <w:lang w:val="es-ES"/>
+        </w:rPr>
+        <w:t xml:space="preserve"> sin cubrir.</w:t>
+      </w:r>
+      <w:r>
+        <w:rPr>
+          <w:lang w:val="es-ES"/>
+        </w:rPr>
+        <w:t xml:space="preserve"> O sea, el algoritmo está repartiendo bien…sobre un soporte geométrico pobre.</w:t>
+      </w:r>
+      <w:r>
+        <w:rPr>
+          <w:lang w:val="es-ES"/>
+        </w:rPr>
+        <w:t xml:space="preserve"> </w:t>
+      </w:r>
+    </w:p>
+    <w:p>
+      <w:pPr>
+        <w:jc w:val="both"/>
+        <w:rPr>
+          <w:lang w:val="es-ES"/>
+        </w:rPr>
+      </w:pPr>
+      <w:r>
+        <w:rPr>
+          <w:lang w:val="es-ES"/>
+        </w:rPr>
+        <w:t xml:space="preserve">Una hipótesis es pensar que se trata de un </w:t>
+      </w:r>
+      <w:proofErr w:type="spellStart"/>
+      <w:r>
+        <w:rPr>
+          <w:lang w:val="es-ES"/>
+        </w:rPr>
+        <w:t>dataset</w:t>
+      </w:r>
+      <w:proofErr w:type="spellEnd"/>
+      <w:r>
+        <w:rPr>
+          <w:lang w:val="es-ES"/>
+        </w:rPr>
+        <w:t xml:space="preserve"> que no es vecino-basado</w:t>
+      </w:r>
+      <w:r>
+        <w:rPr>
+          <w:lang w:val="es-ES"/>
+        </w:rPr>
+        <w:t xml:space="preserve">, no por la dimensionalidad (ya que tiene pocas </w:t>
+      </w:r>
+      <w:proofErr w:type="spellStart"/>
+      <w:r>
+        <w:rPr>
+          <w:lang w:val="es-ES"/>
+        </w:rPr>
+        <w:t>features</w:t>
+      </w:r>
+      <w:proofErr w:type="spellEnd"/>
+      <w:r>
+        <w:rPr>
+          <w:lang w:val="es-ES"/>
+        </w:rPr>
+        <w:t xml:space="preserve">), sino la geometría del espacio de características, es decir las clases minoritarias no forman vecindarios compactos, esto se puede deducir de la baja pureza en los vecindarios, mucha mezcla en las </w:t>
+      </w:r>
+      <w:r>
+        <w:rPr>
+          <w:lang w:val="es-ES"/>
+        </w:rPr>
+        <w:t>vecindades</w:t>
+      </w:r>
+      <w:r>
+        <w:rPr>
+          <w:lang w:val="es-ES"/>
+        </w:rPr>
+        <w:t xml:space="preserve"> hace que pocas semillas lleguen a ser candidatas, el concepto vecino no es informativo. </w:t>
+      </w:r>
     </w:p>
     <w:p>
       <w:pPr>
@@ -647,103 +1138,31 @@
           <w:lang w:val="es-ES"/>
         </w:rPr>
       </w:pPr>
-    </w:p>
-    <w:p>
-      <w:pPr>
+      <w:r>
         <w:rPr>
           <w:b/>
           <w:bCs/>
           <w:lang w:val="es-ES"/>
         </w:rPr>
-      </w:pPr>
-    </w:p>
-    <w:p>
-      <w:pPr>
+        <w:t xml:space="preserve">ANALISIS DE PERFORMANCE sobre </w:t>
+      </w:r>
+      <w:proofErr w:type="spellStart"/>
+      <w:r>
         <w:rPr>
           <w:b/>
           <w:bCs/>
           <w:lang w:val="es-ES"/>
         </w:rPr>
-      </w:pPr>
-    </w:p>
-    <w:p>
-      <w:pPr>
+        <w:t>RandomForest</w:t>
+      </w:r>
+      <w:proofErr w:type="spellEnd"/>
+      <w:r>
         <w:rPr>
           <w:b/>
           <w:bCs/>
           <w:lang w:val="es-ES"/>
         </w:rPr>
-      </w:pPr>
-    </w:p>
-    <w:p>
-      <w:pPr>
-        <w:rPr>
-          <w:b/>
-          <w:bCs/>
-          <w:lang w:val="es-ES"/>
-        </w:rPr>
-      </w:pPr>
-    </w:p>
-    <w:p>
-      <w:pPr>
-        <w:rPr>
-          <w:b/>
-          <w:bCs/>
-          <w:lang w:val="es-ES"/>
-        </w:rPr>
-      </w:pPr>
-    </w:p>
-    <w:p>
-      <w:pPr>
-        <w:rPr>
-          <w:b/>
-          <w:bCs/>
-          <w:lang w:val="es-ES"/>
-        </w:rPr>
-      </w:pPr>
-    </w:p>
-    <w:p>
-      <w:pPr>
-        <w:rPr>
-          <w:b/>
-          <w:bCs/>
-          <w:lang w:val="es-ES"/>
-        </w:rPr>
-      </w:pPr>
-    </w:p>
-    <w:p>
-      <w:pPr>
-        <w:rPr>
-          <w:b/>
-          <w:bCs/>
-          <w:lang w:val="es-ES"/>
-        </w:rPr>
-      </w:pPr>
-    </w:p>
-    <w:p>
-      <w:pPr>
-        <w:rPr>
-          <w:b/>
-          <w:bCs/>
-          <w:lang w:val="es-ES"/>
-        </w:rPr>
-      </w:pPr>
-    </w:p>
-    <w:p>
-      <w:pPr>
-        <w:rPr>
-          <w:b/>
-          <w:bCs/>
-          <w:lang w:val="es-ES"/>
-        </w:rPr>
-      </w:pPr>
-      <w:r>
-        <w:rPr>
-          <w:b/>
-          <w:bCs/>
-          <w:lang w:val="es-ES"/>
-        </w:rPr>
-        <w:t>ANALISIS DE PERFORMANCE sobre RandomForest:</w:t>
+        <w:t>:</w:t>
       </w:r>
     </w:p>
     <w:p>
@@ -757,7 +1176,119 @@
         <w:rPr>
           <w:lang w:val="es-ES"/>
         </w:rPr>
-        <w:t>En ninguno de los 3 grados de isolacion pcsmote logro superar al caso base, asi tampoco a las 3 tecnicas clásicas: smote, borderline-smote y adasyn, de las cuales el máximo valor de f1_macro según grado de isolacion fue</w:t>
+        <w:t xml:space="preserve">En ninguno de los 3 grados de </w:t>
+      </w:r>
+      <w:proofErr w:type="spellStart"/>
+      <w:r>
+        <w:rPr>
+          <w:lang w:val="es-ES"/>
+        </w:rPr>
+        <w:t>isolacion</w:t>
+      </w:r>
+      <w:proofErr w:type="spellEnd"/>
+      <w:r>
+        <w:rPr>
+          <w:lang w:val="es-ES"/>
+        </w:rPr>
+        <w:t xml:space="preserve"> </w:t>
+      </w:r>
+      <w:proofErr w:type="spellStart"/>
+      <w:r>
+        <w:rPr>
+          <w:lang w:val="es-ES"/>
+        </w:rPr>
+        <w:t>pcsmote</w:t>
+      </w:r>
+      <w:proofErr w:type="spellEnd"/>
+      <w:r>
+        <w:rPr>
+          <w:lang w:val="es-ES"/>
+        </w:rPr>
+        <w:t xml:space="preserve"> logro superar al caso base, </w:t>
+      </w:r>
+      <w:proofErr w:type="spellStart"/>
+      <w:r>
+        <w:rPr>
+          <w:lang w:val="es-ES"/>
+        </w:rPr>
+        <w:t>asi</w:t>
+      </w:r>
+      <w:proofErr w:type="spellEnd"/>
+      <w:r>
+        <w:rPr>
+          <w:lang w:val="es-ES"/>
+        </w:rPr>
+        <w:t xml:space="preserve"> tampoco a las 3 </w:t>
+      </w:r>
+      <w:proofErr w:type="spellStart"/>
+      <w:r>
+        <w:rPr>
+          <w:lang w:val="es-ES"/>
+        </w:rPr>
+        <w:t>tecnicas</w:t>
+      </w:r>
+      <w:proofErr w:type="spellEnd"/>
+      <w:r>
+        <w:rPr>
+          <w:lang w:val="es-ES"/>
+        </w:rPr>
+        <w:t xml:space="preserve"> clásicas: </w:t>
+      </w:r>
+      <w:proofErr w:type="spellStart"/>
+      <w:r>
+        <w:rPr>
+          <w:lang w:val="es-ES"/>
+        </w:rPr>
+        <w:t>smote</w:t>
+      </w:r>
+      <w:proofErr w:type="spellEnd"/>
+      <w:r>
+        <w:rPr>
+          <w:lang w:val="es-ES"/>
+        </w:rPr>
+        <w:t xml:space="preserve">, </w:t>
+      </w:r>
+      <w:proofErr w:type="spellStart"/>
+      <w:r>
+        <w:rPr>
+          <w:lang w:val="es-ES"/>
+        </w:rPr>
+        <w:t>borderline-smote</w:t>
+      </w:r>
+      <w:proofErr w:type="spellEnd"/>
+      <w:r>
+        <w:rPr>
+          <w:lang w:val="es-ES"/>
+        </w:rPr>
+        <w:t xml:space="preserve"> y </w:t>
+      </w:r>
+      <w:proofErr w:type="spellStart"/>
+      <w:r>
+        <w:rPr>
+          <w:lang w:val="es-ES"/>
+        </w:rPr>
+        <w:t>adasyn</w:t>
+      </w:r>
+      <w:proofErr w:type="spellEnd"/>
+      <w:r>
+        <w:rPr>
+          <w:lang w:val="es-ES"/>
+        </w:rPr>
+        <w:t xml:space="preserve">, de las cuales el máximo valor de f1_macro según grado de </w:t>
+      </w:r>
+      <w:proofErr w:type="spellStart"/>
+      <w:r>
+        <w:rPr>
+          <w:lang w:val="es-ES"/>
+        </w:rPr>
+        <w:t>isolacion</w:t>
+      </w:r>
+      <w:proofErr w:type="spellEnd"/>
+      <w:r>
+        <w:rPr>
+          <w:lang w:val="es-ES"/>
+        </w:rPr>
+        <w:t xml:space="preserve"> fue</w:t>
       </w:r>
       <w:r>
         <w:rPr>
@@ -769,275 +1300,73 @@
     <w:p>
       <w:pPr>
         <w:rPr>
+          <w:lang w:val="es-ES"/>
+        </w:rPr>
+      </w:pPr>
+      <w:r>
+        <w:rPr>
           <w:lang w:val="en-US"/>
         </w:rPr>
-      </w:pPr>
+        <w:t xml:space="preserve">Ranking </w:t>
+      </w:r>
+      <w:proofErr w:type="spellStart"/>
       <w:r>
         <w:rPr>
           <w:lang w:val="en-US"/>
         </w:rPr>
-        <w:t>Ranking según mejor f1_macro_test</w:t>
-      </w:r>
-    </w:p>
-    <w:tbl>
-      <w:tblPr>
-        <w:tblStyle w:val="Tablaconcuadrcula"/>
-        <w:tblW w:w="0" w:type="auto"/>
-        <w:tblLook w:val="04A0" w:firstRow="1" w:lastRow="0" w:firstColumn="1" w:lastColumn="0" w:noHBand="0" w:noVBand="1"/>
-      </w:tblPr>
-      <w:tblGrid>
-        <w:gridCol w:w="3028"/>
-        <w:gridCol w:w="3090"/>
-        <w:gridCol w:w="2710"/>
-      </w:tblGrid>
-      <w:tr>
-        <w:tc>
-          <w:tcPr>
-            <w:tcW w:w="3028" w:type="dxa"/>
-          </w:tcPr>
-          <w:p>
-            <w:pPr>
-              <w:rPr>
-                <w:lang w:val="es-ES"/>
-              </w:rPr>
-            </w:pPr>
-            <w:r>
-              <w:rPr>
-                <w:lang w:val="es-ES"/>
-              </w:rPr>
-              <w:t>Grado de Isolacion</w:t>
-            </w:r>
-          </w:p>
-        </w:tc>
-        <w:tc>
-          <w:tcPr>
-            <w:tcW w:w="3090" w:type="dxa"/>
-          </w:tcPr>
-          <w:p>
-            <w:pPr>
-              <w:rPr>
-                <w:lang w:val="es-ES"/>
-              </w:rPr>
-            </w:pPr>
-            <w:r>
-              <w:rPr>
-                <w:lang w:val="es-ES"/>
-              </w:rPr>
-              <w:t>Técnica</w:t>
-            </w:r>
-          </w:p>
-        </w:tc>
-        <w:tc>
-          <w:tcPr>
-            <w:tcW w:w="2710" w:type="dxa"/>
-          </w:tcPr>
-          <w:p>
-            <w:pPr>
-              <w:rPr>
-                <w:lang w:val="es-ES"/>
-              </w:rPr>
-            </w:pPr>
-            <w:r>
-              <w:rPr>
-                <w:lang w:val="es-ES"/>
-              </w:rPr>
-              <w:t>F1 macro test</w:t>
-            </w:r>
-          </w:p>
-        </w:tc>
-      </w:tr>
-      <w:tr>
-        <w:tc>
-          <w:tcPr>
-            <w:tcW w:w="3028" w:type="dxa"/>
-          </w:tcPr>
-          <w:p>
-            <w:pPr>
-              <w:rPr>
-                <w:lang w:val="es-ES"/>
-              </w:rPr>
-            </w:pPr>
-            <w:r>
-              <w:rPr>
-                <w:lang w:val="es-ES"/>
-              </w:rPr>
-              <w:t>0</w:t>
-            </w:r>
-          </w:p>
-        </w:tc>
-        <w:tc>
-          <w:tcPr>
-            <w:tcW w:w="3090" w:type="dxa"/>
-          </w:tcPr>
-          <w:p>
-            <w:pPr>
-              <w:rPr>
-                <w:lang w:val="es-ES"/>
-              </w:rPr>
-            </w:pPr>
-            <w:r>
-              <w:rPr>
-                <w:lang w:val="es-ES"/>
-              </w:rPr>
-              <w:t>Borderline Smote</w:t>
-            </w:r>
-          </w:p>
-        </w:tc>
-        <w:tc>
-          <w:tcPr>
-            <w:tcW w:w="2710" w:type="dxa"/>
-          </w:tcPr>
-          <w:p>
-            <w:pPr>
-              <w:rPr>
-                <w:lang w:val="es-ES"/>
-              </w:rPr>
-            </w:pPr>
-            <w:r>
-              <w:rPr>
-                <w:lang w:val="es-ES"/>
-              </w:rPr>
-              <w:t>0,562</w:t>
-            </w:r>
-          </w:p>
-        </w:tc>
-      </w:tr>
-      <w:tr>
-        <w:tc>
-          <w:tcPr>
-            <w:tcW w:w="3028" w:type="dxa"/>
-          </w:tcPr>
-          <w:p>
-            <w:pPr>
-              <w:rPr>
-                <w:lang w:val="es-ES"/>
-              </w:rPr>
-            </w:pPr>
-            <w:r>
-              <w:rPr>
-                <w:lang w:val="es-ES"/>
-              </w:rPr>
-              <w:lastRenderedPageBreak/>
-              <w:t>1</w:t>
-            </w:r>
-          </w:p>
-        </w:tc>
-        <w:tc>
-          <w:tcPr>
-            <w:tcW w:w="3090" w:type="dxa"/>
-          </w:tcPr>
-          <w:p>
-            <w:pPr>
-              <w:rPr>
-                <w:lang w:val="es-ES"/>
-              </w:rPr>
-            </w:pPr>
-            <w:r>
-              <w:rPr>
-                <w:lang w:val="es-ES"/>
-              </w:rPr>
-              <w:t>Adasyn</w:t>
-            </w:r>
-          </w:p>
-        </w:tc>
-        <w:tc>
-          <w:tcPr>
-            <w:tcW w:w="2710" w:type="dxa"/>
-          </w:tcPr>
-          <w:p>
-            <w:pPr>
-              <w:rPr>
-                <w:lang w:val="es-ES"/>
-              </w:rPr>
-            </w:pPr>
-            <w:r>
-              <w:rPr>
-                <w:lang w:val="es-ES"/>
-              </w:rPr>
-              <w:t>0,566</w:t>
-            </w:r>
-          </w:p>
-        </w:tc>
-      </w:tr>
-      <w:tr>
-        <w:tc>
-          <w:tcPr>
-            <w:tcW w:w="3028" w:type="dxa"/>
-          </w:tcPr>
-          <w:p>
-            <w:pPr>
-              <w:rPr>
-                <w:lang w:val="es-ES"/>
-              </w:rPr>
-            </w:pPr>
-            <w:r>
-              <w:rPr>
-                <w:lang w:val="es-ES"/>
-              </w:rPr>
-              <w:t>3</w:t>
-            </w:r>
-          </w:p>
-        </w:tc>
-        <w:tc>
-          <w:tcPr>
-            <w:tcW w:w="3090" w:type="dxa"/>
-          </w:tcPr>
-          <w:p>
-            <w:pPr>
-              <w:rPr>
-                <w:lang w:val="es-ES"/>
-              </w:rPr>
-            </w:pPr>
-            <w:r>
-              <w:rPr>
-                <w:lang w:val="es-ES"/>
-              </w:rPr>
-              <w:t>Smote</w:t>
-            </w:r>
-          </w:p>
-        </w:tc>
-        <w:tc>
-          <w:tcPr>
-            <w:tcW w:w="2710" w:type="dxa"/>
-          </w:tcPr>
-          <w:p>
-            <w:pPr>
-              <w:rPr>
-                <w:lang w:val="es-ES"/>
-              </w:rPr>
-            </w:pPr>
-            <w:r>
-              <w:rPr>
-                <w:lang w:val="es-ES"/>
-              </w:rPr>
-              <w:t>0,544</w:t>
-            </w:r>
-          </w:p>
-        </w:tc>
-      </w:tr>
-    </w:tbl>
-    <w:p>
-      <w:pPr>
-        <w:rPr>
-          <w:lang w:val="es-ES"/>
-        </w:rPr>
-      </w:pPr>
-    </w:p>
-    <w:p>
-      <w:pPr>
-        <w:rPr>
-          <w:lang w:val="es-ES"/>
-        </w:rPr>
-      </w:pPr>
-      <w:r>
-        <w:rPr>
-          <w:lang w:val="es-ES"/>
-        </w:rPr>
-        <w:t xml:space="preserve">El máximo alcanzado por pcsmote en los 3 grados de limpieza fue de 0,524. </w:t>
-      </w:r>
-    </w:p>
-    <w:p>
-      <w:pPr>
+        <w:t>según</w:t>
+      </w:r>
+      <w:proofErr w:type="spellEnd"/>
+      <w:r>
+        <w:rPr>
+          <w:lang w:val="en-US"/>
+        </w:rPr>
+        <w:t xml:space="preserve"> </w:t>
+      </w:r>
+      <w:proofErr w:type="spellStart"/>
+      <w:r>
+        <w:rPr>
+          <w:lang w:val="en-US"/>
+        </w:rPr>
+        <w:t>mejor</w:t>
+      </w:r>
+      <w:proofErr w:type="spellEnd"/>
+      <w:r>
+        <w:rPr>
+          <w:lang w:val="en-US"/>
+        </w:rPr>
+        <w:t xml:space="preserve"> f1_macro_test</w:t>
+      </w:r>
+      <w:r>
+        <w:rPr>
+          <w:lang w:val="en-US"/>
+        </w:rPr>
+        <w:t>, e</w:t>
+      </w:r>
+      <w:r>
+        <w:rPr>
+          <w:lang w:val="es-ES"/>
+        </w:rPr>
+        <w:t xml:space="preserve">l máximo alcanzado por </w:t>
+      </w:r>
+      <w:proofErr w:type="spellStart"/>
+      <w:r>
+        <w:rPr>
+          <w:lang w:val="es-ES"/>
+        </w:rPr>
+        <w:t>pcsmote</w:t>
+      </w:r>
+      <w:proofErr w:type="spellEnd"/>
+      <w:r>
+        <w:rPr>
+          <w:lang w:val="es-ES"/>
+        </w:rPr>
+        <w:t xml:space="preserve"> en los 3 grados de limpieza fue de 0,524. </w:t>
+      </w:r>
+    </w:p>
+    <w:p>
+      <w:pPr>
+        <w:jc w:val="both"/>
         <w:rPr>
           <w:lang w:val="es-ES"/>
         </w:rPr>
@@ -1070,21 +1399,80 @@
         <w:rPr>
           <w:lang w:val="es-ES"/>
         </w:rPr>
-        <w:t xml:space="preserve"> todas las técnicas tuvieron un rendimiento parecido, pero las que mejoraron el rendimiento del clasificador en comparación con la línea base fueron las técnicas clásicas.</w:t>
-      </w:r>
-    </w:p>
-    <w:p>
-      <w:pPr>
-        <w:rPr>
-          <w:lang w:val="es-ES"/>
-        </w:rPr>
-      </w:pPr>
-      <w:r>
-        <w:rPr>
-          <w:lang w:val="es-ES"/>
-        </w:rPr>
-        <w:t xml:space="preserve">Esto demuestra que para algunos datasets pcsmote no va a poder sacar un beneficio significativo en performance. </w:t>
-      </w:r>
+        <w:t xml:space="preserve"> todas las técnicas tuvieron un rendimiento</w:t>
+      </w:r>
+      <w:r>
+        <w:rPr>
+          <w:lang w:val="es-ES"/>
+        </w:rPr>
+        <w:t xml:space="preserve"> </w:t>
+      </w:r>
+      <w:r>
+        <w:rPr>
+          <w:lang w:val="es-ES"/>
+        </w:rPr>
+        <w:t>parecido, pero las que mejoraron el rendimiento del clasificador en comparación con la línea base fueron las</w:t>
+      </w:r>
+      <w:r>
+        <w:rPr>
+          <w:lang w:val="es-ES"/>
+        </w:rPr>
+        <w:t xml:space="preserve"> </w:t>
+      </w:r>
+      <w:r>
+        <w:rPr>
+          <w:lang w:val="es-ES"/>
+        </w:rPr>
+        <w:t>técnicas clásicas.</w:t>
+      </w:r>
+    </w:p>
+    <w:p>
+      <w:pPr>
+        <w:rPr>
+          <w:lang w:val="es-ES"/>
+        </w:rPr>
+      </w:pPr>
+      <w:r>
+        <w:rPr>
+          <w:lang w:val="es-ES"/>
+        </w:rPr>
+        <w:t xml:space="preserve">Esto demuestra que para algunos </w:t>
+      </w:r>
+      <w:proofErr w:type="spellStart"/>
+      <w:r>
+        <w:rPr>
+          <w:lang w:val="es-ES"/>
+        </w:rPr>
+        <w:t>datasets</w:t>
+      </w:r>
+      <w:proofErr w:type="spellEnd"/>
+      <w:r>
+        <w:rPr>
+          <w:lang w:val="es-ES"/>
+        </w:rPr>
+        <w:t xml:space="preserve"> </w:t>
+      </w:r>
+      <w:proofErr w:type="spellStart"/>
+      <w:r>
+        <w:rPr>
+          <w:lang w:val="es-ES"/>
+        </w:rPr>
+        <w:t>pcsmote</w:t>
+      </w:r>
+      <w:proofErr w:type="spellEnd"/>
+      <w:r>
+        <w:rPr>
+          <w:lang w:val="es-ES"/>
+        </w:rPr>
+        <w:t xml:space="preserve"> no va a poder sacar un beneficio significativo en performance. </w:t>
+      </w:r>
+    </w:p>
+    <w:p>
+      <w:pPr>
+        <w:rPr>
+          <w:lang w:val="es-ES"/>
+        </w:rPr>
+      </w:pPr>
     </w:p>
     <w:p>
       <w:pPr>
@@ -1098,7 +1486,7 @@
           <w:lang w:val="en-US"/>
         </w:rPr>
         <w:drawing>
-          <wp:inline distT="0" distB="0" distL="0" distR="0" wp14:anchorId="0E64E22A" wp14:editId="207DC6CA">
+          <wp:inline distT="0" distB="0" distL="0" distR="0" wp14:anchorId="0E64E22A" wp14:editId="05E18C18">
             <wp:extent cx="6945011" cy="2828925"/>
             <wp:effectExtent l="0" t="0" r="8255" b="0"/>
             <wp:docPr id="1603822710" name="Imagen 3"/>
@@ -1130,7 +1518,7 @@
                   <pic:spPr bwMode="auto">
                     <a:xfrm>
                       <a:off x="0" y="0"/>
-                      <a:ext cx="6949783" cy="2830869"/>
+                      <a:ext cx="6945011" cy="2828925"/>
                     </a:xfrm>
                     <a:prstGeom prst="rect">
                       <a:avLst/>
@@ -1182,21 +1570,42 @@
         <w:rPr>
           <w:lang w:val="es-ES"/>
         </w:rPr>
-        <w:t xml:space="preserve"> como SMOTE, Borderline-SMOTE y ADASYN pueden atribuirse, en gran medida, a la madurez de dichos métodos. </w:t>
-      </w:r>
-      <w:r>
-        <w:rPr>
-          <w:lang w:val="es-ES"/>
-        </w:rPr>
-        <w:t>En contraste, PCSMOTE parte conceptualmente de SMOTE, pero introduce criterios adicionales de riesgo, densidad y pureza que restringen la generación de instancias sintéticas a regiones consideradas informativas. En datasets que no presentan una estructura de vecindad local discriminativa, esta estrategia conduce naturalmente a la ausencia de mejoras, lo cual no debe interpretarse como una limitación del método, sino como una consecuencia directa de su diseño conservador.</w:t>
-      </w:r>
-    </w:p>
-    <w:p>
-      <w:pPr>
-        <w:rPr>
-          <w:lang w:val="es-ES"/>
-        </w:rPr>
-      </w:pPr>
+        <w:t xml:space="preserve"> como SMOTE, </w:t>
+      </w:r>
+      <w:proofErr w:type="spellStart"/>
+      <w:r>
+        <w:rPr>
+          <w:lang w:val="es-ES"/>
+        </w:rPr>
+        <w:t>Borderline</w:t>
+      </w:r>
+      <w:proofErr w:type="spellEnd"/>
+      <w:r>
+        <w:rPr>
+          <w:lang w:val="es-ES"/>
+        </w:rPr>
+        <w:t xml:space="preserve">-SMOTE y ADASYN pueden atribuirse, en gran medida, a la madurez de dichos métodos. </w:t>
+      </w:r>
+      <w:r>
+        <w:rPr>
+          <w:lang w:val="es-ES"/>
+        </w:rPr>
+        <w:t xml:space="preserve">En contraste, PCSMOTE parte conceptualmente de SMOTE, pero introduce criterios adicionales de riesgo, densidad y pureza que restringen la generación de instancias sintéticas a regiones consideradas informativas. En </w:t>
+      </w:r>
+      <w:proofErr w:type="spellStart"/>
+      <w:r>
+        <w:rPr>
+          <w:lang w:val="es-ES"/>
+        </w:rPr>
+        <w:t>datasets</w:t>
+      </w:r>
+      <w:proofErr w:type="spellEnd"/>
+      <w:r>
+        <w:rPr>
+          <w:lang w:val="es-ES"/>
+        </w:rPr>
+        <w:t xml:space="preserve"> que no presentan una estructura de vecindad local discriminativa, esta estrategia conduce naturalmente a la ausencia de mejoras, lo cual no debe interpretarse como una limitación del método, sino como una consecuencia directa de su diseño conservador.</w:t>
+      </w:r>
     </w:p>
     <w:p>
       <w:pPr>
@@ -1225,7 +1634,35 @@
         <w:rPr>
           <w:lang w:val="es-ES"/>
         </w:rPr>
-        <w:t>¿Porque pcsmote rinde tan mal en este dataset?</w:t>
+        <w:t xml:space="preserve">¿Porque </w:t>
+      </w:r>
+      <w:proofErr w:type="spellStart"/>
+      <w:r>
+        <w:rPr>
+          <w:lang w:val="es-ES"/>
+        </w:rPr>
+        <w:t>pcsmote</w:t>
+      </w:r>
+      <w:proofErr w:type="spellEnd"/>
+      <w:r>
+        <w:rPr>
+          <w:lang w:val="es-ES"/>
+        </w:rPr>
+        <w:t xml:space="preserve"> rinde tan mal en este </w:t>
+      </w:r>
+      <w:proofErr w:type="spellStart"/>
+      <w:r>
+        <w:rPr>
+          <w:lang w:val="es-ES"/>
+        </w:rPr>
+        <w:t>dataset</w:t>
+      </w:r>
+      <w:proofErr w:type="spellEnd"/>
+      <w:r>
+        <w:rPr>
+          <w:lang w:val="es-ES"/>
+        </w:rPr>
+        <w:t>?</w:t>
       </w:r>
       <w:r>
         <w:rPr>
@@ -1253,7 +1690,49 @@
         <w:rPr>
           <w:lang w:val="es-ES"/>
         </w:rPr>
-        <w:t>: “predict_faults no esta hecho para trabajar con vecinos, por eso pcsmote no funciona acá.”</w:t>
+        <w:t>: “</w:t>
+      </w:r>
+      <w:proofErr w:type="spellStart"/>
+      <w:r>
+        <w:rPr>
+          <w:lang w:val="es-ES"/>
+        </w:rPr>
+        <w:t>predict_faults</w:t>
+      </w:r>
+      <w:proofErr w:type="spellEnd"/>
+      <w:r>
+        <w:rPr>
+          <w:lang w:val="es-ES"/>
+        </w:rPr>
+        <w:t xml:space="preserve"> no </w:t>
+      </w:r>
+      <w:proofErr w:type="spellStart"/>
+      <w:r>
+        <w:rPr>
+          <w:lang w:val="es-ES"/>
+        </w:rPr>
+        <w:t>esta</w:t>
+      </w:r>
+      <w:proofErr w:type="spellEnd"/>
+      <w:r>
+        <w:rPr>
+          <w:lang w:val="es-ES"/>
+        </w:rPr>
+        <w:t xml:space="preserve"> hecho para trabajar con vecinos, por eso </w:t>
+      </w:r>
+      <w:proofErr w:type="spellStart"/>
+      <w:r>
+        <w:rPr>
+          <w:lang w:val="es-ES"/>
+        </w:rPr>
+        <w:t>pcsmote</w:t>
+      </w:r>
+      <w:proofErr w:type="spellEnd"/>
+      <w:r>
+        <w:rPr>
+          <w:lang w:val="es-ES"/>
+        </w:rPr>
+        <w:t xml:space="preserve"> no funciona acá.”</w:t>
       </w:r>
     </w:p>
     <w:p>
@@ -1281,13 +1760,19 @@
         <w:rPr>
           <w:lang w:val="es-ES"/>
         </w:rPr>
-        <w:t xml:space="preserve"> Como prueba adicional, se </w:t>
-      </w:r>
-      <w:r>
-        <w:rPr>
-          <w:lang w:val="es-ES"/>
-        </w:rPr>
-        <w:t>evaluó</w:t>
+        <w:t xml:space="preserve"> Como prueba adicional, </w:t>
+      </w:r>
+      <w:r>
+        <w:rPr>
+          <w:lang w:val="es-ES"/>
+        </w:rPr>
+        <w:t>evalu</w:t>
+      </w:r>
+      <w:r>
+        <w:rPr>
+          <w:lang w:val="es-ES"/>
+        </w:rPr>
+        <w:t>é</w:t>
       </w:r>
       <w:r>
         <w:rPr>
@@ -1305,7 +1790,35 @@
         <w:rPr>
           <w:lang w:val="es-ES"/>
         </w:rPr>
-        <w:t xml:space="preserve"> de un clasificador kNN sin aplicar técnicas de sobremuestreo, obteniéndose métricas notablemente bajas, lo cual refuerza la hipótesis de que el espacio de características no presenta una estructura de vecindad local adecuada. </w:t>
+        <w:t xml:space="preserve"> de un clasificador </w:t>
+      </w:r>
+      <w:proofErr w:type="spellStart"/>
+      <w:r>
+        <w:rPr>
+          <w:lang w:val="es-ES"/>
+        </w:rPr>
+        <w:t>kNN</w:t>
+      </w:r>
+      <w:proofErr w:type="spellEnd"/>
+      <w:r>
+        <w:rPr>
+          <w:lang w:val="es-ES"/>
+        </w:rPr>
+        <w:t xml:space="preserve"> sin aplicar técnicas de </w:t>
+      </w:r>
+      <w:proofErr w:type="spellStart"/>
+      <w:r>
+        <w:rPr>
+          <w:lang w:val="es-ES"/>
+        </w:rPr>
+        <w:t>sobremuestreo</w:t>
+      </w:r>
+      <w:proofErr w:type="spellEnd"/>
+      <w:r>
+        <w:rPr>
+          <w:lang w:val="es-ES"/>
+        </w:rPr>
+        <w:t xml:space="preserve">, obteniéndose métricas notablemente bajas, lo cual refuerza la hipótesis de que el espacio de características no presenta una estructura de vecindad local adecuada. </w:t>
       </w:r>
       <w:r>
         <w:rPr>
@@ -1327,13 +1840,13 @@
         </w:rPr>
         <w:lastRenderedPageBreak/>
         <w:drawing>
-          <wp:anchor distT="0" distB="0" distL="114300" distR="114300" simplePos="0" relativeHeight="251658240" behindDoc="0" locked="0" layoutInCell="1" allowOverlap="1" wp14:anchorId="4CB2F51E" wp14:editId="444F4440">
+          <wp:anchor distT="0" distB="0" distL="114300" distR="114300" simplePos="0" relativeHeight="251664384" behindDoc="0" locked="0" layoutInCell="1" allowOverlap="1" wp14:anchorId="281EC480" wp14:editId="7BEA0F83">
             <wp:simplePos x="0" y="0"/>
             <wp:positionH relativeFrom="margin">
-              <wp:align>right</wp:align>
+              <wp:posOffset>3081531</wp:posOffset>
             </wp:positionH>
             <wp:positionV relativeFrom="margin">
-              <wp:posOffset>30229</wp:posOffset>
+              <wp:posOffset>-63014</wp:posOffset>
             </wp:positionV>
             <wp:extent cx="3444240" cy="3444240"/>
             <wp:effectExtent l="19050" t="19050" r="22860" b="22860"/>
@@ -1392,7 +1905,21 @@
         <w:rPr>
           <w:lang w:val="es-ES"/>
         </w:rPr>
-        <w:t>El radar muestra que, a pesar de una consistencia vecinal elevada, el margen local es cercano a 1, indicando ausencia de separación geométrica. Esto explica el bajo desempeño del clasificador kNN y, en con</w:t>
+        <w:t xml:space="preserve">El radar muestra que, a pesar de una consistencia vecinal elevada, el margen local es cercano a 1, indicando ausencia de separación geométrica. Esto explica el bajo desempeño del clasificador </w:t>
+      </w:r>
+      <w:proofErr w:type="spellStart"/>
+      <w:r>
+        <w:rPr>
+          <w:lang w:val="es-ES"/>
+        </w:rPr>
+        <w:t>kNN</w:t>
+      </w:r>
+      <w:proofErr w:type="spellEnd"/>
+      <w:r>
+        <w:rPr>
+          <w:lang w:val="es-ES"/>
+        </w:rPr>
+        <w:t xml:space="preserve"> y, en con</w:t>
       </w:r>
       <w:r>
         <w:rPr>
@@ -1414,6 +1941,61 @@
         </w:rPr>
         <w:t>Esto indica que la vecindad local es consistente pero no discriminativa, ya que las instancias tienden a agruparse de forma homogénea sin reflejar una separación clara entre clases.</w:t>
       </w:r>
+      <w:r>
+        <w:rPr>
+          <w:noProof/>
+          <w:lang w:val="en-US"/>
+        </w:rPr>
+        <w:t xml:space="preserve"> </w:t>
+      </w:r>
+    </w:p>
+    <w:p>
+      <w:pPr>
+        <w:jc w:val="both"/>
+        <w:rPr>
+          <w:lang w:val="es-ES"/>
+        </w:rPr>
+      </w:pPr>
+    </w:p>
+    <w:p>
+      <w:pPr>
+        <w:jc w:val="both"/>
+        <w:rPr>
+          <w:lang w:val="es-ES"/>
+        </w:rPr>
+      </w:pPr>
+    </w:p>
+    <w:p>
+      <w:pPr>
+        <w:jc w:val="both"/>
+        <w:rPr>
+          <w:lang w:val="es-ES"/>
+        </w:rPr>
+      </w:pPr>
+    </w:p>
+    <w:p>
+      <w:pPr>
+        <w:jc w:val="both"/>
+        <w:rPr>
+          <w:lang w:val="es-ES"/>
+        </w:rPr>
+      </w:pPr>
+    </w:p>
+    <w:p>
+      <w:pPr>
+        <w:jc w:val="both"/>
+        <w:rPr>
+          <w:lang w:val="es-ES"/>
+        </w:rPr>
+      </w:pPr>
+    </w:p>
+    <w:p>
+      <w:pPr>
+        <w:jc w:val="both"/>
+        <w:rPr>
+          <w:lang w:val="es-ES"/>
+        </w:rPr>
+      </w:pPr>
     </w:p>
     <w:tbl>
       <w:tblPr>
@@ -1422,7 +2004,7 @@
         <w:tblLook w:val="04A0" w:firstRow="1" w:lastRow="0" w:firstColumn="1" w:lastColumn="0" w:noHBand="0" w:noVBand="1"/>
       </w:tblPr>
       <w:tblGrid>
-        <w:gridCol w:w="10790"/>
+        <w:gridCol w:w="10456"/>
       </w:tblGrid>
       <w:tr>
         <w:tc>
@@ -1444,6 +2026,245 @@
           </w:p>
         </w:tc>
       </w:tr>
+      <w:tr>
+        <w:tc>
+          <w:tcPr>
+            <w:tcW w:w="5000" w:type="pct"/>
+          </w:tcPr>
+          <w:p>
+            <w:pPr>
+              <w:pStyle w:val="Prrafodelista"/>
+              <w:numPr>
+                <w:ilvl w:val="0"/>
+                <w:numId w:val="1"/>
+              </w:numPr>
+            </w:pPr>
+            <w:r>
+              <w:t xml:space="preserve"> Valores únicos del </w:t>
+            </w:r>
+            <w:proofErr w:type="gramStart"/>
+            <w:r>
+              <w:t>target</w:t>
+            </w:r>
+            <w:proofErr w:type="gramEnd"/>
+            <w:r>
+              <w:t>: ['</w:t>
+            </w:r>
+            <w:proofErr w:type="spellStart"/>
+            <w:r>
+              <w:t>cp</w:t>
+            </w:r>
+            <w:proofErr w:type="spellEnd"/>
+            <w:r>
+              <w:t>', '</w:t>
+            </w:r>
+            <w:proofErr w:type="spellStart"/>
+            <w:r>
+              <w:t>im</w:t>
+            </w:r>
+            <w:proofErr w:type="spellEnd"/>
+            <w:r>
+              <w:t>', '</w:t>
+            </w:r>
+            <w:proofErr w:type="spellStart"/>
+            <w:r>
+              <w:t>pp</w:t>
+            </w:r>
+            <w:proofErr w:type="spellEnd"/>
+            <w:r>
+              <w:t>', '</w:t>
+            </w:r>
+            <w:proofErr w:type="spellStart"/>
+            <w:r>
+              <w:t>imU</w:t>
+            </w:r>
+            <w:proofErr w:type="spellEnd"/>
+            <w:r>
+              <w:t>', '</w:t>
+            </w:r>
+            <w:proofErr w:type="spellStart"/>
+            <w:r>
+              <w:t>om</w:t>
+            </w:r>
+            <w:proofErr w:type="spellEnd"/>
+            <w:r>
+              <w:t>', '</w:t>
+            </w:r>
+            <w:proofErr w:type="spellStart"/>
+            <w:r>
+              <w:t>omL</w:t>
+            </w:r>
+            <w:proofErr w:type="spellEnd"/>
+            <w:r>
+              <w:t>', '</w:t>
+            </w:r>
+            <w:proofErr w:type="spellStart"/>
+            <w:r>
+              <w:t>imS</w:t>
+            </w:r>
+            <w:proofErr w:type="spellEnd"/>
+            <w:r>
+              <w:t>', '</w:t>
+            </w:r>
+            <w:proofErr w:type="spellStart"/>
+            <w:r>
+              <w:t>imL</w:t>
+            </w:r>
+            <w:proofErr w:type="spellEnd"/>
+            <w:r>
+              <w:t>']</w:t>
+            </w:r>
+          </w:p>
+          <w:p>
+            <w:pPr>
+              <w:pStyle w:val="Prrafodelista"/>
+              <w:numPr>
+                <w:ilvl w:val="0"/>
+                <w:numId w:val="1"/>
+              </w:numPr>
+            </w:pPr>
+            <w:r>
+              <w:t>Distribución de clases:</w:t>
+            </w:r>
+          </w:p>
+          <w:p>
+            <w:pPr>
+              <w:pStyle w:val="Prrafodelista"/>
+              <w:numPr>
+                <w:ilvl w:val="1"/>
+                <w:numId w:val="1"/>
+              </w:numPr>
+            </w:pPr>
+            <w:proofErr w:type="spellStart"/>
+            <w:r>
+              <w:t>cp</w:t>
+            </w:r>
+            <w:proofErr w:type="spellEnd"/>
+            <w:r>
+              <w:t>: 143 (42.56%)</w:t>
+            </w:r>
+          </w:p>
+          <w:p>
+            <w:pPr>
+              <w:pStyle w:val="Prrafodelista"/>
+              <w:numPr>
+                <w:ilvl w:val="1"/>
+                <w:numId w:val="1"/>
+              </w:numPr>
+            </w:pPr>
+            <w:proofErr w:type="spellStart"/>
+            <w:r>
+              <w:t>im</w:t>
+            </w:r>
+            <w:proofErr w:type="spellEnd"/>
+            <w:r>
+              <w:t>: 77 (22.92%)</w:t>
+            </w:r>
+          </w:p>
+          <w:p>
+            <w:pPr>
+              <w:pStyle w:val="Prrafodelista"/>
+              <w:numPr>
+                <w:ilvl w:val="1"/>
+                <w:numId w:val="1"/>
+              </w:numPr>
+            </w:pPr>
+            <w:proofErr w:type="spellStart"/>
+            <w:r>
+              <w:t>pp</w:t>
+            </w:r>
+            <w:proofErr w:type="spellEnd"/>
+            <w:r>
+              <w:t>: 52 (15.48%)</w:t>
+            </w:r>
+          </w:p>
+          <w:p>
+            <w:pPr>
+              <w:pStyle w:val="Prrafodelista"/>
+              <w:numPr>
+                <w:ilvl w:val="1"/>
+                <w:numId w:val="1"/>
+              </w:numPr>
+            </w:pPr>
+            <w:proofErr w:type="spellStart"/>
+            <w:r>
+              <w:t>imU</w:t>
+            </w:r>
+            <w:proofErr w:type="spellEnd"/>
+            <w:r>
+              <w:t>: 35 (10.42%)</w:t>
+            </w:r>
+          </w:p>
+          <w:p>
+            <w:pPr>
+              <w:pStyle w:val="Prrafodelista"/>
+              <w:numPr>
+                <w:ilvl w:val="1"/>
+                <w:numId w:val="1"/>
+              </w:numPr>
+            </w:pPr>
+            <w:proofErr w:type="spellStart"/>
+            <w:r>
+              <w:t>om</w:t>
+            </w:r>
+            <w:proofErr w:type="spellEnd"/>
+            <w:r>
+              <w:t>: 20 (5.95%)</w:t>
+            </w:r>
+          </w:p>
+          <w:p>
+            <w:pPr>
+              <w:pStyle w:val="Prrafodelista"/>
+              <w:numPr>
+                <w:ilvl w:val="1"/>
+                <w:numId w:val="1"/>
+              </w:numPr>
+            </w:pPr>
+            <w:proofErr w:type="spellStart"/>
+            <w:r>
+              <w:t>omL</w:t>
+            </w:r>
+            <w:proofErr w:type="spellEnd"/>
+            <w:r>
+              <w:t>: 5 (1.49%)</w:t>
+            </w:r>
+          </w:p>
+          <w:p>
+            <w:pPr>
+              <w:pStyle w:val="Prrafodelista"/>
+              <w:numPr>
+                <w:ilvl w:val="1"/>
+                <w:numId w:val="1"/>
+              </w:numPr>
+            </w:pPr>
+            <w:proofErr w:type="spellStart"/>
+            <w:r>
+              <w:t>imS</w:t>
+            </w:r>
+            <w:proofErr w:type="spellEnd"/>
+            <w:r>
+              <w:t>: 2 (0.6%)</w:t>
+            </w:r>
+          </w:p>
+          <w:p>
+            <w:pPr>
+              <w:pStyle w:val="Prrafodelista"/>
+              <w:numPr>
+                <w:ilvl w:val="1"/>
+                <w:numId w:val="1"/>
+              </w:numPr>
+            </w:pPr>
+            <w:proofErr w:type="spellStart"/>
+            <w:r>
+              <w:t>imL</w:t>
+            </w:r>
+            <w:proofErr w:type="spellEnd"/>
+            <w:r>
+              <w:t>: 2 (0.6%)</w:t>
+            </w:r>
+          </w:p>
+        </w:tc>
+      </w:tr>
     </w:tbl>
     <w:p>
       <w:pPr>
@@ -1454,6 +2275,7 @@
     </w:p>
     <w:p>
       <w:pPr>
+        <w:jc w:val="both"/>
         <w:rPr>
           <w:lang w:val="es-ES"/>
         </w:rPr>
@@ -1474,7 +2296,35 @@
         <w:rPr>
           <w:lang w:val="es-ES"/>
         </w:rPr>
-        <w:t xml:space="preserve"> muestras sintéticas, mientras que el resto de las semillas contribuyen de manera marginal. Esta concentración incrementa la sensibilidad del proceso de sobremuestreo al muestreo de los folds, explicando la mayor varianza observada en validación cruzada respecto del desempeño en el conjunto de prueba.</w:t>
+        <w:t xml:space="preserve"> muestras sintéticas, mientras que el resto de las semillas contribuyen de manera marginal. Esta concentración incrementa la sensibilidad del proceso de </w:t>
+      </w:r>
+      <w:proofErr w:type="spellStart"/>
+      <w:r>
+        <w:rPr>
+          <w:lang w:val="es-ES"/>
+        </w:rPr>
+        <w:t>sobremuestreo</w:t>
+      </w:r>
+      <w:proofErr w:type="spellEnd"/>
+      <w:r>
+        <w:rPr>
+          <w:lang w:val="es-ES"/>
+        </w:rPr>
+        <w:t xml:space="preserve"> al muestreo de los </w:t>
+      </w:r>
+      <w:proofErr w:type="spellStart"/>
+      <w:r>
+        <w:rPr>
+          <w:lang w:val="es-ES"/>
+        </w:rPr>
+        <w:t>folds</w:t>
+      </w:r>
+      <w:proofErr w:type="spellEnd"/>
+      <w:r>
+        <w:rPr>
+          <w:lang w:val="es-ES"/>
+        </w:rPr>
+        <w:t>, explicando la mayor varianza observada en validación cruzada respecto del desempeño en el conjunto de prueba.</w:t>
       </w:r>
     </w:p>
     <w:p>
@@ -1489,6 +2339,7 @@
         <w:rPr>
           <w:noProof/>
         </w:rPr>
+        <w:lastRenderedPageBreak/>
         <w:drawing>
           <wp:inline distT="0" distB="0" distL="0" distR="0" wp14:anchorId="521C330A" wp14:editId="16E335CB">
             <wp:extent cx="6858000" cy="4023360"/>
@@ -1567,7 +2418,9 @@
         </w:rPr>
       </w:pPr>
       <w:r>
-        <w:lastRenderedPageBreak/>
+        <w:rPr>
+          <w:noProof/>
+        </w:rPr>
         <w:drawing>
           <wp:inline distT="0" distB="0" distL="0" distR="0" wp14:anchorId="5BA7D328" wp14:editId="229F8B44">
             <wp:extent cx="6858000" cy="1551940"/>
@@ -1632,7 +2485,7 @@
         <w:tblLook w:val="04A0" w:firstRow="1" w:lastRow="0" w:firstColumn="1" w:lastColumn="0" w:noHBand="0" w:noVBand="1"/>
       </w:tblPr>
       <w:tblGrid>
-        <w:gridCol w:w="10790"/>
+        <w:gridCol w:w="10456"/>
       </w:tblGrid>
       <w:tr>
         <w:tc>
@@ -1654,6 +2507,103 @@
           </w:p>
         </w:tc>
       </w:tr>
+      <w:tr>
+        <w:tc>
+          <w:tcPr>
+            <w:tcW w:w="5000" w:type="pct"/>
+          </w:tcPr>
+          <w:p>
+            <w:pPr>
+              <w:pStyle w:val="Prrafodelista"/>
+              <w:numPr>
+                <w:ilvl w:val="0"/>
+                <w:numId w:val="1"/>
+              </w:numPr>
+            </w:pPr>
+            <w:r>
+              <w:t xml:space="preserve">Valores únicos del </w:t>
+            </w:r>
+            <w:proofErr w:type="gramStart"/>
+            <w:r>
+              <w:t>target</w:t>
+            </w:r>
+            <w:proofErr w:type="gramEnd"/>
+            <w:r>
+              <w:t>: ['no-</w:t>
+            </w:r>
+            <w:proofErr w:type="spellStart"/>
+            <w:r>
+              <w:t>churn</w:t>
+            </w:r>
+            <w:proofErr w:type="spellEnd"/>
+            <w:r>
+              <w:t>', '</w:t>
+            </w:r>
+            <w:proofErr w:type="spellStart"/>
+            <w:r>
+              <w:t>churn</w:t>
+            </w:r>
+            <w:proofErr w:type="spellEnd"/>
+            <w:r>
+              <w:t>']</w:t>
+            </w:r>
+          </w:p>
+          <w:p>
+            <w:pPr>
+              <w:pStyle w:val="Prrafodelista"/>
+              <w:numPr>
+                <w:ilvl w:val="0"/>
+                <w:numId w:val="1"/>
+              </w:numPr>
+            </w:pPr>
+            <w:r>
+              <w:t xml:space="preserve">Distribución de </w:t>
+            </w:r>
+            <w:proofErr w:type="spellStart"/>
+            <w:r>
+              <w:t>clases:</w:t>
+            </w:r>
+            <w:proofErr w:type="spellEnd"/>
+          </w:p>
+          <w:p>
+            <w:pPr>
+              <w:pStyle w:val="Prrafodelista"/>
+              <w:numPr>
+                <w:ilvl w:val="1"/>
+                <w:numId w:val="1"/>
+              </w:numPr>
+            </w:pPr>
+            <w:r>
+              <w:t>no-</w:t>
+            </w:r>
+            <w:proofErr w:type="spellStart"/>
+            <w:r>
+              <w:t>churn</w:t>
+            </w:r>
+            <w:proofErr w:type="spellEnd"/>
+            <w:r>
+              <w:t>: 5174 (73.46%)</w:t>
+            </w:r>
+          </w:p>
+          <w:p>
+            <w:pPr>
+              <w:pStyle w:val="Prrafodelista"/>
+              <w:numPr>
+                <w:ilvl w:val="1"/>
+                <w:numId w:val="1"/>
+              </w:numPr>
+            </w:pPr>
+            <w:proofErr w:type="spellStart"/>
+            <w:r>
+              <w:t>churn</w:t>
+            </w:r>
+            <w:proofErr w:type="spellEnd"/>
+            <w:r>
+              <w:t>: 1869 (26.54%)</w:t>
+            </w:r>
+          </w:p>
+        </w:tc>
+      </w:tr>
     </w:tbl>
     <w:p>
       <w:pPr>
@@ -1674,6 +2624,7 @@
         <w:rPr>
           <w:noProof/>
         </w:rPr>
+        <w:lastRenderedPageBreak/>
         <w:drawing>
           <wp:inline distT="0" distB="0" distL="0" distR="0" wp14:anchorId="3E7C1CAD" wp14:editId="7AA45661">
             <wp:extent cx="6858000" cy="4023360"/>
@@ -1726,6 +2677,7 @@
     </w:p>
     <w:p>
       <w:pPr>
+        <w:jc w:val="both"/>
         <w:rPr>
           <w:lang w:val="es-ES"/>
         </w:rPr>
@@ -1742,17 +2694,33 @@
         <w:rPr>
           <w:lang w:val="es-ES"/>
         </w:rPr>
-        <w:t>: se puede observar que aumentando el percentil radio distancia permitió pasar mas semillas validas haciendo una diferencia en el f1_macro</w:t>
-      </w:r>
-    </w:p>
-    <w:p>
-      <w:pPr>
-        <w:rPr>
-          <w:lang w:val="es-ES"/>
-        </w:rPr>
-      </w:pPr>
-      <w:r>
-        <w:lastRenderedPageBreak/>
+        <w:t xml:space="preserve">: se puede observar que aumentando el percentil radio distancia permitió pasar </w:t>
+      </w:r>
+      <w:proofErr w:type="spellStart"/>
+      <w:r>
+        <w:rPr>
+          <w:lang w:val="es-ES"/>
+        </w:rPr>
+        <w:t>mas</w:t>
+      </w:r>
+      <w:proofErr w:type="spellEnd"/>
+      <w:r>
+        <w:rPr>
+          <w:lang w:val="es-ES"/>
+        </w:rPr>
+        <w:t xml:space="preserve"> semillas validas haciendo una diferencia en el f1_macro</w:t>
+      </w:r>
+    </w:p>
+    <w:p>
+      <w:pPr>
+        <w:rPr>
+          <w:lang w:val="es-ES"/>
+        </w:rPr>
+      </w:pPr>
+      <w:r>
+        <w:rPr>
+          <w:noProof/>
+        </w:rPr>
         <w:drawing>
           <wp:inline distT="0" distB="0" distL="0" distR="0" wp14:anchorId="5AFFAF71" wp14:editId="26D977D9">
             <wp:extent cx="6858000" cy="2449195"/>
@@ -1817,7 +2785,7 @@
         <w:tblLook w:val="04A0" w:firstRow="1" w:lastRow="0" w:firstColumn="1" w:lastColumn="0" w:noHBand="0" w:noVBand="1"/>
       </w:tblPr>
       <w:tblGrid>
-        <w:gridCol w:w="10790"/>
+        <w:gridCol w:w="10456"/>
       </w:tblGrid>
       <w:tr>
         <w:tc>
@@ -1839,6 +2807,72 @@
           </w:p>
         </w:tc>
       </w:tr>
+      <w:tr>
+        <w:tc>
+          <w:tcPr>
+            <w:tcW w:w="10790" w:type="dxa"/>
+          </w:tcPr>
+          <w:p>
+            <w:pPr>
+              <w:pStyle w:val="Prrafodelista"/>
+              <w:numPr>
+                <w:ilvl w:val="0"/>
+                <w:numId w:val="2"/>
+              </w:numPr>
+            </w:pPr>
+            <w:r>
+              <w:t xml:space="preserve">Valores únicos del </w:t>
+            </w:r>
+            <w:proofErr w:type="gramStart"/>
+            <w:r>
+              <w:t>target</w:t>
+            </w:r>
+            <w:proofErr w:type="gramEnd"/>
+            <w:r>
+              <w:t>: [-1, 1]</w:t>
+            </w:r>
+          </w:p>
+          <w:p>
+            <w:pPr>
+              <w:pStyle w:val="Prrafodelista"/>
+              <w:numPr>
+                <w:ilvl w:val="0"/>
+                <w:numId w:val="2"/>
+              </w:numPr>
+            </w:pPr>
+            <w:r>
+              <w:t>Distribución de clases:</w:t>
+            </w:r>
+          </w:p>
+          <w:p>
+            <w:pPr>
+              <w:pStyle w:val="Prrafodelista"/>
+              <w:numPr>
+                <w:ilvl w:val="1"/>
+                <w:numId w:val="2"/>
+              </w:numPr>
+            </w:pPr>
+            <w:r>
+              <w:t>-1: 1844 (92.48%)</w:t>
+            </w:r>
+          </w:p>
+          <w:p>
+            <w:pPr>
+              <w:pStyle w:val="Prrafodelista"/>
+              <w:numPr>
+                <w:ilvl w:val="1"/>
+                <w:numId w:val="2"/>
+              </w:numPr>
+              <w:rPr>
+                <w:lang w:val="es-ES"/>
+              </w:rPr>
+            </w:pPr>
+            <w:r>
+              <w:t>1: 150 (7.52%)</w:t>
+            </w:r>
+          </w:p>
+        </w:tc>
+      </w:tr>
     </w:tbl>
     <w:p>
       <w:pPr>
@@ -1858,6 +2892,7 @@
         <w:rPr>
           <w:noProof/>
         </w:rPr>
+        <w:lastRenderedPageBreak/>
         <w:drawing>
           <wp:inline distT="0" distB="0" distL="0" distR="0" wp14:anchorId="328DAAD4" wp14:editId="339B5A1E">
             <wp:extent cx="6858000" cy="4136390"/>
@@ -1910,6 +2945,7 @@
     </w:p>
     <w:p>
       <w:pPr>
+        <w:jc w:val="both"/>
         <w:rPr>
           <w:lang w:val="es-ES"/>
         </w:rPr>
@@ -1934,6 +2970,7 @@
         </w:rPr>
         <w:t xml:space="preserve"> se pueden observar saltos en una reducción del </w:t>
       </w:r>
+      <w:proofErr w:type="spellStart"/>
       <w:r>
         <w:rPr>
           <w:i/>
@@ -1942,12 +2979,14 @@
         </w:rPr>
         <w:t>percentil_radio_distancia</w:t>
       </w:r>
+      <w:proofErr w:type="spellEnd"/>
       <w:r>
         <w:rPr>
           <w:lang w:val="es-ES"/>
         </w:rPr>
         <w:t xml:space="preserve"> y un aumento en el </w:t>
       </w:r>
+      <w:proofErr w:type="spellStart"/>
       <w:r>
         <w:rPr>
           <w:i/>
@@ -1956,6 +2995,7 @@
         </w:rPr>
         <w:t>umbral_densidad</w:t>
       </w:r>
+      <w:proofErr w:type="spellEnd"/>
       <w:r>
         <w:rPr>
           <w:i/>
@@ -1978,7 +3018,9 @@
         </w:rPr>
       </w:pPr>
       <w:r>
-        <w:lastRenderedPageBreak/>
+        <w:rPr>
+          <w:noProof/>
+        </w:rPr>
         <w:drawing>
           <wp:inline distT="0" distB="0" distL="0" distR="0" wp14:anchorId="0841F3B1" wp14:editId="79492AFB">
             <wp:extent cx="6858000" cy="2191385"/>
@@ -2043,7 +3085,7 @@
         <w:tblLook w:val="04A0" w:firstRow="1" w:lastRow="0" w:firstColumn="1" w:lastColumn="0" w:noHBand="0" w:noVBand="1"/>
       </w:tblPr>
       <w:tblGrid>
-        <w:gridCol w:w="10790"/>
+        <w:gridCol w:w="10456"/>
       </w:tblGrid>
       <w:tr>
         <w:tc>
@@ -2065,6 +3107,69 @@
           </w:p>
         </w:tc>
       </w:tr>
+      <w:tr>
+        <w:tc>
+          <w:tcPr>
+            <w:tcW w:w="10790" w:type="dxa"/>
+          </w:tcPr>
+          <w:p>
+            <w:pPr>
+              <w:pStyle w:val="Prrafodelista"/>
+              <w:numPr>
+                <w:ilvl w:val="0"/>
+                <w:numId w:val="2"/>
+              </w:numPr>
+            </w:pPr>
+            <w:r>
+              <w:t xml:space="preserve">Valores únicos del </w:t>
+            </w:r>
+            <w:proofErr w:type="gramStart"/>
+            <w:r>
+              <w:t>target</w:t>
+            </w:r>
+            <w:proofErr w:type="gramEnd"/>
+            <w:r>
+              <w:t>: ['B', 'M']</w:t>
+            </w:r>
+          </w:p>
+          <w:p>
+            <w:pPr>
+              <w:pStyle w:val="Prrafodelista"/>
+              <w:numPr>
+                <w:ilvl w:val="0"/>
+                <w:numId w:val="2"/>
+              </w:numPr>
+            </w:pPr>
+            <w:r>
+              <w:t>Distribución de clases:</w:t>
+            </w:r>
+          </w:p>
+          <w:p>
+            <w:pPr>
+              <w:pStyle w:val="Prrafodelista"/>
+              <w:numPr>
+                <w:ilvl w:val="1"/>
+                <w:numId w:val="2"/>
+              </w:numPr>
+            </w:pPr>
+            <w:r>
+              <w:t>B: 357 (62.74%)</w:t>
+            </w:r>
+          </w:p>
+          <w:p>
+            <w:pPr>
+              <w:pStyle w:val="Prrafodelista"/>
+              <w:numPr>
+                <w:ilvl w:val="1"/>
+                <w:numId w:val="2"/>
+              </w:numPr>
+            </w:pPr>
+            <w:r>
+              <w:t>M: 212 (37.26%)</w:t>
+            </w:r>
+          </w:p>
+        </w:tc>
+      </w:tr>
     </w:tbl>
     <w:p>
       <w:pPr>
@@ -2085,6 +3190,7 @@
         <w:rPr>
           <w:noProof/>
         </w:rPr>
+        <w:lastRenderedPageBreak/>
         <w:drawing>
           <wp:inline distT="0" distB="0" distL="0" distR="0" wp14:anchorId="369A2014" wp14:editId="037DE973">
             <wp:extent cx="6858000" cy="4023360"/>
@@ -2136,6 +3242,9 @@
       </w:r>
     </w:p>
     <w:p>
+      <w:pPr>
+        <w:jc w:val="both"/>
+      </w:pPr>
       <w:r>
         <w:rPr>
           <w:b/>
@@ -2145,15 +3254,29 @@
         <w:t>Análisis en performance:</w:t>
       </w:r>
       <w:r>
-        <w:t xml:space="preserve"> se puede observar un salto en performance donde se redujo el porcentaje en el umbral de densidad, lo cual permitió captar 5 semillas candidatas, si bien no genero mas sintéticos, se redistribuyeron mejor la generación de sintéticos permitiendo generar esa mejora marginal en el rendimiento del clasificador. </w:t>
-      </w:r>
-    </w:p>
-    <w:p>
+        <w:t xml:space="preserve"> se puede observar un salto en performance donde se redujo el porcentaje en el umbral de densidad, lo cual permitió captar 5 semillas candidatas, si bien no genero </w:t>
+      </w:r>
+      <w:proofErr w:type="spellStart"/>
+      <w:r>
+        <w:t>mas</w:t>
+      </w:r>
+      <w:proofErr w:type="spellEnd"/>
+      <w:r>
+        <w:t xml:space="preserve"> sintéticos, se redistribuyeron mejor la generación de sintéticos permitiendo generar esa mejora marginal en el rendimiento del clasificador. </w:t>
+      </w:r>
+    </w:p>
+    <w:p>
+      <w:pPr>
+        <w:jc w:val="both"/>
+      </w:pPr>
       <w:r>
         <w:t xml:space="preserve">Se puede observar también que, acá gano en performance ADASYN. </w:t>
       </w:r>
     </w:p>
     <w:p>
+      <w:pPr>
+        <w:jc w:val="both"/>
+      </w:pPr>
       <w:r>
         <w:t>Es de destacar que otras configuraciones de PCSMOTE también tienen pequeños saltos de mejora en la generalización, lo cual da una noci</w:t>
       </w:r>
@@ -2161,7 +3284,15 @@
         <w:t>ó</w:t>
       </w:r>
       <w:r>
-        <w:t xml:space="preserve">n de que la técnica tiene mas de una manera de </w:t>
+        <w:t xml:space="preserve">n de que la técnica tiene </w:t>
+      </w:r>
+      <w:proofErr w:type="spellStart"/>
+      <w:r>
+        <w:t>mas</w:t>
+      </w:r>
+      <w:proofErr w:type="spellEnd"/>
+      <w:r>
+        <w:t xml:space="preserve"> de una manera de </w:t>
       </w:r>
       <w:r>
         <w:t xml:space="preserve">trabajar y no solo una mejora aleatoria. </w:t>
@@ -2169,12 +3300,19 @@
     </w:p>
     <w:p>
       <w:pPr>
-        <w:rPr>
-          <w:lang w:val="es-ES"/>
-        </w:rPr>
-      </w:pPr>
-      <w:r>
-        <w:lastRenderedPageBreak/>
+        <w:jc w:val="both"/>
+      </w:pPr>
+    </w:p>
+    <w:p>
+      <w:pPr>
+        <w:rPr>
+          <w:lang w:val="es-ES"/>
+        </w:rPr>
+      </w:pPr>
+      <w:r>
+        <w:rPr>
+          <w:noProof/>
+        </w:rPr>
         <w:drawing>
           <wp:inline distT="0" distB="0" distL="0" distR="0" wp14:anchorId="3D14ED5C" wp14:editId="18E3068B">
             <wp:extent cx="6858000" cy="2191385"/>
@@ -2232,6 +3370,41 @@
         </w:rPr>
       </w:pPr>
     </w:p>
+    <w:p>
+      <w:pPr>
+        <w:rPr>
+          <w:lang w:val="es-ES"/>
+        </w:rPr>
+      </w:pPr>
+    </w:p>
+    <w:p>
+      <w:pPr>
+        <w:rPr>
+          <w:lang w:val="es-ES"/>
+        </w:rPr>
+      </w:pPr>
+    </w:p>
+    <w:p>
+      <w:pPr>
+        <w:rPr>
+          <w:lang w:val="es-ES"/>
+        </w:rPr>
+      </w:pPr>
+    </w:p>
+    <w:p>
+      <w:pPr>
+        <w:rPr>
+          <w:lang w:val="es-ES"/>
+        </w:rPr>
+      </w:pPr>
+    </w:p>
+    <w:p>
+      <w:pPr>
+        <w:rPr>
+          <w:lang w:val="es-ES"/>
+        </w:rPr>
+      </w:pPr>
+    </w:p>
     <w:tbl>
       <w:tblPr>
         <w:tblStyle w:val="Tablaconcuadrcula"/>
@@ -2239,7 +3412,7 @@
         <w:tblLook w:val="04A0" w:firstRow="1" w:lastRow="0" w:firstColumn="1" w:lastColumn="0" w:noHBand="0" w:noVBand="1"/>
       </w:tblPr>
       <w:tblGrid>
-        <w:gridCol w:w="10790"/>
+        <w:gridCol w:w="10456"/>
       </w:tblGrid>
       <w:tr>
         <w:tc>
@@ -2256,7 +3429,107 @@
               <w:rPr>
                 <w:lang w:val="es-ES"/>
               </w:rPr>
+              <w:lastRenderedPageBreak/>
               <w:t>HEART</w:t>
+            </w:r>
+          </w:p>
+        </w:tc>
+      </w:tr>
+      <w:tr>
+        <w:tc>
+          <w:tcPr>
+            <w:tcW w:w="10790" w:type="dxa"/>
+          </w:tcPr>
+          <w:p>
+            <w:pPr>
+              <w:pStyle w:val="Prrafodelista"/>
+              <w:numPr>
+                <w:ilvl w:val="0"/>
+                <w:numId w:val="3"/>
+              </w:numPr>
+            </w:pPr>
+            <w:r>
+              <w:t xml:space="preserve">Valores únicos del </w:t>
+            </w:r>
+            <w:proofErr w:type="gramStart"/>
+            <w:r>
+              <w:t>target</w:t>
+            </w:r>
+            <w:proofErr w:type="gramEnd"/>
+            <w:r>
+              <w:t>: [0, 1, 2, 3, 4]</w:t>
+            </w:r>
+          </w:p>
+          <w:p>
+            <w:pPr>
+              <w:pStyle w:val="Prrafodelista"/>
+              <w:numPr>
+                <w:ilvl w:val="0"/>
+                <w:numId w:val="3"/>
+              </w:numPr>
+            </w:pPr>
+            <w:r>
+              <w:t>Distribución de clases:</w:t>
+            </w:r>
+          </w:p>
+          <w:p>
+            <w:pPr>
+              <w:pStyle w:val="Prrafodelista"/>
+              <w:numPr>
+                <w:ilvl w:val="1"/>
+                <w:numId w:val="3"/>
+              </w:numPr>
+            </w:pPr>
+            <w:r>
+              <w:t>0: 164 (54.13%)</w:t>
+            </w:r>
+          </w:p>
+          <w:p>
+            <w:pPr>
+              <w:pStyle w:val="Prrafodelista"/>
+              <w:numPr>
+                <w:ilvl w:val="1"/>
+                <w:numId w:val="3"/>
+              </w:numPr>
+            </w:pPr>
+            <w:r>
+              <w:t>1: 55 (18.15%)</w:t>
+            </w:r>
+          </w:p>
+          <w:p>
+            <w:pPr>
+              <w:pStyle w:val="Prrafodelista"/>
+              <w:numPr>
+                <w:ilvl w:val="1"/>
+                <w:numId w:val="3"/>
+              </w:numPr>
+            </w:pPr>
+            <w:r>
+              <w:t>2: 36 (11.88%)</w:t>
+            </w:r>
+          </w:p>
+          <w:p>
+            <w:pPr>
+              <w:pStyle w:val="Prrafodelista"/>
+              <w:numPr>
+                <w:ilvl w:val="1"/>
+                <w:numId w:val="3"/>
+              </w:numPr>
+            </w:pPr>
+            <w:r>
+              <w:t>3: 35 (11.55%)</w:t>
+            </w:r>
+          </w:p>
+          <w:p>
+            <w:pPr>
+              <w:pStyle w:val="Prrafodelista"/>
+              <w:numPr>
+                <w:ilvl w:val="1"/>
+                <w:numId w:val="3"/>
+              </w:numPr>
+            </w:pPr>
+            <w:r>
+              <w:t>4: 13 (4.29%)</w:t>
             </w:r>
           </w:p>
         </w:tc>
@@ -2333,6 +3606,7 @@
     </w:p>
     <w:p>
       <w:pPr>
+        <w:jc w:val="both"/>
         <w:rPr>
           <w:lang w:val="es-ES"/>
         </w:rPr>
@@ -2351,6 +3625,7 @@
         </w:rPr>
         <w:t xml:space="preserve"> este junto con </w:t>
       </w:r>
+      <w:proofErr w:type="spellStart"/>
       <w:r>
         <w:rPr>
           <w:i/>
@@ -2359,6 +3634,7 @@
         </w:rPr>
         <w:t>predict_fault</w:t>
       </w:r>
+      <w:proofErr w:type="spellEnd"/>
       <w:r>
         <w:rPr>
           <w:i/>
@@ -2371,24 +3647,82 @@
         <w:rPr>
           <w:lang w:val="es-ES"/>
         </w:rPr>
-        <w:t xml:space="preserve">son datasets extremos donde PCSMOTE  ni ningún otro método de sobremuestreo logra mejorar la clasificación del modelo; esto se logra observar por la bajísima performance obtenida. En otras palabras, estos tipos de datasets no están hechos para funcionar con vecinos. </w:t>
-      </w:r>
-    </w:p>
-    <w:p>
-      <w:pPr>
-        <w:rPr>
-          <w:lang w:val="es-ES"/>
-        </w:rPr>
-      </w:pPr>
-    </w:p>
-    <w:p>
-      <w:pPr>
-        <w:rPr>
-          <w:lang w:val="es-ES"/>
-        </w:rPr>
-      </w:pPr>
-      <w:r>
-        <w:lastRenderedPageBreak/>
+        <w:t xml:space="preserve">son </w:t>
+      </w:r>
+      <w:proofErr w:type="spellStart"/>
+      <w:r>
+        <w:rPr>
+          <w:lang w:val="es-ES"/>
+        </w:rPr>
+        <w:t>datasets</w:t>
+      </w:r>
+      <w:proofErr w:type="spellEnd"/>
+      <w:r>
+        <w:rPr>
+          <w:lang w:val="es-ES"/>
+        </w:rPr>
+        <w:t xml:space="preserve"> extremos donde </w:t>
+      </w:r>
+      <w:proofErr w:type="gramStart"/>
+      <w:r>
+        <w:rPr>
+          <w:lang w:val="es-ES"/>
+        </w:rPr>
+        <w:t>PCSMOTE  ni</w:t>
+      </w:r>
+      <w:proofErr w:type="gramEnd"/>
+      <w:r>
+        <w:rPr>
+          <w:lang w:val="es-ES"/>
+        </w:rPr>
+        <w:t xml:space="preserve"> ningún otro método de </w:t>
+      </w:r>
+      <w:proofErr w:type="spellStart"/>
+      <w:r>
+        <w:rPr>
+          <w:lang w:val="es-ES"/>
+        </w:rPr>
+        <w:t>sobremuestreo</w:t>
+      </w:r>
+      <w:proofErr w:type="spellEnd"/>
+      <w:r>
+        <w:rPr>
+          <w:lang w:val="es-ES"/>
+        </w:rPr>
+        <w:t xml:space="preserve"> logra mejorar la clasificación del modelo; esto se logra observar por la bajísima performance obtenida. En otras palabras, estos tipos de </w:t>
+      </w:r>
+      <w:proofErr w:type="spellStart"/>
+      <w:r>
+        <w:rPr>
+          <w:lang w:val="es-ES"/>
+        </w:rPr>
+        <w:t>datasets</w:t>
+      </w:r>
+      <w:proofErr w:type="spellEnd"/>
+      <w:r>
+        <w:rPr>
+          <w:lang w:val="es-ES"/>
+        </w:rPr>
+        <w:t xml:space="preserve"> no están hechos para funcionar con vecinos. </w:t>
+      </w:r>
+    </w:p>
+    <w:p>
+      <w:pPr>
+        <w:rPr>
+          <w:lang w:val="es-ES"/>
+        </w:rPr>
+      </w:pPr>
+    </w:p>
+    <w:p>
+      <w:pPr>
+        <w:rPr>
+          <w:lang w:val="es-ES"/>
+        </w:rPr>
+      </w:pPr>
+      <w:r>
+        <w:rPr>
+          <w:noProof/>
+        </w:rPr>
         <w:drawing>
           <wp:inline distT="0" distB="0" distL="0" distR="0" wp14:anchorId="1C3079E7" wp14:editId="6EC0FA19">
             <wp:extent cx="6858000" cy="1680845"/>
@@ -2453,7 +3787,7 @@
         <w:tblLook w:val="04A0" w:firstRow="1" w:lastRow="0" w:firstColumn="1" w:lastColumn="0" w:noHBand="0" w:noVBand="1"/>
       </w:tblPr>
       <w:tblGrid>
-        <w:gridCol w:w="10790"/>
+        <w:gridCol w:w="10456"/>
       </w:tblGrid>
       <w:tr>
         <w:tc>
@@ -2471,6 +3805,121 @@
                 <w:lang w:val="es-ES"/>
               </w:rPr>
               <w:t xml:space="preserve">GLASS </w:t>
+            </w:r>
+          </w:p>
+        </w:tc>
+      </w:tr>
+      <w:tr>
+        <w:tc>
+          <w:tcPr>
+            <w:tcW w:w="10790" w:type="dxa"/>
+          </w:tcPr>
+          <w:p>
+            <w:pPr>
+              <w:pStyle w:val="Prrafodelista"/>
+              <w:numPr>
+                <w:ilvl w:val="0"/>
+                <w:numId w:val="4"/>
+              </w:numPr>
+            </w:pPr>
+            <w:r>
+              <w:t xml:space="preserve">Valores únicos del </w:t>
+            </w:r>
+            <w:proofErr w:type="gramStart"/>
+            <w:r>
+              <w:t>target</w:t>
+            </w:r>
+            <w:proofErr w:type="gramEnd"/>
+            <w:r>
+              <w:t>: [2, 1, 7, 3, 5, 6]</w:t>
+            </w:r>
+          </w:p>
+          <w:p>
+            <w:pPr>
+              <w:pStyle w:val="Prrafodelista"/>
+              <w:numPr>
+                <w:ilvl w:val="0"/>
+                <w:numId w:val="4"/>
+              </w:numPr>
+            </w:pPr>
+            <w:r>
+              <w:t>Distribución de clases:</w:t>
+            </w:r>
+          </w:p>
+          <w:p>
+            <w:pPr>
+              <w:pStyle w:val="Prrafodelista"/>
+              <w:numPr>
+                <w:ilvl w:val="1"/>
+                <w:numId w:val="4"/>
+              </w:numPr>
+            </w:pPr>
+            <w:r>
+              <w:t>2: 76 (35.51%)</w:t>
+            </w:r>
+          </w:p>
+          <w:p>
+            <w:pPr>
+              <w:pStyle w:val="Prrafodelista"/>
+              <w:numPr>
+                <w:ilvl w:val="1"/>
+                <w:numId w:val="4"/>
+              </w:numPr>
+            </w:pPr>
+            <w:r>
+              <w:t>1: 70 (32.71%)</w:t>
+            </w:r>
+          </w:p>
+          <w:p>
+            <w:pPr>
+              <w:pStyle w:val="Prrafodelista"/>
+              <w:numPr>
+                <w:ilvl w:val="1"/>
+                <w:numId w:val="4"/>
+              </w:numPr>
+            </w:pPr>
+            <w:r>
+              <w:lastRenderedPageBreak/>
+              <w:t>7: 29 (13.55%)</w:t>
+            </w:r>
+          </w:p>
+          <w:p>
+            <w:pPr>
+              <w:pStyle w:val="Prrafodelista"/>
+              <w:numPr>
+                <w:ilvl w:val="1"/>
+                <w:numId w:val="4"/>
+              </w:numPr>
+            </w:pPr>
+            <w:r>
+              <w:t>3: 17 (7.94%)</w:t>
+            </w:r>
+          </w:p>
+          <w:p>
+            <w:pPr>
+              <w:pStyle w:val="Prrafodelista"/>
+              <w:numPr>
+                <w:ilvl w:val="1"/>
+                <w:numId w:val="4"/>
+              </w:numPr>
+            </w:pPr>
+            <w:r>
+              <w:t>5: 13 (6.07%)</w:t>
+            </w:r>
+          </w:p>
+          <w:p>
+            <w:pPr>
+              <w:pStyle w:val="Prrafodelista"/>
+              <w:numPr>
+                <w:ilvl w:val="1"/>
+                <w:numId w:val="4"/>
+              </w:numPr>
+              <w:rPr>
+                <w:lang w:val="es-ES"/>
+              </w:rPr>
+            </w:pPr>
+            <w:r>
+              <w:t>6: 9 (4.21%)</w:t>
             </w:r>
           </w:p>
         </w:tc>
@@ -2557,49 +4006,155 @@
           <w:bCs/>
           <w:lang w:val="es-ES"/>
         </w:rPr>
-        <w:t>Análisis de log de comportamiento de pcsmote:</w:t>
-      </w:r>
-    </w:p>
-    <w:p>
-      <w:pPr>
-        <w:rPr>
-          <w:lang w:val="es-ES"/>
-        </w:rPr>
-      </w:pPr>
-      <w:r>
-        <w:rPr>
-          <w:lang w:val="es-ES"/>
-        </w:rPr>
-        <w:t xml:space="preserve">Se puede observar que de las diferentes configuraciones se seleccionaron pocas candidatas, si bien muchas pasaron los diferentes filtros, pocas pasaron el filtro de pureza y de hecho ese habrá sido el que acoto el de semillas candidatas. Asi y todo de las cuatro clases no se llegaron a cubrir todas e incluso la generación se concentro en unas pocas semillas. </w:t>
-      </w:r>
-    </w:p>
-    <w:p>
-      <w:pPr>
-        <w:rPr>
-          <w:lang w:val="es-ES"/>
-        </w:rPr>
-      </w:pPr>
-    </w:p>
-    <w:p>
-      <w:pPr>
-        <w:rPr>
-          <w:lang w:val="es-ES"/>
-        </w:rPr>
-      </w:pPr>
+        <w:t xml:space="preserve">Análisis de log de comportamiento de </w:t>
+      </w:r>
+      <w:proofErr w:type="spellStart"/>
       <w:r>
         <w:rPr>
           <w:b/>
           <w:bCs/>
           <w:lang w:val="es-ES"/>
         </w:rPr>
+        <w:t>pcsmote</w:t>
+      </w:r>
+      <w:proofErr w:type="spellEnd"/>
+      <w:r>
+        <w:rPr>
+          <w:b/>
+          <w:bCs/>
+          <w:lang w:val="es-ES"/>
+        </w:rPr>
+        <w:t>:</w:t>
+      </w:r>
+    </w:p>
+    <w:p>
+      <w:pPr>
+        <w:jc w:val="both"/>
+        <w:rPr>
+          <w:lang w:val="es-ES"/>
+        </w:rPr>
+      </w:pPr>
+      <w:r>
+        <w:rPr>
+          <w:lang w:val="es-ES"/>
+        </w:rPr>
+        <w:t xml:space="preserve">Se puede observar que de las diferentes configuraciones se seleccionaron pocas candidatas, si bien muchas pasaron los diferentes filtros, pocas pasaron el filtro de pureza y de hecho ese habrá sido el que acoto el de semillas candidatas. </w:t>
+      </w:r>
+      <w:proofErr w:type="spellStart"/>
+      <w:r>
+        <w:rPr>
+          <w:lang w:val="es-ES"/>
+        </w:rPr>
+        <w:t>Asi</w:t>
+      </w:r>
+      <w:proofErr w:type="spellEnd"/>
+      <w:r>
+        <w:rPr>
+          <w:lang w:val="es-ES"/>
+        </w:rPr>
+        <w:t xml:space="preserve"> y todo de las cuatro clases no se llegaron a cubrir todas e incluso la generación se </w:t>
+      </w:r>
+      <w:proofErr w:type="spellStart"/>
+      <w:r>
+        <w:rPr>
+          <w:lang w:val="es-ES"/>
+        </w:rPr>
+        <w:t>concentro</w:t>
+      </w:r>
+      <w:proofErr w:type="spellEnd"/>
+      <w:r>
+        <w:rPr>
+          <w:lang w:val="es-ES"/>
+        </w:rPr>
+        <w:t xml:space="preserve"> en unas pocas semillas. </w:t>
+      </w:r>
+    </w:p>
+    <w:p>
+      <w:pPr>
+        <w:jc w:val="both"/>
+        <w:rPr>
+          <w:lang w:val="es-ES"/>
+        </w:rPr>
+      </w:pPr>
+    </w:p>
+    <w:p>
+      <w:pPr>
+        <w:jc w:val="both"/>
+        <w:rPr>
+          <w:lang w:val="es-ES"/>
+        </w:rPr>
+      </w:pPr>
+      <w:r>
+        <w:rPr>
+          <w:b/>
+          <w:bCs/>
+          <w:lang w:val="es-ES"/>
+        </w:rPr>
         <w:t>Análisis en performance:</w:t>
       </w:r>
       <w:r>
         <w:rPr>
           <w:lang w:val="es-ES"/>
         </w:rPr>
-        <w:t xml:space="preserve"> en cuanto a este dataset se puede observar mejorar de pcsmote en el uso de pureza por proporción frente a entropía y una reducción en el umbral de riesgo, no asi con el umbral de densidad, como asi tampoco del </w:t>
-      </w:r>
+        <w:t xml:space="preserve"> en cuanto a este </w:t>
+      </w:r>
+      <w:proofErr w:type="spellStart"/>
+      <w:r>
+        <w:rPr>
+          <w:lang w:val="es-ES"/>
+        </w:rPr>
+        <w:t>dataset</w:t>
+      </w:r>
+      <w:proofErr w:type="spellEnd"/>
+      <w:r>
+        <w:rPr>
+          <w:lang w:val="es-ES"/>
+        </w:rPr>
+        <w:t xml:space="preserve"> se puede observar mejorar de </w:t>
+      </w:r>
+      <w:proofErr w:type="spellStart"/>
+      <w:r>
+        <w:rPr>
+          <w:lang w:val="es-ES"/>
+        </w:rPr>
+        <w:t>pcsmote</w:t>
+      </w:r>
+      <w:proofErr w:type="spellEnd"/>
+      <w:r>
+        <w:rPr>
+          <w:lang w:val="es-ES"/>
+        </w:rPr>
+        <w:t xml:space="preserve"> en el uso de pureza por proporción frente a entropía y una reducción en el umbral de riesgo, no </w:t>
+      </w:r>
+      <w:proofErr w:type="spellStart"/>
+      <w:r>
+        <w:rPr>
+          <w:lang w:val="es-ES"/>
+        </w:rPr>
+        <w:t>asi</w:t>
+      </w:r>
+      <w:proofErr w:type="spellEnd"/>
+      <w:r>
+        <w:rPr>
+          <w:lang w:val="es-ES"/>
+        </w:rPr>
+        <w:t xml:space="preserve"> con el umbral de densidad, como </w:t>
+      </w:r>
+      <w:proofErr w:type="spellStart"/>
+      <w:r>
+        <w:rPr>
+          <w:lang w:val="es-ES"/>
+        </w:rPr>
+        <w:t>asi</w:t>
+      </w:r>
+      <w:proofErr w:type="spellEnd"/>
+      <w:r>
+        <w:rPr>
+          <w:lang w:val="es-ES"/>
+        </w:rPr>
+        <w:t xml:space="preserve"> tampoco del </w:t>
+      </w:r>
+      <w:proofErr w:type="spellStart"/>
       <w:r>
         <w:rPr>
           <w:i/>
@@ -2608,6 +4163,7 @@
         </w:rPr>
         <w:t>percentil_radio_distancia</w:t>
       </w:r>
+      <w:proofErr w:type="spellEnd"/>
       <w:r>
         <w:rPr>
           <w:lang w:val="es-ES"/>
@@ -2618,7 +4174,21 @@
         <w:rPr>
           <w:lang w:val="es-ES"/>
         </w:rPr>
-        <w:t xml:space="preserve">%, aunque no hubo una diferencia notable cuando se bajo el porcentaje a 70%. </w:t>
+        <w:t xml:space="preserve">%, aunque no hubo una diferencia notable cuando se </w:t>
+      </w:r>
+      <w:proofErr w:type="spellStart"/>
+      <w:r>
+        <w:rPr>
+          <w:lang w:val="es-ES"/>
+        </w:rPr>
+        <w:t>bajo</w:t>
+      </w:r>
+      <w:proofErr w:type="spellEnd"/>
+      <w:r>
+        <w:rPr>
+          <w:lang w:val="es-ES"/>
+        </w:rPr>
+        <w:t xml:space="preserve"> el porcentaje a 70%. </w:t>
       </w:r>
       <w:r>
         <w:rPr>
@@ -2643,7 +4213,9 @@
         </w:rPr>
       </w:pPr>
       <w:r>
-        <w:lastRenderedPageBreak/>
+        <w:rPr>
+          <w:noProof/>
+        </w:rPr>
         <w:drawing>
           <wp:inline distT="0" distB="0" distL="0" distR="0" wp14:anchorId="2950DFB4" wp14:editId="25913866">
             <wp:extent cx="6858000" cy="2067560"/>
@@ -2694,8 +4266,408 @@
         </w:drawing>
       </w:r>
     </w:p>
+    <w:p>
+      <w:pPr>
+        <w:rPr>
+          <w:lang w:val="es-ES"/>
+        </w:rPr>
+      </w:pPr>
+    </w:p>
+    <w:tbl>
+      <w:tblPr>
+        <w:tblStyle w:val="Tablaconcuadrcula"/>
+        <w:tblW w:w="0" w:type="auto"/>
+        <w:tblLook w:val="04A0" w:firstRow="1" w:lastRow="0" w:firstColumn="1" w:lastColumn="0" w:noHBand="0" w:noVBand="1"/>
+      </w:tblPr>
+      <w:tblGrid>
+        <w:gridCol w:w="10456"/>
+      </w:tblGrid>
+      <w:tr>
+        <w:tc>
+          <w:tcPr>
+            <w:tcW w:w="10790" w:type="dxa"/>
+          </w:tcPr>
+          <w:p>
+            <w:pPr>
+              <w:rPr>
+                <w:lang w:val="es-ES"/>
+              </w:rPr>
+            </w:pPr>
+            <w:r>
+              <w:rPr>
+                <w:lang w:val="es-ES"/>
+              </w:rPr>
+              <w:t>SHUTTLE</w:t>
+            </w:r>
+          </w:p>
+        </w:tc>
+      </w:tr>
+      <w:tr>
+        <w:tc>
+          <w:tcPr>
+            <w:tcW w:w="10790" w:type="dxa"/>
+          </w:tcPr>
+          <w:p>
+            <w:pPr>
+              <w:pStyle w:val="Prrafodelista"/>
+              <w:numPr>
+                <w:ilvl w:val="0"/>
+                <w:numId w:val="5"/>
+              </w:numPr>
+            </w:pPr>
+            <w:r>
+              <w:t xml:space="preserve">Valores únicos del </w:t>
+            </w:r>
+            <w:proofErr w:type="gramStart"/>
+            <w:r>
+              <w:t>target</w:t>
+            </w:r>
+            <w:proofErr w:type="gramEnd"/>
+            <w:r>
+              <w:t>: [1, 4, 5, 3, 2, 7, 6]</w:t>
+            </w:r>
+          </w:p>
+          <w:p>
+            <w:pPr>
+              <w:pStyle w:val="Prrafodelista"/>
+              <w:numPr>
+                <w:ilvl w:val="0"/>
+                <w:numId w:val="5"/>
+              </w:numPr>
+            </w:pPr>
+            <w:r>
+              <w:t>Distribución de clases:</w:t>
+            </w:r>
+          </w:p>
+          <w:p>
+            <w:pPr>
+              <w:pStyle w:val="Prrafodelista"/>
+              <w:numPr>
+                <w:ilvl w:val="1"/>
+                <w:numId w:val="5"/>
+              </w:numPr>
+            </w:pPr>
+            <w:r>
+              <w:t>1: 45586 (78.6%)</w:t>
+            </w:r>
+          </w:p>
+          <w:p>
+            <w:pPr>
+              <w:pStyle w:val="Prrafodelista"/>
+              <w:numPr>
+                <w:ilvl w:val="1"/>
+                <w:numId w:val="5"/>
+              </w:numPr>
+            </w:pPr>
+            <w:r>
+              <w:t>4: 8903 (15.35%)</w:t>
+            </w:r>
+          </w:p>
+          <w:p>
+            <w:pPr>
+              <w:pStyle w:val="Prrafodelista"/>
+              <w:numPr>
+                <w:ilvl w:val="1"/>
+                <w:numId w:val="5"/>
+              </w:numPr>
+            </w:pPr>
+            <w:r>
+              <w:t>5: 3267 (5.63%)</w:t>
+            </w:r>
+          </w:p>
+          <w:p>
+            <w:pPr>
+              <w:pStyle w:val="Prrafodelista"/>
+              <w:numPr>
+                <w:ilvl w:val="1"/>
+                <w:numId w:val="5"/>
+              </w:numPr>
+            </w:pPr>
+            <w:r>
+              <w:t>3: 171 (0.29%)</w:t>
+            </w:r>
+          </w:p>
+          <w:p>
+            <w:pPr>
+              <w:pStyle w:val="Prrafodelista"/>
+              <w:numPr>
+                <w:ilvl w:val="1"/>
+                <w:numId w:val="5"/>
+              </w:numPr>
+            </w:pPr>
+            <w:r>
+              <w:t>2: 50 (0.09%)</w:t>
+            </w:r>
+          </w:p>
+          <w:p>
+            <w:pPr>
+              <w:pStyle w:val="Prrafodelista"/>
+              <w:numPr>
+                <w:ilvl w:val="1"/>
+                <w:numId w:val="5"/>
+              </w:numPr>
+            </w:pPr>
+            <w:r>
+              <w:t>7: 13 (0.02%)</w:t>
+            </w:r>
+          </w:p>
+          <w:p>
+            <w:pPr>
+              <w:pStyle w:val="Prrafodelista"/>
+              <w:numPr>
+                <w:ilvl w:val="1"/>
+                <w:numId w:val="5"/>
+              </w:numPr>
+              <w:rPr>
+                <w:lang w:val="es-ES"/>
+              </w:rPr>
+            </w:pPr>
+            <w:r>
+              <w:t>6: 10 (0.02%)</w:t>
+            </w:r>
+          </w:p>
+        </w:tc>
+      </w:tr>
+    </w:tbl>
+    <w:p>
+      <w:pPr>
+        <w:rPr>
+          <w:lang w:val="es-ES"/>
+        </w:rPr>
+      </w:pPr>
+    </w:p>
+    <w:p>
+      <w:pPr>
+        <w:rPr>
+          <w:lang w:val="es-ES"/>
+        </w:rPr>
+      </w:pPr>
+      <w:r>
+        <w:rPr>
+          <w:noProof/>
+          <w:lang w:val="es-ES"/>
+        </w:rPr>
+        <w:drawing>
+          <wp:inline distT="0" distB="0" distL="0" distR="0" wp14:anchorId="6DBB3074" wp14:editId="222E3144">
+            <wp:extent cx="6852285" cy="4019550"/>
+            <wp:effectExtent l="0" t="0" r="5715" b="0"/>
+            <wp:docPr id="1299339936" name="Imagen 1"/>
+            <wp:cNvGraphicFramePr>
+              <a:graphicFrameLocks xmlns:a="http://schemas.openxmlformats.org/drawingml/2006/main" noChangeAspect="1"/>
+            </wp:cNvGraphicFramePr>
+            <a:graphic xmlns:a="http://schemas.openxmlformats.org/drawingml/2006/main">
+              <a:graphicData uri="http://schemas.openxmlformats.org/drawingml/2006/picture">
+                <pic:pic xmlns:pic="http://schemas.openxmlformats.org/drawingml/2006/picture">
+                  <pic:nvPicPr>
+                    <pic:cNvPr id="0" name="Picture 1"/>
+                    <pic:cNvPicPr>
+                      <a:picLocks noChangeAspect="1" noChangeArrowheads="1"/>
+                    </pic:cNvPicPr>
+                  </pic:nvPicPr>
+                  <pic:blipFill>
+                    <a:blip r:embed="rId22">
+                      <a:extLst>
+                        <a:ext uri="{28A0092B-C50C-407E-A947-70E740481C1C}">
+                          <a14:useLocalDpi xmlns:a14="http://schemas.microsoft.com/office/drawing/2010/main" val="0"/>
+                        </a:ext>
+                      </a:extLst>
+                    </a:blip>
+                    <a:srcRect/>
+                    <a:stretch>
+                      <a:fillRect/>
+                    </a:stretch>
+                  </pic:blipFill>
+                  <pic:spPr bwMode="auto">
+                    <a:xfrm>
+                      <a:off x="0" y="0"/>
+                      <a:ext cx="6852285" cy="4019550"/>
+                    </a:xfrm>
+                    <a:prstGeom prst="rect">
+                      <a:avLst/>
+                    </a:prstGeom>
+                    <a:noFill/>
+                    <a:ln>
+                      <a:noFill/>
+                    </a:ln>
+                  </pic:spPr>
+                </pic:pic>
+              </a:graphicData>
+            </a:graphic>
+          </wp:inline>
+        </w:drawing>
+      </w:r>
+    </w:p>
+    <w:p>
+      <w:pPr>
+        <w:jc w:val="both"/>
+        <w:rPr>
+          <w:lang w:val="es-ES"/>
+        </w:rPr>
+      </w:pPr>
+    </w:p>
+    <w:p>
+      <w:pPr>
+        <w:jc w:val="both"/>
+        <w:rPr>
+          <w:lang w:val="es-ES"/>
+        </w:rPr>
+      </w:pPr>
+      <w:r>
+        <w:rPr>
+          <w:lang w:val="es-ES"/>
+        </w:rPr>
+        <w:t xml:space="preserve">Luego del análisis por log de </w:t>
+      </w:r>
+      <w:proofErr w:type="spellStart"/>
+      <w:r>
+        <w:rPr>
+          <w:lang w:val="es-ES"/>
+        </w:rPr>
+        <w:t>pcsmote</w:t>
+      </w:r>
+      <w:proofErr w:type="spellEnd"/>
+      <w:r>
+        <w:rPr>
+          <w:lang w:val="es-ES"/>
+        </w:rPr>
+        <w:t xml:space="preserve"> y viendo el resultado plasmado en el grafico radar, se puede observar que </w:t>
+      </w:r>
+      <w:proofErr w:type="spellStart"/>
+      <w:r>
+        <w:rPr>
+          <w:lang w:val="es-ES"/>
+        </w:rPr>
+        <w:t>shuttle</w:t>
+      </w:r>
+      <w:proofErr w:type="spellEnd"/>
+      <w:r>
+        <w:rPr>
+          <w:lang w:val="es-ES"/>
+        </w:rPr>
+        <w:t xml:space="preserve"> presenta un desbalance extremo a nivel de cardinalidad por clase, con clases minoritarias que cuentan con una cantidad de semillas (SV) extremadamente reducida en relación con el tamaño total del </w:t>
+      </w:r>
+      <w:proofErr w:type="spellStart"/>
+      <w:r>
+        <w:rPr>
+          <w:lang w:val="es-ES"/>
+        </w:rPr>
+        <w:t>dataset</w:t>
+      </w:r>
+      <w:proofErr w:type="spellEnd"/>
+      <w:r>
+        <w:rPr>
+          <w:lang w:val="es-ES"/>
+        </w:rPr>
+        <w:t>. En este escenario, la generación sintética se ve forzada a concentrarse sobre un conjunto muy pequeño de puntos semilla, lo que conduce inevitablemente a ratios SG/SV extremadamente altos.</w:t>
+      </w:r>
+    </w:p>
+    <w:p>
+      <w:pPr>
+        <w:jc w:val="both"/>
+        <w:rPr>
+          <w:lang w:val="es-ES"/>
+        </w:rPr>
+      </w:pPr>
+      <w:r>
+        <w:rPr>
+          <w:lang w:val="es-ES"/>
+        </w:rPr>
+        <w:t>Esta concentración estructural impone un limite practico a cualquier intento de mejora en la equidad de generación. Aun relajando lo mas posible el umbral de densidad como riesgo y proporción no puede escapar a la restricción fundamental:</w:t>
+      </w:r>
+    </w:p>
+    <w:p>
+      <w:pPr>
+        <w:jc w:val="both"/>
+        <w:rPr>
+          <w:i/>
+          <w:iCs/>
+          <w:lang w:val="es-ES"/>
+        </w:rPr>
+      </w:pPr>
+      <w:r>
+        <w:rPr>
+          <w:i/>
+          <w:iCs/>
+          <w:lang w:val="es-ES"/>
+        </w:rPr>
+        <w:t>“cuando el número de semillas es muy bajo, la generación equitativa es geométricamente imposible sin introducir distorsiones artificiales del espacio”</w:t>
+      </w:r>
+    </w:p>
+    <w:p>
+      <w:pPr>
+        <w:jc w:val="both"/>
+        <w:rPr>
+          <w:lang w:val="es-ES"/>
+        </w:rPr>
+      </w:pPr>
+      <w:r>
+        <w:rPr>
+          <w:lang w:val="es-ES"/>
+        </w:rPr>
+        <w:t xml:space="preserve">En cuanto a la performance se puede observar que produce mejoras consistentes en las métricas de clasificación globales. Esto confirma que el espacio de características no es caótico ni aleatorio, y que la hipótesis de vecindad local es válida. </w:t>
+      </w:r>
+    </w:p>
+    <w:p>
+      <w:pPr>
+        <w:jc w:val="both"/>
+        <w:rPr>
+          <w:lang w:val="es-ES"/>
+        </w:rPr>
+      </w:pPr>
+      <w:r>
+        <w:lastRenderedPageBreak/>
+        <w:drawing>
+          <wp:inline distT="0" distB="0" distL="0" distR="0" wp14:anchorId="61E19392" wp14:editId="63E75F31">
+            <wp:extent cx="6858000" cy="2057400"/>
+            <wp:effectExtent l="0" t="0" r="0" b="0"/>
+            <wp:docPr id="620915216" name="Imagen 2"/>
+            <wp:cNvGraphicFramePr>
+              <a:graphicFrameLocks xmlns:a="http://schemas.openxmlformats.org/drawingml/2006/main" noChangeAspect="1"/>
+            </wp:cNvGraphicFramePr>
+            <a:graphic xmlns:a="http://schemas.openxmlformats.org/drawingml/2006/main">
+              <a:graphicData uri="http://schemas.openxmlformats.org/drawingml/2006/picture">
+                <pic:pic xmlns:pic="http://schemas.openxmlformats.org/drawingml/2006/picture">
+                  <pic:nvPicPr>
+                    <pic:cNvPr id="0" name="Picture 2"/>
+                    <pic:cNvPicPr>
+                      <a:picLocks noChangeAspect="1" noChangeArrowheads="1"/>
+                    </pic:cNvPicPr>
+                  </pic:nvPicPr>
+                  <pic:blipFill>
+                    <a:blip r:embed="rId23">
+                      <a:extLst>
+                        <a:ext uri="{28A0092B-C50C-407E-A947-70E740481C1C}">
+                          <a14:useLocalDpi xmlns:a14="http://schemas.microsoft.com/office/drawing/2010/main" val="0"/>
+                        </a:ext>
+                      </a:extLst>
+                    </a:blip>
+                    <a:srcRect/>
+                    <a:stretch>
+                      <a:fillRect/>
+                    </a:stretch>
+                  </pic:blipFill>
+                  <pic:spPr bwMode="auto">
+                    <a:xfrm>
+                      <a:off x="0" y="0"/>
+                      <a:ext cx="6858000" cy="2057400"/>
+                    </a:xfrm>
+                    <a:prstGeom prst="rect">
+                      <a:avLst/>
+                    </a:prstGeom>
+                    <a:noFill/>
+                    <a:ln>
+                      <a:noFill/>
+                    </a:ln>
+                  </pic:spPr>
+                </pic:pic>
+              </a:graphicData>
+            </a:graphic>
+          </wp:inline>
+        </w:drawing>
+      </w:r>
+    </w:p>
     <w:sectPr>
-      <w:pgSz w:w="12240" w:h="15840"/>
+      <w:pgSz w:w="11906" w:h="16838" w:code="9"/>
       <w:pgMar w:top="720" w:right="720" w:bottom="720" w:left="720" w:header="708" w:footer="708" w:gutter="0"/>
       <w:cols w:space="708"/>
       <w:docGrid w:linePitch="360"/>
@@ -2705,11 +4677,11 @@
 </file>
 
 <file path=word/numbering.xml><?xml version="1.0" encoding="utf-8"?>
-<w:numbering xmlns:wpc="http://schemas.microsoft.com/office/word/2010/wordprocessingCanvas" xmlns:cx="http://schemas.microsoft.com/office/drawing/2014/chartex" xmlns:cx1="http://schemas.microsoft.com/office/drawing/2015/9/8/chartex" xmlns:cx2="http://schemas.microsoft.com/office/drawing/2015/10/21/chartex" xmlns:cx3="http://schemas.microsoft.com/office/drawing/2016/5/9/chartex" xmlns:cx4="http://schemas.microsoft.com/office/drawing/2016/5/10/chartex" xmlns:cx5="http://schemas.microsoft.com/office/drawing/2016/5/11/chartex" xmlns:cx6="http://schemas.microsoft.com/office/drawing/2016/5/12/chartex" xmlns:cx7="http://schemas.microsoft.com/office/drawing/2016/5/13/chartex" xmlns:cx8="http://schemas.microsoft.com/office/drawing/2016/5/14/chartex" xmlns:mc="http://schemas.openxmlformats.org/markup-compatibility/2006" xmlns:aink="http://schemas.microsoft.com/office/drawing/2016/ink" xmlns:am3d="http://schemas.microsoft.com/office/drawing/2017/model3d" xmlns:o="urn:schemas-microsoft-com:office:office" xmlns:r="http://schemas.openxmlformats.org/officeDocument/2006/relationships" xmlns:m="http://schemas.openxmlformats.org/officeDocument/2006/math" xmlns:v="urn:schemas-microsoft-com:vml" xmlns:wp14="http://schemas.microsoft.com/office/word/2010/wordprocessingDrawing" xmlns:wp="http://schemas.openxmlformats.org/drawingml/2006/wordprocessingDrawing" xmlns:w10="urn:schemas-microsoft-com:office:word" xmlns:w="http://schemas.openxmlformats.org/wordprocessingml/2006/main" xmlns:w14="http://schemas.microsoft.com/office/word/2010/wordml" xmlns:w15="http://schemas.microsoft.com/office/word/2012/wordml" xmlns:w16cex="http://schemas.microsoft.com/office/word/2018/wordml/cex" xmlns:w16cid="http://schemas.microsoft.com/office/word/2016/wordml/cid" xmlns:w16="http://schemas.microsoft.com/office/word/2018/wordml" xmlns:w16sdtdh="http://schemas.microsoft.com/office/word/2020/wordml/sdtdatahash" xmlns:w16se="http://schemas.microsoft.com/office/word/2015/wordml/symex" xmlns:wpg="http://schemas.microsoft.com/office/word/2010/wordprocessingGroup" xmlns:wpi="http://schemas.microsoft.com/office/word/2010/wordprocessingInk" xmlns:wne="http://schemas.microsoft.com/office/word/2006/wordml" xmlns:wps="http://schemas.microsoft.com/office/word/2010/wordprocessingShape" mc:Ignorable="w14 w15 w16se w16cid w16 w16cex w16sdtdh wp14">
+<w:numbering xmlns:wpc="http://schemas.microsoft.com/office/word/2010/wordprocessingCanvas" xmlns:cx="http://schemas.microsoft.com/office/drawing/2014/chartex" xmlns:cx1="http://schemas.microsoft.com/office/drawing/2015/9/8/chartex" xmlns:cx2="http://schemas.microsoft.com/office/drawing/2015/10/21/chartex" xmlns:cx3="http://schemas.microsoft.com/office/drawing/2016/5/9/chartex" xmlns:cx4="http://schemas.microsoft.com/office/drawing/2016/5/10/chartex" xmlns:cx5="http://schemas.microsoft.com/office/drawing/2016/5/11/chartex" xmlns:cx6="http://schemas.microsoft.com/office/drawing/2016/5/12/chartex" xmlns:cx7="http://schemas.microsoft.com/office/drawing/2016/5/13/chartex" xmlns:cx8="http://schemas.microsoft.com/office/drawing/2016/5/14/chartex" xmlns:mc="http://schemas.openxmlformats.org/markup-compatibility/2006" xmlns:aink="http://schemas.microsoft.com/office/drawing/2016/ink" xmlns:am3d="http://schemas.microsoft.com/office/drawing/2017/model3d" xmlns:o="urn:schemas-microsoft-com:office:office" xmlns:oel="http://schemas.microsoft.com/office/2019/extlst" xmlns:r="http://schemas.openxmlformats.org/officeDocument/2006/relationships" xmlns:m="http://schemas.openxmlformats.org/officeDocument/2006/math" xmlns:v="urn:schemas-microsoft-com:vml" xmlns:wp14="http://schemas.microsoft.com/office/word/2010/wordprocessingDrawing" xmlns:wp="http://schemas.openxmlformats.org/drawingml/2006/wordprocessingDrawing" xmlns:w10="urn:schemas-microsoft-com:office:word" xmlns:w="http://schemas.openxmlformats.org/wordprocessingml/2006/main" xmlns:w14="http://schemas.microsoft.com/office/word/2010/wordml" xmlns:w15="http://schemas.microsoft.com/office/word/2012/wordml" xmlns:w16cex="http://schemas.microsoft.com/office/word/2018/wordml/cex" xmlns:w16cid="http://schemas.microsoft.com/office/word/2016/wordml/cid" xmlns:w16="http://schemas.microsoft.com/office/word/2018/wordml" xmlns:w16du="http://schemas.microsoft.com/office/word/2023/wordml/word16du" xmlns:w16sdtdh="http://schemas.microsoft.com/office/word/2020/wordml/sdtdatahash" xmlns:w16sdtfl="http://schemas.microsoft.com/office/word/2024/wordml/sdtformatlock" xmlns:w16se="http://schemas.microsoft.com/office/word/2015/wordml/symex" xmlns:wpg="http://schemas.microsoft.com/office/word/2010/wordprocessingGroup" xmlns:wpi="http://schemas.microsoft.com/office/word/2010/wordprocessingInk" xmlns:wne="http://schemas.microsoft.com/office/word/2006/wordml" xmlns:wps="http://schemas.microsoft.com/office/word/2010/wordprocessingShape" mc:Ignorable="w14 w15 w16se w16cid w16 w16cex w16sdtdh w16sdtfl w16du wp14">
   <w:abstractNum w:abstractNumId="0" w15:restartNumberingAfterBreak="0">
-    <w:nsid w:val="5F102902"/>
+    <w:nsid w:val="1B3273E5"/>
     <w:multiLevelType w:val="hybridMultilevel"/>
-    <w:tmpl w:val="6550161E"/>
+    <w:tmpl w:val="C0F874AE"/>
     <w:lvl w:ilvl="0" w:tplc="D86C532E">
       <w:start w:val="1"/>
       <w:numFmt w:val="bullet"/>
@@ -2819,14 +4791,477 @@
       </w:rPr>
     </w:lvl>
   </w:abstractNum>
-  <w:num w:numId="1">
+  <w:abstractNum w:abstractNumId="1" w15:restartNumberingAfterBreak="0">
+    <w:nsid w:val="34932E1B"/>
+    <w:multiLevelType w:val="hybridMultilevel"/>
+    <w:tmpl w:val="F6EA1AB2"/>
+    <w:lvl w:ilvl="0" w:tplc="D86C532E">
+      <w:start w:val="1"/>
+      <w:numFmt w:val="bullet"/>
+      <w:lvlText w:val=""/>
+      <w:lvlJc w:val="left"/>
+      <w:pPr>
+        <w:ind w:left="720" w:hanging="360"/>
+      </w:pPr>
+      <w:rPr>
+        <w:rFonts w:ascii="Symbol" w:eastAsiaTheme="minorHAnsi" w:hAnsi="Symbol" w:cstheme="minorBidi" w:hint="default"/>
+      </w:rPr>
+    </w:lvl>
+    <w:lvl w:ilvl="1" w:tplc="2C0A0003">
+      <w:start w:val="1"/>
+      <w:numFmt w:val="bullet"/>
+      <w:lvlText w:val="o"/>
+      <w:lvlJc w:val="left"/>
+      <w:pPr>
+        <w:ind w:left="1440" w:hanging="360"/>
+      </w:pPr>
+      <w:rPr>
+        <w:rFonts w:ascii="Courier New" w:hAnsi="Courier New" w:cs="Courier New" w:hint="default"/>
+      </w:rPr>
+    </w:lvl>
+    <w:lvl w:ilvl="2" w:tplc="2C0A0005" w:tentative="1">
+      <w:start w:val="1"/>
+      <w:numFmt w:val="bullet"/>
+      <w:lvlText w:val=""/>
+      <w:lvlJc w:val="left"/>
+      <w:pPr>
+        <w:ind w:left="2160" w:hanging="360"/>
+      </w:pPr>
+      <w:rPr>
+        <w:rFonts w:ascii="Wingdings" w:hAnsi="Wingdings" w:hint="default"/>
+      </w:rPr>
+    </w:lvl>
+    <w:lvl w:ilvl="3" w:tplc="2C0A0001" w:tentative="1">
+      <w:start w:val="1"/>
+      <w:numFmt w:val="bullet"/>
+      <w:lvlText w:val=""/>
+      <w:lvlJc w:val="left"/>
+      <w:pPr>
+        <w:ind w:left="2880" w:hanging="360"/>
+      </w:pPr>
+      <w:rPr>
+        <w:rFonts w:ascii="Symbol" w:hAnsi="Symbol" w:hint="default"/>
+      </w:rPr>
+    </w:lvl>
+    <w:lvl w:ilvl="4" w:tplc="2C0A0003" w:tentative="1">
+      <w:start w:val="1"/>
+      <w:numFmt w:val="bullet"/>
+      <w:lvlText w:val="o"/>
+      <w:lvlJc w:val="left"/>
+      <w:pPr>
+        <w:ind w:left="3600" w:hanging="360"/>
+      </w:pPr>
+      <w:rPr>
+        <w:rFonts w:ascii="Courier New" w:hAnsi="Courier New" w:cs="Courier New" w:hint="default"/>
+      </w:rPr>
+    </w:lvl>
+    <w:lvl w:ilvl="5" w:tplc="2C0A0005" w:tentative="1">
+      <w:start w:val="1"/>
+      <w:numFmt w:val="bullet"/>
+      <w:lvlText w:val=""/>
+      <w:lvlJc w:val="left"/>
+      <w:pPr>
+        <w:ind w:left="4320" w:hanging="360"/>
+      </w:pPr>
+      <w:rPr>
+        <w:rFonts w:ascii="Wingdings" w:hAnsi="Wingdings" w:hint="default"/>
+      </w:rPr>
+    </w:lvl>
+    <w:lvl w:ilvl="6" w:tplc="2C0A0001" w:tentative="1">
+      <w:start w:val="1"/>
+      <w:numFmt w:val="bullet"/>
+      <w:lvlText w:val=""/>
+      <w:lvlJc w:val="left"/>
+      <w:pPr>
+        <w:ind w:left="5040" w:hanging="360"/>
+      </w:pPr>
+      <w:rPr>
+        <w:rFonts w:ascii="Symbol" w:hAnsi="Symbol" w:hint="default"/>
+      </w:rPr>
+    </w:lvl>
+    <w:lvl w:ilvl="7" w:tplc="2C0A0003" w:tentative="1">
+      <w:start w:val="1"/>
+      <w:numFmt w:val="bullet"/>
+      <w:lvlText w:val="o"/>
+      <w:lvlJc w:val="left"/>
+      <w:pPr>
+        <w:ind w:left="5760" w:hanging="360"/>
+      </w:pPr>
+      <w:rPr>
+        <w:rFonts w:ascii="Courier New" w:hAnsi="Courier New" w:cs="Courier New" w:hint="default"/>
+      </w:rPr>
+    </w:lvl>
+    <w:lvl w:ilvl="8" w:tplc="2C0A0005" w:tentative="1">
+      <w:start w:val="1"/>
+      <w:numFmt w:val="bullet"/>
+      <w:lvlText w:val=""/>
+      <w:lvlJc w:val="left"/>
+      <w:pPr>
+        <w:ind w:left="6480" w:hanging="360"/>
+      </w:pPr>
+      <w:rPr>
+        <w:rFonts w:ascii="Wingdings" w:hAnsi="Wingdings" w:hint="default"/>
+      </w:rPr>
+    </w:lvl>
+  </w:abstractNum>
+  <w:abstractNum w:abstractNumId="2" w15:restartNumberingAfterBreak="0">
+    <w:nsid w:val="5F102902"/>
+    <w:multiLevelType w:val="hybridMultilevel"/>
+    <w:tmpl w:val="7588412C"/>
+    <w:lvl w:ilvl="0" w:tplc="D86C532E">
+      <w:start w:val="1"/>
+      <w:numFmt w:val="bullet"/>
+      <w:lvlText w:val=""/>
+      <w:lvlJc w:val="left"/>
+      <w:pPr>
+        <w:ind w:left="720" w:hanging="360"/>
+      </w:pPr>
+      <w:rPr>
+        <w:rFonts w:ascii="Symbol" w:eastAsiaTheme="minorHAnsi" w:hAnsi="Symbol" w:cstheme="minorBidi" w:hint="default"/>
+      </w:rPr>
+    </w:lvl>
+    <w:lvl w:ilvl="1" w:tplc="2C0A0003">
+      <w:start w:val="1"/>
+      <w:numFmt w:val="bullet"/>
+      <w:lvlText w:val="o"/>
+      <w:lvlJc w:val="left"/>
+      <w:pPr>
+        <w:ind w:left="1440" w:hanging="360"/>
+      </w:pPr>
+      <w:rPr>
+        <w:rFonts w:ascii="Courier New" w:hAnsi="Courier New" w:cs="Courier New" w:hint="default"/>
+      </w:rPr>
+    </w:lvl>
+    <w:lvl w:ilvl="2" w:tplc="C50E5F66">
+      <w:numFmt w:val="bullet"/>
+      <w:lvlText w:val="-"/>
+      <w:lvlJc w:val="left"/>
+      <w:pPr>
+        <w:ind w:left="2160" w:hanging="360"/>
+      </w:pPr>
+      <w:rPr>
+        <w:rFonts w:ascii="Calibri" w:eastAsiaTheme="minorHAnsi" w:hAnsi="Calibri" w:cs="Calibri" w:hint="default"/>
+      </w:rPr>
+    </w:lvl>
+    <w:lvl w:ilvl="3" w:tplc="2C0A0001" w:tentative="1">
+      <w:start w:val="1"/>
+      <w:numFmt w:val="bullet"/>
+      <w:lvlText w:val=""/>
+      <w:lvlJc w:val="left"/>
+      <w:pPr>
+        <w:ind w:left="2880" w:hanging="360"/>
+      </w:pPr>
+      <w:rPr>
+        <w:rFonts w:ascii="Symbol" w:hAnsi="Symbol" w:hint="default"/>
+      </w:rPr>
+    </w:lvl>
+    <w:lvl w:ilvl="4" w:tplc="2C0A0003" w:tentative="1">
+      <w:start w:val="1"/>
+      <w:numFmt w:val="bullet"/>
+      <w:lvlText w:val="o"/>
+      <w:lvlJc w:val="left"/>
+      <w:pPr>
+        <w:ind w:left="3600" w:hanging="360"/>
+      </w:pPr>
+      <w:rPr>
+        <w:rFonts w:ascii="Courier New" w:hAnsi="Courier New" w:cs="Courier New" w:hint="default"/>
+      </w:rPr>
+    </w:lvl>
+    <w:lvl w:ilvl="5" w:tplc="2C0A0005" w:tentative="1">
+      <w:start w:val="1"/>
+      <w:numFmt w:val="bullet"/>
+      <w:lvlText w:val=""/>
+      <w:lvlJc w:val="left"/>
+      <w:pPr>
+        <w:ind w:left="4320" w:hanging="360"/>
+      </w:pPr>
+      <w:rPr>
+        <w:rFonts w:ascii="Wingdings" w:hAnsi="Wingdings" w:hint="default"/>
+      </w:rPr>
+    </w:lvl>
+    <w:lvl w:ilvl="6" w:tplc="2C0A0001" w:tentative="1">
+      <w:start w:val="1"/>
+      <w:numFmt w:val="bullet"/>
+      <w:lvlText w:val=""/>
+      <w:lvlJc w:val="left"/>
+      <w:pPr>
+        <w:ind w:left="5040" w:hanging="360"/>
+      </w:pPr>
+      <w:rPr>
+        <w:rFonts w:ascii="Symbol" w:hAnsi="Symbol" w:hint="default"/>
+      </w:rPr>
+    </w:lvl>
+    <w:lvl w:ilvl="7" w:tplc="2C0A0003" w:tentative="1">
+      <w:start w:val="1"/>
+      <w:numFmt w:val="bullet"/>
+      <w:lvlText w:val="o"/>
+      <w:lvlJc w:val="left"/>
+      <w:pPr>
+        <w:ind w:left="5760" w:hanging="360"/>
+      </w:pPr>
+      <w:rPr>
+        <w:rFonts w:ascii="Courier New" w:hAnsi="Courier New" w:cs="Courier New" w:hint="default"/>
+      </w:rPr>
+    </w:lvl>
+    <w:lvl w:ilvl="8" w:tplc="2C0A0005" w:tentative="1">
+      <w:start w:val="1"/>
+      <w:numFmt w:val="bullet"/>
+      <w:lvlText w:val=""/>
+      <w:lvlJc w:val="left"/>
+      <w:pPr>
+        <w:ind w:left="6480" w:hanging="360"/>
+      </w:pPr>
+      <w:rPr>
+        <w:rFonts w:ascii="Wingdings" w:hAnsi="Wingdings" w:hint="default"/>
+      </w:rPr>
+    </w:lvl>
+  </w:abstractNum>
+  <w:abstractNum w:abstractNumId="3" w15:restartNumberingAfterBreak="0">
+    <w:nsid w:val="63BA1C07"/>
+    <w:multiLevelType w:val="hybridMultilevel"/>
+    <w:tmpl w:val="EF5665E8"/>
+    <w:lvl w:ilvl="0" w:tplc="D86C532E">
+      <w:start w:val="1"/>
+      <w:numFmt w:val="bullet"/>
+      <w:lvlText w:val=""/>
+      <w:lvlJc w:val="left"/>
+      <w:pPr>
+        <w:ind w:left="720" w:hanging="360"/>
+      </w:pPr>
+      <w:rPr>
+        <w:rFonts w:ascii="Symbol" w:eastAsiaTheme="minorHAnsi" w:hAnsi="Symbol" w:cstheme="minorBidi" w:hint="default"/>
+      </w:rPr>
+    </w:lvl>
+    <w:lvl w:ilvl="1" w:tplc="2C0A0003">
+      <w:start w:val="1"/>
+      <w:numFmt w:val="bullet"/>
+      <w:lvlText w:val="o"/>
+      <w:lvlJc w:val="left"/>
+      <w:pPr>
+        <w:ind w:left="1440" w:hanging="360"/>
+      </w:pPr>
+      <w:rPr>
+        <w:rFonts w:ascii="Courier New" w:hAnsi="Courier New" w:cs="Courier New" w:hint="default"/>
+      </w:rPr>
+    </w:lvl>
+    <w:lvl w:ilvl="2" w:tplc="2C0A0005" w:tentative="1">
+      <w:start w:val="1"/>
+      <w:numFmt w:val="bullet"/>
+      <w:lvlText w:val=""/>
+      <w:lvlJc w:val="left"/>
+      <w:pPr>
+        <w:ind w:left="2160" w:hanging="360"/>
+      </w:pPr>
+      <w:rPr>
+        <w:rFonts w:ascii="Wingdings" w:hAnsi="Wingdings" w:hint="default"/>
+      </w:rPr>
+    </w:lvl>
+    <w:lvl w:ilvl="3" w:tplc="2C0A0001" w:tentative="1">
+      <w:start w:val="1"/>
+      <w:numFmt w:val="bullet"/>
+      <w:lvlText w:val=""/>
+      <w:lvlJc w:val="left"/>
+      <w:pPr>
+        <w:ind w:left="2880" w:hanging="360"/>
+      </w:pPr>
+      <w:rPr>
+        <w:rFonts w:ascii="Symbol" w:hAnsi="Symbol" w:hint="default"/>
+      </w:rPr>
+    </w:lvl>
+    <w:lvl w:ilvl="4" w:tplc="2C0A0003" w:tentative="1">
+      <w:start w:val="1"/>
+      <w:numFmt w:val="bullet"/>
+      <w:lvlText w:val="o"/>
+      <w:lvlJc w:val="left"/>
+      <w:pPr>
+        <w:ind w:left="3600" w:hanging="360"/>
+      </w:pPr>
+      <w:rPr>
+        <w:rFonts w:ascii="Courier New" w:hAnsi="Courier New" w:cs="Courier New" w:hint="default"/>
+      </w:rPr>
+    </w:lvl>
+    <w:lvl w:ilvl="5" w:tplc="2C0A0005" w:tentative="1">
+      <w:start w:val="1"/>
+      <w:numFmt w:val="bullet"/>
+      <w:lvlText w:val=""/>
+      <w:lvlJc w:val="left"/>
+      <w:pPr>
+        <w:ind w:left="4320" w:hanging="360"/>
+      </w:pPr>
+      <w:rPr>
+        <w:rFonts w:ascii="Wingdings" w:hAnsi="Wingdings" w:hint="default"/>
+      </w:rPr>
+    </w:lvl>
+    <w:lvl w:ilvl="6" w:tplc="2C0A0001" w:tentative="1">
+      <w:start w:val="1"/>
+      <w:numFmt w:val="bullet"/>
+      <w:lvlText w:val=""/>
+      <w:lvlJc w:val="left"/>
+      <w:pPr>
+        <w:ind w:left="5040" w:hanging="360"/>
+      </w:pPr>
+      <w:rPr>
+        <w:rFonts w:ascii="Symbol" w:hAnsi="Symbol" w:hint="default"/>
+      </w:rPr>
+    </w:lvl>
+    <w:lvl w:ilvl="7" w:tplc="2C0A0003" w:tentative="1">
+      <w:start w:val="1"/>
+      <w:numFmt w:val="bullet"/>
+      <w:lvlText w:val="o"/>
+      <w:lvlJc w:val="left"/>
+      <w:pPr>
+        <w:ind w:left="5760" w:hanging="360"/>
+      </w:pPr>
+      <w:rPr>
+        <w:rFonts w:ascii="Courier New" w:hAnsi="Courier New" w:cs="Courier New" w:hint="default"/>
+      </w:rPr>
+    </w:lvl>
+    <w:lvl w:ilvl="8" w:tplc="2C0A0005" w:tentative="1">
+      <w:start w:val="1"/>
+      <w:numFmt w:val="bullet"/>
+      <w:lvlText w:val=""/>
+      <w:lvlJc w:val="left"/>
+      <w:pPr>
+        <w:ind w:left="6480" w:hanging="360"/>
+      </w:pPr>
+      <w:rPr>
+        <w:rFonts w:ascii="Wingdings" w:hAnsi="Wingdings" w:hint="default"/>
+      </w:rPr>
+    </w:lvl>
+  </w:abstractNum>
+  <w:abstractNum w:abstractNumId="4" w15:restartNumberingAfterBreak="0">
+    <w:nsid w:val="7A8F1A53"/>
+    <w:multiLevelType w:val="hybridMultilevel"/>
+    <w:tmpl w:val="150CC26E"/>
+    <w:lvl w:ilvl="0" w:tplc="D86C532E">
+      <w:start w:val="1"/>
+      <w:numFmt w:val="bullet"/>
+      <w:lvlText w:val=""/>
+      <w:lvlJc w:val="left"/>
+      <w:pPr>
+        <w:ind w:left="720" w:hanging="360"/>
+      </w:pPr>
+      <w:rPr>
+        <w:rFonts w:ascii="Symbol" w:eastAsiaTheme="minorHAnsi" w:hAnsi="Symbol" w:cstheme="minorBidi" w:hint="default"/>
+      </w:rPr>
+    </w:lvl>
+    <w:lvl w:ilvl="1" w:tplc="2C0A0003">
+      <w:start w:val="1"/>
+      <w:numFmt w:val="bullet"/>
+      <w:lvlText w:val="o"/>
+      <w:lvlJc w:val="left"/>
+      <w:pPr>
+        <w:ind w:left="1440" w:hanging="360"/>
+      </w:pPr>
+      <w:rPr>
+        <w:rFonts w:ascii="Courier New" w:hAnsi="Courier New" w:cs="Courier New" w:hint="default"/>
+      </w:rPr>
+    </w:lvl>
+    <w:lvl w:ilvl="2" w:tplc="2C0A0005" w:tentative="1">
+      <w:start w:val="1"/>
+      <w:numFmt w:val="bullet"/>
+      <w:lvlText w:val=""/>
+      <w:lvlJc w:val="left"/>
+      <w:pPr>
+        <w:ind w:left="2160" w:hanging="360"/>
+      </w:pPr>
+      <w:rPr>
+        <w:rFonts w:ascii="Wingdings" w:hAnsi="Wingdings" w:hint="default"/>
+      </w:rPr>
+    </w:lvl>
+    <w:lvl w:ilvl="3" w:tplc="2C0A0001" w:tentative="1">
+      <w:start w:val="1"/>
+      <w:numFmt w:val="bullet"/>
+      <w:lvlText w:val=""/>
+      <w:lvlJc w:val="left"/>
+      <w:pPr>
+        <w:ind w:left="2880" w:hanging="360"/>
+      </w:pPr>
+      <w:rPr>
+        <w:rFonts w:ascii="Symbol" w:hAnsi="Symbol" w:hint="default"/>
+      </w:rPr>
+    </w:lvl>
+    <w:lvl w:ilvl="4" w:tplc="2C0A0003" w:tentative="1">
+      <w:start w:val="1"/>
+      <w:numFmt w:val="bullet"/>
+      <w:lvlText w:val="o"/>
+      <w:lvlJc w:val="left"/>
+      <w:pPr>
+        <w:ind w:left="3600" w:hanging="360"/>
+      </w:pPr>
+      <w:rPr>
+        <w:rFonts w:ascii="Courier New" w:hAnsi="Courier New" w:cs="Courier New" w:hint="default"/>
+      </w:rPr>
+    </w:lvl>
+    <w:lvl w:ilvl="5" w:tplc="2C0A0005" w:tentative="1">
+      <w:start w:val="1"/>
+      <w:numFmt w:val="bullet"/>
+      <w:lvlText w:val=""/>
+      <w:lvlJc w:val="left"/>
+      <w:pPr>
+        <w:ind w:left="4320" w:hanging="360"/>
+      </w:pPr>
+      <w:rPr>
+        <w:rFonts w:ascii="Wingdings" w:hAnsi="Wingdings" w:hint="default"/>
+      </w:rPr>
+    </w:lvl>
+    <w:lvl w:ilvl="6" w:tplc="2C0A0001" w:tentative="1">
+      <w:start w:val="1"/>
+      <w:numFmt w:val="bullet"/>
+      <w:lvlText w:val=""/>
+      <w:lvlJc w:val="left"/>
+      <w:pPr>
+        <w:ind w:left="5040" w:hanging="360"/>
+      </w:pPr>
+      <w:rPr>
+        <w:rFonts w:ascii="Symbol" w:hAnsi="Symbol" w:hint="default"/>
+      </w:rPr>
+    </w:lvl>
+    <w:lvl w:ilvl="7" w:tplc="2C0A0003" w:tentative="1">
+      <w:start w:val="1"/>
+      <w:numFmt w:val="bullet"/>
+      <w:lvlText w:val="o"/>
+      <w:lvlJc w:val="left"/>
+      <w:pPr>
+        <w:ind w:left="5760" w:hanging="360"/>
+      </w:pPr>
+      <w:rPr>
+        <w:rFonts w:ascii="Courier New" w:hAnsi="Courier New" w:cs="Courier New" w:hint="default"/>
+      </w:rPr>
+    </w:lvl>
+    <w:lvl w:ilvl="8" w:tplc="2C0A0005" w:tentative="1">
+      <w:start w:val="1"/>
+      <w:numFmt w:val="bullet"/>
+      <w:lvlText w:val=""/>
+      <w:lvlJc w:val="left"/>
+      <w:pPr>
+        <w:ind w:left="6480" w:hanging="360"/>
+      </w:pPr>
+      <w:rPr>
+        <w:rFonts w:ascii="Wingdings" w:hAnsi="Wingdings" w:hint="default"/>
+      </w:rPr>
+    </w:lvl>
+  </w:abstractNum>
+  <w:num w:numId="1" w16cid:durableId="1747723518">
+    <w:abstractNumId w:val="2"/>
+  </w:num>
+  <w:num w:numId="2" w16cid:durableId="1838494420">
+    <w:abstractNumId w:val="1"/>
+  </w:num>
+  <w:num w:numId="3" w16cid:durableId="1111780879">
+    <w:abstractNumId w:val="4"/>
+  </w:num>
+  <w:num w:numId="4" w16cid:durableId="634872624">
+    <w:abstractNumId w:val="3"/>
+  </w:num>
+  <w:num w:numId="5" w16cid:durableId="240913178">
     <w:abstractNumId w:val="0"/>
   </w:num>
 </w:numbering>
 </file>
 
 <file path=word/styles.xml><?xml version="1.0" encoding="utf-8"?>
-<w:styles xmlns:mc="http://schemas.openxmlformats.org/markup-compatibility/2006" xmlns:r="http://schemas.openxmlformats.org/officeDocument/2006/relationships" xmlns:w="http://schemas.openxmlformats.org/wordprocessingml/2006/main" xmlns:w14="http://schemas.microsoft.com/office/word/2010/wordml" xmlns:w15="http://schemas.microsoft.com/office/word/2012/wordml" xmlns:w16cex="http://schemas.microsoft.com/office/word/2018/wordml/cex" xmlns:w16cid="http://schemas.microsoft.com/office/word/2016/wordml/cid" xmlns:w16="http://schemas.microsoft.com/office/word/2018/wordml" xmlns:w16sdtdh="http://schemas.microsoft.com/office/word/2020/wordml/sdtdatahash" xmlns:w16se="http://schemas.microsoft.com/office/word/2015/wordml/symex" mc:Ignorable="w14 w15 w16se w16cid w16 w16cex w16sdtdh">
+<w:styles xmlns:mc="http://schemas.openxmlformats.org/markup-compatibility/2006" xmlns:r="http://schemas.openxmlformats.org/officeDocument/2006/relationships" xmlns:w="http://schemas.openxmlformats.org/wordprocessingml/2006/main" xmlns:w14="http://schemas.microsoft.com/office/word/2010/wordml" xmlns:w15="http://schemas.microsoft.com/office/word/2012/wordml" xmlns:w16cex="http://schemas.microsoft.com/office/word/2018/wordml/cex" xmlns:w16cid="http://schemas.microsoft.com/office/word/2016/wordml/cid" xmlns:w16="http://schemas.microsoft.com/office/word/2018/wordml" xmlns:w16du="http://schemas.microsoft.com/office/word/2023/wordml/word16du" xmlns:w16sdtdh="http://schemas.microsoft.com/office/word/2020/wordml/sdtdatahash" xmlns:w16sdtfl="http://schemas.microsoft.com/office/word/2024/wordml/sdtformatlock" xmlns:w16se="http://schemas.microsoft.com/office/word/2015/wordml/symex" mc:Ignorable="w14 w15 w16se w16cid w16 w16cex w16sdtdh w16sdtfl w16du">
   <w:docDefaults>
     <w:rPrDefault>
       <w:rPr>
@@ -2948,6 +5383,7 @@
     <w:lsdException w:name="HTML Sample" w:semiHidden="1" w:unhideWhenUsed="1"/>
     <w:lsdException w:name="HTML Typewriter" w:semiHidden="1" w:unhideWhenUsed="1"/>
     <w:lsdException w:name="HTML Variable" w:semiHidden="1" w:unhideWhenUsed="1"/>
+    <w:lsdException w:name="Normal Table" w:semiHidden="1" w:unhideWhenUsed="1"/>
     <w:lsdException w:name="annotation subject" w:semiHidden="1" w:unhideWhenUsed="1"/>
     <w:lsdException w:name="No List" w:semiHidden="1" w:unhideWhenUsed="1"/>
     <w:lsdException w:name="Outline List 1" w:semiHidden="1" w:unhideWhenUsed="1"/>
@@ -2990,8 +5426,11 @@
     <w:lsdException w:name="Table Contemporary" w:semiHidden="1" w:unhideWhenUsed="1"/>
     <w:lsdException w:name="Table Elegant" w:semiHidden="1" w:unhideWhenUsed="1"/>
     <w:lsdException w:name="Table Professional" w:semiHidden="1" w:unhideWhenUsed="1"/>
+    <w:lsdException w:name="Table Subtle 1" w:semiHidden="1" w:unhideWhenUsed="1"/>
     <w:lsdException w:name="Table Subtle 2" w:semiHidden="1" w:unhideWhenUsed="1"/>
     <w:lsdException w:name="Table Web 1" w:semiHidden="1" w:unhideWhenUsed="1"/>
+    <w:lsdException w:name="Table Web 2" w:semiHidden="1" w:unhideWhenUsed="1"/>
+    <w:lsdException w:name="Table Web 3" w:semiHidden="1" w:unhideWhenUsed="1"/>
     <w:lsdException w:name="Balloon Text" w:semiHidden="1" w:unhideWhenUsed="1"/>
     <w:lsdException w:name="Table Grid" w:uiPriority="39"/>
     <w:lsdException w:name="Table Theme" w:semiHidden="1" w:unhideWhenUsed="1"/>
@@ -3226,7 +5665,6 @@
   <w:style w:type="character" w:default="1" w:styleId="Fuentedeprrafopredeter">
     <w:name w:val="Default Paragraph Font"/>
     <w:uiPriority w:val="1"/>
-    <w:semiHidden/>
     <w:unhideWhenUsed/>
   </w:style>
   <w:style w:type="table" w:default="1" w:styleId="Tablanormal">

</xml_diff>

<commit_message>
trabajando sobre el analisis
se justifica el porque pcsmote no logra una utilidad en determinados datasets y  cuales si.
</commit_message>
<xml_diff>
--- a/resultados/analisis_datasets.docx
+++ b/resultados/analisis_datasets.docx
@@ -16,7 +16,7 @@
         <w:tblLook w:val="04A0" w:firstRow="1" w:lastRow="0" w:firstColumn="1" w:lastColumn="0" w:noHBand="0" w:noVBand="1"/>
       </w:tblPr>
       <w:tblGrid>
-        <w:gridCol w:w="10456"/>
+        <w:gridCol w:w="10790"/>
       </w:tblGrid>
       <w:tr>
         <w:tc>
@@ -518,7 +518,29 @@
           <w:sz w:val="22"/>
           <w:szCs w:val="22"/>
         </w:rPr>
-        <w:t xml:space="preserve">grado de concentración del proceso de </w:t>
+        <w:t xml:space="preserve">grado de concentración del </w:t>
+      </w:r>
+      <w:proofErr w:type="spellStart"/>
+      <w:r>
+        <w:rPr>
+          <w:rFonts w:asciiTheme="minorHAnsi" w:eastAsiaTheme="minorHAnsi" w:hAnsiTheme="minorHAnsi" w:cstheme="minorBidi"/>
+          <w:b/>
+          <w:bCs/>
+          <w:sz w:val="22"/>
+          <w:szCs w:val="22"/>
+        </w:rPr>
+        <w:t>proceso</w:t>
+      </w:r>
+      <w:proofErr w:type="spellEnd"/>
+      <w:r>
+        <w:rPr>
+          <w:rFonts w:asciiTheme="minorHAnsi" w:eastAsiaTheme="minorHAnsi" w:hAnsiTheme="minorHAnsi" w:cstheme="minorBidi"/>
+          <w:b/>
+          <w:bCs/>
+          <w:sz w:val="22"/>
+          <w:szCs w:val="22"/>
+        </w:rPr>
+        <w:t xml:space="preserve"> de </w:t>
       </w:r>
       <w:proofErr w:type="spellStart"/>
       <w:r>
@@ -646,7 +668,6 @@
         </w:rPr>
         <w:t xml:space="preserve">El gráfico de líneas tipo </w:t>
       </w:r>
-      <w:proofErr w:type="spellStart"/>
       <w:r>
         <w:rPr>
           <w:rFonts w:asciiTheme="minorHAnsi" w:eastAsiaTheme="minorHAnsi" w:hAnsiTheme="minorHAnsi" w:cstheme="minorBidi"/>
@@ -660,7 +681,6 @@
         </w:rPr>
         <w:t>dumbbell</w:t>
       </w:r>
-      <w:proofErr w:type="spellEnd"/>
       <w:r>
         <w:rPr>
           <w:rFonts w:asciiTheme="minorHAnsi" w:eastAsiaTheme="minorHAnsi" w:hAnsiTheme="minorHAnsi" w:cstheme="minorBidi"/>
@@ -704,11 +724,11 @@
       <w:r>
         <w:rPr>
           <w:rFonts w:asciiTheme="minorHAnsi" w:eastAsiaTheme="minorHAnsi" w:hAnsiTheme="minorHAnsi" w:cstheme="minorBidi"/>
+          <w:noProof/>
           <w:sz w:val="22"/>
           <w:szCs w:val="22"/>
           <w:lang w:val="es-ES"/>
         </w:rPr>
-        <w:lastRenderedPageBreak/>
         <w:drawing>
           <wp:anchor distT="0" distB="0" distL="114300" distR="114300" simplePos="0" relativeHeight="251662336" behindDoc="0" locked="0" layoutInCell="1" allowOverlap="1" wp14:anchorId="7CB5190D" wp14:editId="6B309BC7">
             <wp:simplePos x="0" y="0"/>
@@ -821,7 +841,17 @@
           <w:szCs w:val="22"/>
           <w:lang w:val="es-ES"/>
         </w:rPr>
-        <w:t xml:space="preserve">, lo cual puede amplificar patrones idiosincráticos del conjunto de entrenamiento y reducir la representatividad global de los datos sintéticos generados. En este sentido, el gráfico de líneas aporta evidencia cuantitativa de que el proceso de </w:t>
+        <w:t xml:space="preserve">, lo cual puede amplificar patrones idiosincráticos del conjunto de entrenamiento y reducir la representatividad global de los datos sintéticos generados. En este sentido, el gráfico de líneas aporta evidencia cuantitativa de que el </w:t>
+      </w:r>
+      <w:r>
+        <w:rPr>
+          <w:rFonts w:asciiTheme="minorHAnsi" w:eastAsiaTheme="minorHAnsi" w:hAnsiTheme="minorHAnsi" w:cstheme="minorBidi"/>
+          <w:sz w:val="22"/>
+          <w:szCs w:val="22"/>
+          <w:lang w:val="es-ES"/>
+        </w:rPr>
+        <w:lastRenderedPageBreak/>
+        <w:t xml:space="preserve">proceso de </w:t>
       </w:r>
       <w:proofErr w:type="spellStart"/>
       <w:r>
@@ -1004,7 +1034,6 @@
         <w:rPr>
           <w:lang w:val="es-ES"/>
         </w:rPr>
-        <w:lastRenderedPageBreak/>
         <w:t xml:space="preserve">La equidad </w:t>
       </w:r>
       <w:r>
@@ -1485,6 +1514,7 @@
           <w:noProof/>
           <w:lang w:val="en-US"/>
         </w:rPr>
+        <w:lastRenderedPageBreak/>
         <w:drawing>
           <wp:inline distT="0" distB="0" distL="0" distR="0" wp14:anchorId="0E64E22A" wp14:editId="05E18C18">
             <wp:extent cx="6945011" cy="2828925"/>
@@ -1838,9 +1868,8 @@
           <w:noProof/>
           <w:lang w:val="en-US"/>
         </w:rPr>
-        <w:lastRenderedPageBreak/>
         <w:drawing>
-          <wp:anchor distT="0" distB="0" distL="114300" distR="114300" simplePos="0" relativeHeight="251664384" behindDoc="0" locked="0" layoutInCell="1" allowOverlap="1" wp14:anchorId="281EC480" wp14:editId="7BEA0F83">
+          <wp:anchor distT="0" distB="0" distL="114300" distR="114300" simplePos="0" relativeHeight="251664384" behindDoc="0" locked="0" layoutInCell="1" allowOverlap="1" wp14:anchorId="281EC480" wp14:editId="79497E1F">
             <wp:simplePos x="0" y="0"/>
             <wp:positionH relativeFrom="margin">
               <wp:posOffset>3081531</wp:posOffset>
@@ -2004,7 +2033,7 @@
         <w:tblLook w:val="04A0" w:firstRow="1" w:lastRow="0" w:firstColumn="1" w:lastColumn="0" w:noHBand="0" w:noVBand="1"/>
       </w:tblPr>
       <w:tblGrid>
-        <w:gridCol w:w="10456"/>
+        <w:gridCol w:w="10790"/>
       </w:tblGrid>
       <w:tr>
         <w:tc>
@@ -2040,6 +2069,7 @@
               </w:numPr>
             </w:pPr>
             <w:r>
+              <w:lastRenderedPageBreak/>
               <w:t xml:space="preserve"> Valores únicos del </w:t>
             </w:r>
             <w:proofErr w:type="gramStart"/>
@@ -2276,15 +2306,29 @@
     <w:p>
       <w:pPr>
         <w:jc w:val="both"/>
-        <w:rPr>
-          <w:lang w:val="es-ES"/>
-        </w:rPr>
-      </w:pPr>
-      <w:r>
-        <w:rPr>
-          <w:lang w:val="es-ES"/>
-        </w:rPr>
-        <w:t xml:space="preserve">El análisis de semilla a semilla evidencia que la generación de instancias sintéticas se concentra en un conjunto reducido de semillas, las cuales producen diez o </w:t>
+      </w:pPr>
+      <w:r>
+        <w:rPr>
+          <w:b/>
+          <w:bCs/>
+          <w:i/>
+          <w:iCs/>
+          <w:u w:val="single"/>
+          <w:lang w:val="es-ES"/>
+        </w:rPr>
+        <w:t>De la gráfica de burbuja</w:t>
+      </w:r>
+      <w:r>
+        <w:rPr>
+          <w:lang w:val="es-ES"/>
+        </w:rPr>
+        <w:t xml:space="preserve"> e</w:t>
+      </w:r>
+      <w:r>
+        <w:rPr>
+          <w:lang w:val="es-ES"/>
+        </w:rPr>
+        <w:t xml:space="preserve">l análisis de semilla a semilla evidencia que la generación de instancias sintéticas se concentra en un conjunto reducido de semillas, las cuales producen diez o </w:t>
       </w:r>
       <w:r>
         <w:rPr>
@@ -2326,6 +2370,128 @@
         </w:rPr>
         <w:t>, explicando la mayor varianza observada en validación cruzada respecto del desempeño en el conjunto de prueba.</w:t>
       </w:r>
+      <w:r>
+        <w:t xml:space="preserve"> </w:t>
+      </w:r>
+    </w:p>
+    <w:p>
+      <w:pPr>
+        <w:jc w:val="both"/>
+        <w:rPr>
+          <w:lang w:val="es-ES"/>
+        </w:rPr>
+      </w:pPr>
+      <w:r>
+        <w:rPr>
+          <w:noProof/>
+        </w:rPr>
+        <w:drawing>
+          <wp:anchor distT="0" distB="0" distL="114300" distR="114300" simplePos="0" relativeHeight="251666432" behindDoc="0" locked="0" layoutInCell="1" allowOverlap="1" wp14:anchorId="07DAEADD" wp14:editId="2E0E0FF3">
+            <wp:simplePos x="0" y="0"/>
+            <wp:positionH relativeFrom="margin">
+              <wp:posOffset>35626</wp:posOffset>
+            </wp:positionH>
+            <wp:positionV relativeFrom="margin">
+              <wp:posOffset>7116816</wp:posOffset>
+            </wp:positionV>
+            <wp:extent cx="3358515" cy="2564765"/>
+            <wp:effectExtent l="0" t="0" r="0" b="6985"/>
+            <wp:wrapSquare wrapText="bothSides"/>
+            <wp:docPr id="1648348443" name="Imagen 1" descr="Gráfico, Gráfico de dispersión, Gráfico de burbujas&#10;&#10;El contenido generado por IA puede ser incorrecto."/>
+            <wp:cNvGraphicFramePr>
+              <a:graphicFrameLocks xmlns:a="http://schemas.openxmlformats.org/drawingml/2006/main" noChangeAspect="1"/>
+            </wp:cNvGraphicFramePr>
+            <a:graphic xmlns:a="http://schemas.openxmlformats.org/drawingml/2006/main">
+              <a:graphicData uri="http://schemas.openxmlformats.org/drawingml/2006/picture">
+                <pic:pic xmlns:pic="http://schemas.openxmlformats.org/drawingml/2006/picture">
+                  <pic:nvPicPr>
+                    <pic:cNvPr id="1648348443" name="Imagen 1" descr="Gráfico, Gráfico de dispersión, Gráfico de burbujas&#10;&#10;El contenido generado por IA puede ser incorrecto."/>
+                    <pic:cNvPicPr>
+                      <a:picLocks noChangeAspect="1" noChangeArrowheads="1"/>
+                    </pic:cNvPicPr>
+                  </pic:nvPicPr>
+                  <pic:blipFill>
+                    <a:blip r:embed="rId10" cstate="print">
+                      <a:extLst>
+                        <a:ext uri="{28A0092B-C50C-407E-A947-70E740481C1C}">
+                          <a14:useLocalDpi xmlns:a14="http://schemas.microsoft.com/office/drawing/2010/main" val="0"/>
+                        </a:ext>
+                      </a:extLst>
+                    </a:blip>
+                    <a:srcRect/>
+                    <a:stretch>
+                      <a:fillRect/>
+                    </a:stretch>
+                  </pic:blipFill>
+                  <pic:spPr bwMode="auto">
+                    <a:xfrm>
+                      <a:off x="0" y="0"/>
+                      <a:ext cx="3358515" cy="2564765"/>
+                    </a:xfrm>
+                    <a:prstGeom prst="rect">
+                      <a:avLst/>
+                    </a:prstGeom>
+                    <a:noFill/>
+                    <a:ln>
+                      <a:noFill/>
+                    </a:ln>
+                  </pic:spPr>
+                </pic:pic>
+              </a:graphicData>
+            </a:graphic>
+          </wp:anchor>
+        </w:drawing>
+      </w:r>
+      <w:r>
+        <w:rPr>
+          <w:lang w:val="es-ES"/>
+        </w:rPr>
+        <w:t xml:space="preserve"> </w:t>
+      </w:r>
+    </w:p>
+    <w:p>
+      <w:pPr>
+        <w:jc w:val="both"/>
+        <w:rPr>
+          <w:lang w:val="es-ES"/>
+        </w:rPr>
+      </w:pPr>
+    </w:p>
+    <w:p>
+      <w:pPr>
+        <w:jc w:val="both"/>
+        <w:rPr>
+          <w:lang w:val="es-ES"/>
+        </w:rPr>
+      </w:pPr>
+      <w:r>
+        <w:rPr>
+          <w:lang w:val="es-ES"/>
+        </w:rPr>
+        <w:t xml:space="preserve">El grafico radar ilustra mejor esta situación, así las cosas, al tener una buena cobertura de todas las clases, y generación relativamente equitativa de las clases, se logra una buena performance de la técnica, como </w:t>
+      </w:r>
+      <w:proofErr w:type="spellStart"/>
+      <w:r>
+        <w:rPr>
+          <w:lang w:val="es-ES"/>
+        </w:rPr>
+        <w:t>dataset</w:t>
+      </w:r>
+      <w:proofErr w:type="spellEnd"/>
+      <w:r>
+        <w:rPr>
+          <w:lang w:val="es-ES"/>
+        </w:rPr>
+        <w:t xml:space="preserve"> vecino-basado. </w:t>
+      </w:r>
+    </w:p>
+    <w:p>
+      <w:pPr>
+        <w:jc w:val="both"/>
+        <w:rPr>
+          <w:lang w:val="es-ES"/>
+        </w:rPr>
+      </w:pPr>
     </w:p>
     <w:p>
       <w:pPr>
@@ -2358,7 +2524,7 @@
                     </pic:cNvPicPr>
                   </pic:nvPicPr>
                   <pic:blipFill>
-                    <a:blip r:embed="rId10">
+                    <a:blip r:embed="rId11">
                       <a:extLst>
                         <a:ext uri="{28A0092B-C50C-407E-A947-70E740481C1C}">
                           <a14:useLocalDpi xmlns:a14="http://schemas.microsoft.com/office/drawing/2010/main" val="0"/>
@@ -2413,6 +2579,108 @@
     </w:p>
     <w:p>
       <w:pPr>
+        <w:jc w:val="both"/>
+        <w:rPr>
+          <w:lang w:val="es-ES"/>
+        </w:rPr>
+      </w:pPr>
+      <w:r>
+        <w:t xml:space="preserve">En el </w:t>
+      </w:r>
+      <w:proofErr w:type="spellStart"/>
+      <w:r>
+        <w:t>dataset</w:t>
+      </w:r>
+      <w:proofErr w:type="spellEnd"/>
+      <w:r>
+        <w:t xml:space="preserve"> </w:t>
+      </w:r>
+      <w:proofErr w:type="spellStart"/>
+      <w:r>
+        <w:rPr>
+          <w:i/>
+          <w:iCs/>
+        </w:rPr>
+        <w:t>glass</w:t>
+      </w:r>
+      <w:proofErr w:type="spellEnd"/>
+      <w:r>
+        <w:t xml:space="preserve"> se observa que las configuraciones evaluadas de PC-SMOTE logran, en términos generales, </w:t>
+      </w:r>
+      <w:r>
+        <w:rPr>
+          <w:b/>
+          <w:bCs/>
+        </w:rPr>
+        <w:t xml:space="preserve">igualar o superar el desempeño del clasificador entrenado sin </w:t>
+      </w:r>
+      <w:proofErr w:type="spellStart"/>
+      <w:r>
+        <w:rPr>
+          <w:b/>
+          <w:bCs/>
+        </w:rPr>
+        <w:t>sobremuestreo</w:t>
+      </w:r>
+      <w:proofErr w:type="spellEnd"/>
+      <w:r>
+        <w:t xml:space="preserve">, lo cual resulta un aspecto destacable considerando la complejidad estructural del </w:t>
+      </w:r>
+      <w:proofErr w:type="spellStart"/>
+      <w:r>
+        <w:t>dataset</w:t>
+      </w:r>
+      <w:proofErr w:type="spellEnd"/>
+      <w:r>
+        <w:t xml:space="preserve">. Este comportamiento es consistente con lo observado previamente en </w:t>
+      </w:r>
+      <w:proofErr w:type="spellStart"/>
+      <w:r>
+        <w:rPr>
+          <w:i/>
+          <w:iCs/>
+        </w:rPr>
+        <w:t>us_crime</w:t>
+      </w:r>
+      <w:proofErr w:type="spellEnd"/>
+      <w:r>
+        <w:t xml:space="preserve">, </w:t>
+      </w:r>
+      <w:proofErr w:type="spellStart"/>
+      <w:r>
+        <w:rPr>
+          <w:i/>
+          <w:iCs/>
+        </w:rPr>
+        <w:t>telco_churn</w:t>
+      </w:r>
+      <w:proofErr w:type="spellEnd"/>
+      <w:r>
+        <w:t xml:space="preserve"> y </w:t>
+      </w:r>
+      <w:proofErr w:type="spellStart"/>
+      <w:r>
+        <w:rPr>
+          <w:i/>
+          <w:iCs/>
+        </w:rPr>
+        <w:t>ecoli</w:t>
+      </w:r>
+      <w:proofErr w:type="spellEnd"/>
+      <w:r>
+        <w:t xml:space="preserve">, donde PC-SMOTE consigue competir de manera efectiva contra el </w:t>
+      </w:r>
+      <w:proofErr w:type="spellStart"/>
+      <w:r>
+        <w:t>baseline</w:t>
+      </w:r>
+      <w:proofErr w:type="spellEnd"/>
+      <w:r>
+        <w:t>, aun cuando las mejoras absolutas no siempre son pronunciadas.</w:t>
+      </w:r>
+    </w:p>
+    <w:p>
+      <w:pPr>
         <w:rPr>
           <w:lang w:val="es-ES"/>
         </w:rPr>
@@ -2439,7 +2707,7 @@
                     </pic:cNvPicPr>
                   </pic:nvPicPr>
                   <pic:blipFill>
-                    <a:blip r:embed="rId11">
+                    <a:blip r:embed="rId12">
                       <a:extLst>
                         <a:ext uri="{28A0092B-C50C-407E-A947-70E740481C1C}">
                           <a14:useLocalDpi xmlns:a14="http://schemas.microsoft.com/office/drawing/2010/main" val="0"/>
@@ -2485,7 +2753,7 @@
         <w:tblLook w:val="04A0" w:firstRow="1" w:lastRow="0" w:firstColumn="1" w:lastColumn="0" w:noHBand="0" w:noVBand="1"/>
       </w:tblPr>
       <w:tblGrid>
-        <w:gridCol w:w="10456"/>
+        <w:gridCol w:w="10790"/>
       </w:tblGrid>
       <w:tr>
         <w:tc>
@@ -2557,13 +2825,8 @@
               </w:numPr>
             </w:pPr>
             <w:r>
-              <w:t xml:space="preserve">Distribución de </w:t>
-            </w:r>
-            <w:proofErr w:type="spellStart"/>
-            <w:r>
-              <w:t>clases:</w:t>
-            </w:r>
-            <w:proofErr w:type="spellEnd"/>
+              <w:t>Distribución de clases:</w:t>
+            </w:r>
           </w:p>
           <w:p>
             <w:pPr>
@@ -2643,7 +2906,7 @@
                     </pic:cNvPicPr>
                   </pic:nvPicPr>
                   <pic:blipFill>
-                    <a:blip r:embed="rId12">
+                    <a:blip r:embed="rId13">
                       <a:extLst>
                         <a:ext uri="{28A0092B-C50C-407E-A947-70E740481C1C}">
                           <a14:useLocalDpi xmlns:a14="http://schemas.microsoft.com/office/drawing/2010/main" val="0"/>
@@ -2739,7 +3002,7 @@
                     </pic:cNvPicPr>
                   </pic:nvPicPr>
                   <pic:blipFill>
-                    <a:blip r:embed="rId13">
+                    <a:blip r:embed="rId14">
                       <a:extLst>
                         <a:ext uri="{28A0092B-C50C-407E-A947-70E740481C1C}">
                           <a14:useLocalDpi xmlns:a14="http://schemas.microsoft.com/office/drawing/2010/main" val="0"/>
@@ -2785,7 +3048,7 @@
         <w:tblLook w:val="04A0" w:firstRow="1" w:lastRow="0" w:firstColumn="1" w:lastColumn="0" w:noHBand="0" w:noVBand="1"/>
       </w:tblPr>
       <w:tblGrid>
-        <w:gridCol w:w="10456"/>
+        <w:gridCol w:w="10790"/>
       </w:tblGrid>
       <w:tr>
         <w:tc>
@@ -2884,6 +3147,68 @@
     <w:p>
       <w:pPr>
         <w:rPr>
+          <w:lang w:val="es-ES"/>
+        </w:rPr>
+      </w:pPr>
+      <w:r>
+        <w:rPr>
+          <w:noProof/>
+          <w:lang w:val="es-ES"/>
+        </w:rPr>
+        <w:lastRenderedPageBreak/>
+        <w:drawing>
+          <wp:inline distT="0" distB="0" distL="0" distR="0" wp14:anchorId="2C1051DD" wp14:editId="6753C82D">
+            <wp:extent cx="6638290" cy="3948430"/>
+            <wp:effectExtent l="0" t="0" r="0" b="0"/>
+            <wp:docPr id="1998698907" name="Imagen 2"/>
+            <wp:cNvGraphicFramePr>
+              <a:graphicFrameLocks xmlns:a="http://schemas.openxmlformats.org/drawingml/2006/main" noChangeAspect="1"/>
+            </wp:cNvGraphicFramePr>
+            <a:graphic xmlns:a="http://schemas.openxmlformats.org/drawingml/2006/main">
+              <a:graphicData uri="http://schemas.openxmlformats.org/drawingml/2006/picture">
+                <pic:pic xmlns:pic="http://schemas.openxmlformats.org/drawingml/2006/picture">
+                  <pic:nvPicPr>
+                    <pic:cNvPr id="0" name="Picture 3"/>
+                    <pic:cNvPicPr>
+                      <a:picLocks noChangeAspect="1" noChangeArrowheads="1"/>
+                    </pic:cNvPicPr>
+                  </pic:nvPicPr>
+                  <pic:blipFill>
+                    <a:blip r:embed="rId15">
+                      <a:extLst>
+                        <a:ext uri="{28A0092B-C50C-407E-A947-70E740481C1C}">
+                          <a14:useLocalDpi xmlns:a14="http://schemas.microsoft.com/office/drawing/2010/main" val="0"/>
+                        </a:ext>
+                      </a:extLst>
+                    </a:blip>
+                    <a:srcRect/>
+                    <a:stretch>
+                      <a:fillRect/>
+                    </a:stretch>
+                  </pic:blipFill>
+                  <pic:spPr bwMode="auto">
+                    <a:xfrm>
+                      <a:off x="0" y="0"/>
+                      <a:ext cx="6638290" cy="3948430"/>
+                    </a:xfrm>
+                    <a:prstGeom prst="rect">
+                      <a:avLst/>
+                    </a:prstGeom>
+                    <a:noFill/>
+                    <a:ln>
+                      <a:noFill/>
+                    </a:ln>
+                  </pic:spPr>
+                </pic:pic>
+              </a:graphicData>
+            </a:graphic>
+          </wp:inline>
+        </w:drawing>
+      </w:r>
+    </w:p>
+    <w:p>
+      <w:pPr>
+        <w:rPr>
           <w:b/>
           <w:bCs/>
         </w:rPr>
@@ -2892,7 +3217,6 @@
         <w:rPr>
           <w:noProof/>
         </w:rPr>
-        <w:lastRenderedPageBreak/>
         <w:drawing>
           <wp:inline distT="0" distB="0" distL="0" distR="0" wp14:anchorId="328DAAD4" wp14:editId="339B5A1E">
             <wp:extent cx="6858000" cy="4136390"/>
@@ -2911,7 +3235,7 @@
                     </pic:cNvPicPr>
                   </pic:nvPicPr>
                   <pic:blipFill>
-                    <a:blip r:embed="rId14">
+                    <a:blip r:embed="rId16">
                       <a:extLst>
                         <a:ext uri="{28A0092B-C50C-407E-A947-70E740481C1C}">
                           <a14:useLocalDpi xmlns:a14="http://schemas.microsoft.com/office/drawing/2010/main" val="0"/>
@@ -3034,298 +3358,6 @@
                 <pic:pic xmlns:pic="http://schemas.openxmlformats.org/drawingml/2006/picture">
                   <pic:nvPicPr>
                     <pic:cNvPr id="0" name="Picture 20"/>
-                    <pic:cNvPicPr>
-                      <a:picLocks noChangeAspect="1" noChangeArrowheads="1"/>
-                    </pic:cNvPicPr>
-                  </pic:nvPicPr>
-                  <pic:blipFill>
-                    <a:blip r:embed="rId15">
-                      <a:extLst>
-                        <a:ext uri="{28A0092B-C50C-407E-A947-70E740481C1C}">
-                          <a14:useLocalDpi xmlns:a14="http://schemas.microsoft.com/office/drawing/2010/main" val="0"/>
-                        </a:ext>
-                      </a:extLst>
-                    </a:blip>
-                    <a:srcRect/>
-                    <a:stretch>
-                      <a:fillRect/>
-                    </a:stretch>
-                  </pic:blipFill>
-                  <pic:spPr bwMode="auto">
-                    <a:xfrm>
-                      <a:off x="0" y="0"/>
-                      <a:ext cx="6858000" cy="2191385"/>
-                    </a:xfrm>
-                    <a:prstGeom prst="rect">
-                      <a:avLst/>
-                    </a:prstGeom>
-                    <a:noFill/>
-                    <a:ln>
-                      <a:noFill/>
-                    </a:ln>
-                  </pic:spPr>
-                </pic:pic>
-              </a:graphicData>
-            </a:graphic>
-          </wp:inline>
-        </w:drawing>
-      </w:r>
-    </w:p>
-    <w:p>
-      <w:pPr>
-        <w:rPr>
-          <w:lang w:val="es-ES"/>
-        </w:rPr>
-      </w:pPr>
-    </w:p>
-    <w:tbl>
-      <w:tblPr>
-        <w:tblStyle w:val="Tablaconcuadrcula"/>
-        <w:tblW w:w="0" w:type="auto"/>
-        <w:tblLook w:val="04A0" w:firstRow="1" w:lastRow="0" w:firstColumn="1" w:lastColumn="0" w:noHBand="0" w:noVBand="1"/>
-      </w:tblPr>
-      <w:tblGrid>
-        <w:gridCol w:w="10456"/>
-      </w:tblGrid>
-      <w:tr>
-        <w:tc>
-          <w:tcPr>
-            <w:tcW w:w="10790" w:type="dxa"/>
-          </w:tcPr>
-          <w:p>
-            <w:pPr>
-              <w:rPr>
-                <w:lang w:val="es-ES"/>
-              </w:rPr>
-            </w:pPr>
-            <w:r>
-              <w:rPr>
-                <w:lang w:val="es-ES"/>
-              </w:rPr>
-              <w:t>WDBC</w:t>
-            </w:r>
-          </w:p>
-        </w:tc>
-      </w:tr>
-      <w:tr>
-        <w:tc>
-          <w:tcPr>
-            <w:tcW w:w="10790" w:type="dxa"/>
-          </w:tcPr>
-          <w:p>
-            <w:pPr>
-              <w:pStyle w:val="Prrafodelista"/>
-              <w:numPr>
-                <w:ilvl w:val="0"/>
-                <w:numId w:val="2"/>
-              </w:numPr>
-            </w:pPr>
-            <w:r>
-              <w:t xml:space="preserve">Valores únicos del </w:t>
-            </w:r>
-            <w:proofErr w:type="gramStart"/>
-            <w:r>
-              <w:t>target</w:t>
-            </w:r>
-            <w:proofErr w:type="gramEnd"/>
-            <w:r>
-              <w:t>: ['B', 'M']</w:t>
-            </w:r>
-          </w:p>
-          <w:p>
-            <w:pPr>
-              <w:pStyle w:val="Prrafodelista"/>
-              <w:numPr>
-                <w:ilvl w:val="0"/>
-                <w:numId w:val="2"/>
-              </w:numPr>
-            </w:pPr>
-            <w:r>
-              <w:t>Distribución de clases:</w:t>
-            </w:r>
-          </w:p>
-          <w:p>
-            <w:pPr>
-              <w:pStyle w:val="Prrafodelista"/>
-              <w:numPr>
-                <w:ilvl w:val="1"/>
-                <w:numId w:val="2"/>
-              </w:numPr>
-            </w:pPr>
-            <w:r>
-              <w:t>B: 357 (62.74%)</w:t>
-            </w:r>
-          </w:p>
-          <w:p>
-            <w:pPr>
-              <w:pStyle w:val="Prrafodelista"/>
-              <w:numPr>
-                <w:ilvl w:val="1"/>
-                <w:numId w:val="2"/>
-              </w:numPr>
-            </w:pPr>
-            <w:r>
-              <w:t>M: 212 (37.26%)</w:t>
-            </w:r>
-          </w:p>
-        </w:tc>
-      </w:tr>
-    </w:tbl>
-    <w:p>
-      <w:pPr>
-        <w:rPr>
-          <w:lang w:val="es-ES"/>
-        </w:rPr>
-      </w:pPr>
-    </w:p>
-    <w:p>
-      <w:pPr>
-        <w:rPr>
-          <w:b/>
-          <w:bCs/>
-          <w:lang w:val="es-ES"/>
-        </w:rPr>
-      </w:pPr>
-      <w:r>
-        <w:rPr>
-          <w:noProof/>
-        </w:rPr>
-        <w:lastRenderedPageBreak/>
-        <w:drawing>
-          <wp:inline distT="0" distB="0" distL="0" distR="0" wp14:anchorId="369A2014" wp14:editId="037DE973">
-            <wp:extent cx="6858000" cy="4023360"/>
-            <wp:effectExtent l="0" t="0" r="0" b="0"/>
-            <wp:docPr id="23" name="Imagen 23"/>
-            <wp:cNvGraphicFramePr>
-              <a:graphicFrameLocks xmlns:a="http://schemas.openxmlformats.org/drawingml/2006/main" noChangeAspect="1"/>
-            </wp:cNvGraphicFramePr>
-            <a:graphic xmlns:a="http://schemas.openxmlformats.org/drawingml/2006/main">
-              <a:graphicData uri="http://schemas.openxmlformats.org/drawingml/2006/picture">
-                <pic:pic xmlns:pic="http://schemas.openxmlformats.org/drawingml/2006/picture">
-                  <pic:nvPicPr>
-                    <pic:cNvPr id="0" name="Picture 29"/>
-                    <pic:cNvPicPr>
-                      <a:picLocks noChangeAspect="1" noChangeArrowheads="1"/>
-                    </pic:cNvPicPr>
-                  </pic:nvPicPr>
-                  <pic:blipFill>
-                    <a:blip r:embed="rId16">
-                      <a:extLst>
-                        <a:ext uri="{28A0092B-C50C-407E-A947-70E740481C1C}">
-                          <a14:useLocalDpi xmlns:a14="http://schemas.microsoft.com/office/drawing/2010/main" val="0"/>
-                        </a:ext>
-                      </a:extLst>
-                    </a:blip>
-                    <a:srcRect/>
-                    <a:stretch>
-                      <a:fillRect/>
-                    </a:stretch>
-                  </pic:blipFill>
-                  <pic:spPr bwMode="auto">
-                    <a:xfrm>
-                      <a:off x="0" y="0"/>
-                      <a:ext cx="6858000" cy="4023360"/>
-                    </a:xfrm>
-                    <a:prstGeom prst="rect">
-                      <a:avLst/>
-                    </a:prstGeom>
-                    <a:noFill/>
-                    <a:ln>
-                      <a:noFill/>
-                    </a:ln>
-                  </pic:spPr>
-                </pic:pic>
-              </a:graphicData>
-            </a:graphic>
-          </wp:inline>
-        </w:drawing>
-      </w:r>
-    </w:p>
-    <w:p>
-      <w:pPr>
-        <w:jc w:val="both"/>
-      </w:pPr>
-      <w:r>
-        <w:rPr>
-          <w:b/>
-          <w:bCs/>
-          <w:lang w:val="es-ES"/>
-        </w:rPr>
-        <w:t>Análisis en performance:</w:t>
-      </w:r>
-      <w:r>
-        <w:t xml:space="preserve"> se puede observar un salto en performance donde se redujo el porcentaje en el umbral de densidad, lo cual permitió captar 5 semillas candidatas, si bien no genero </w:t>
-      </w:r>
-      <w:proofErr w:type="spellStart"/>
-      <w:r>
-        <w:t>mas</w:t>
-      </w:r>
-      <w:proofErr w:type="spellEnd"/>
-      <w:r>
-        <w:t xml:space="preserve"> sintéticos, se redistribuyeron mejor la generación de sintéticos permitiendo generar esa mejora marginal en el rendimiento del clasificador. </w:t>
-      </w:r>
-    </w:p>
-    <w:p>
-      <w:pPr>
-        <w:jc w:val="both"/>
-      </w:pPr>
-      <w:r>
-        <w:t xml:space="preserve">Se puede observar también que, acá gano en performance ADASYN. </w:t>
-      </w:r>
-    </w:p>
-    <w:p>
-      <w:pPr>
-        <w:jc w:val="both"/>
-      </w:pPr>
-      <w:r>
-        <w:t>Es de destacar que otras configuraciones de PCSMOTE también tienen pequeños saltos de mejora en la generalización, lo cual da una noci</w:t>
-      </w:r>
-      <w:r>
-        <w:t>ó</w:t>
-      </w:r>
-      <w:r>
-        <w:t xml:space="preserve">n de que la técnica tiene </w:t>
-      </w:r>
-      <w:proofErr w:type="spellStart"/>
-      <w:r>
-        <w:t>mas</w:t>
-      </w:r>
-      <w:proofErr w:type="spellEnd"/>
-      <w:r>
-        <w:t xml:space="preserve"> de una manera de </w:t>
-      </w:r>
-      <w:r>
-        <w:t xml:space="preserve">trabajar y no solo una mejora aleatoria. </w:t>
-      </w:r>
-    </w:p>
-    <w:p>
-      <w:pPr>
-        <w:jc w:val="both"/>
-      </w:pPr>
-    </w:p>
-    <w:p>
-      <w:pPr>
-        <w:rPr>
-          <w:lang w:val="es-ES"/>
-        </w:rPr>
-      </w:pPr>
-      <w:r>
-        <w:rPr>
-          <w:noProof/>
-        </w:rPr>
-        <w:drawing>
-          <wp:inline distT="0" distB="0" distL="0" distR="0" wp14:anchorId="3D14ED5C" wp14:editId="18E3068B">
-            <wp:extent cx="6858000" cy="2191385"/>
-            <wp:effectExtent l="0" t="0" r="0" b="0"/>
-            <wp:docPr id="16" name="Imagen 16"/>
-            <wp:cNvGraphicFramePr>
-              <a:graphicFrameLocks xmlns:a="http://schemas.openxmlformats.org/drawingml/2006/main" noChangeAspect="1"/>
-            </wp:cNvGraphicFramePr>
-            <a:graphic xmlns:a="http://schemas.openxmlformats.org/drawingml/2006/main">
-              <a:graphicData uri="http://schemas.openxmlformats.org/drawingml/2006/picture">
-                <pic:pic xmlns:pic="http://schemas.openxmlformats.org/drawingml/2006/picture">
-                  <pic:nvPicPr>
-                    <pic:cNvPr id="0" name="Picture 19"/>
                     <pic:cNvPicPr>
                       <a:picLocks noChangeAspect="1" noChangeArrowheads="1"/>
                     </pic:cNvPicPr>
@@ -3370,41 +3402,6 @@
         </w:rPr>
       </w:pPr>
     </w:p>
-    <w:p>
-      <w:pPr>
-        <w:rPr>
-          <w:lang w:val="es-ES"/>
-        </w:rPr>
-      </w:pPr>
-    </w:p>
-    <w:p>
-      <w:pPr>
-        <w:rPr>
-          <w:lang w:val="es-ES"/>
-        </w:rPr>
-      </w:pPr>
-    </w:p>
-    <w:p>
-      <w:pPr>
-        <w:rPr>
-          <w:lang w:val="es-ES"/>
-        </w:rPr>
-      </w:pPr>
-    </w:p>
-    <w:p>
-      <w:pPr>
-        <w:rPr>
-          <w:lang w:val="es-ES"/>
-        </w:rPr>
-      </w:pPr>
-    </w:p>
-    <w:p>
-      <w:pPr>
-        <w:rPr>
-          <w:lang w:val="es-ES"/>
-        </w:rPr>
-      </w:pPr>
-    </w:p>
     <w:tbl>
       <w:tblPr>
         <w:tblStyle w:val="Tablaconcuadrcula"/>
@@ -3412,7 +3409,7 @@
         <w:tblLook w:val="04A0" w:firstRow="1" w:lastRow="0" w:firstColumn="1" w:lastColumn="0" w:noHBand="0" w:noVBand="1"/>
       </w:tblPr>
       <w:tblGrid>
-        <w:gridCol w:w="10456"/>
+        <w:gridCol w:w="10790"/>
       </w:tblGrid>
       <w:tr>
         <w:tc>
@@ -3429,8 +3426,7 @@
               <w:rPr>
                 <w:lang w:val="es-ES"/>
               </w:rPr>
-              <w:lastRenderedPageBreak/>
-              <w:t>HEART</w:t>
+              <w:t>WDBC</w:t>
             </w:r>
           </w:p>
         </w:tc>
@@ -3445,10 +3441,11 @@
               <w:pStyle w:val="Prrafodelista"/>
               <w:numPr>
                 <w:ilvl w:val="0"/>
-                <w:numId w:val="3"/>
+                <w:numId w:val="2"/>
               </w:numPr>
             </w:pPr>
             <w:r>
+              <w:lastRenderedPageBreak/>
               <w:t xml:space="preserve">Valores únicos del </w:t>
             </w:r>
             <w:proofErr w:type="gramStart"/>
@@ -3457,7 +3454,7 @@
             </w:r>
             <w:proofErr w:type="gramEnd"/>
             <w:r>
-              <w:t>: [0, 1, 2, 3, 4]</w:t>
+              <w:t>: ['B', 'M']</w:t>
             </w:r>
           </w:p>
           <w:p>
@@ -3465,7 +3462,7 @@
               <w:pStyle w:val="Prrafodelista"/>
               <w:numPr>
                 <w:ilvl w:val="0"/>
-                <w:numId w:val="3"/>
+                <w:numId w:val="2"/>
               </w:numPr>
             </w:pPr>
             <w:r>
@@ -3477,11 +3474,11 @@
               <w:pStyle w:val="Prrafodelista"/>
               <w:numPr>
                 <w:ilvl w:val="1"/>
-                <w:numId w:val="3"/>
+                <w:numId w:val="2"/>
               </w:numPr>
             </w:pPr>
             <w:r>
-              <w:t>0: 164 (54.13%)</w:t>
+              <w:t>B: 357 (62.74%)</w:t>
             </w:r>
           </w:p>
           <w:p>
@@ -3489,47 +3486,11 @@
               <w:pStyle w:val="Prrafodelista"/>
               <w:numPr>
                 <w:ilvl w:val="1"/>
-                <w:numId w:val="3"/>
+                <w:numId w:val="2"/>
               </w:numPr>
             </w:pPr>
             <w:r>
-              <w:t>1: 55 (18.15%)</w:t>
-            </w:r>
-          </w:p>
-          <w:p>
-            <w:pPr>
-              <w:pStyle w:val="Prrafodelista"/>
-              <w:numPr>
-                <w:ilvl w:val="1"/>
-                <w:numId w:val="3"/>
-              </w:numPr>
-            </w:pPr>
-            <w:r>
-              <w:t>2: 36 (11.88%)</w:t>
-            </w:r>
-          </w:p>
-          <w:p>
-            <w:pPr>
-              <w:pStyle w:val="Prrafodelista"/>
-              <w:numPr>
-                <w:ilvl w:val="1"/>
-                <w:numId w:val="3"/>
-              </w:numPr>
-            </w:pPr>
-            <w:r>
-              <w:t>3: 35 (11.55%)</w:t>
-            </w:r>
-          </w:p>
-          <w:p>
-            <w:pPr>
-              <w:pStyle w:val="Prrafodelista"/>
-              <w:numPr>
-                <w:ilvl w:val="1"/>
-                <w:numId w:val="3"/>
-              </w:numPr>
-            </w:pPr>
-            <w:r>
-              <w:t>4: 13 (4.29%)</w:t>
+              <w:t>M: 212 (37.26%)</w:t>
             </w:r>
           </w:p>
         </w:tc>
@@ -3555,10 +3516,10 @@
           <w:noProof/>
         </w:rPr>
         <w:drawing>
-          <wp:inline distT="0" distB="0" distL="0" distR="0" wp14:anchorId="6B399902" wp14:editId="2E3CD18B">
+          <wp:inline distT="0" distB="0" distL="0" distR="0" wp14:anchorId="369A2014" wp14:editId="037DE973">
             <wp:extent cx="6858000" cy="4023360"/>
             <wp:effectExtent l="0" t="0" r="0" b="0"/>
-            <wp:docPr id="24" name="Imagen 24"/>
+            <wp:docPr id="23" name="Imagen 23"/>
             <wp:cNvGraphicFramePr>
               <a:graphicFrameLocks xmlns:a="http://schemas.openxmlformats.org/drawingml/2006/main" noChangeAspect="1"/>
             </wp:cNvGraphicFramePr>
@@ -3566,7 +3527,7 @@
               <a:graphicData uri="http://schemas.openxmlformats.org/drawingml/2006/picture">
                 <pic:pic xmlns:pic="http://schemas.openxmlformats.org/drawingml/2006/picture">
                   <pic:nvPicPr>
-                    <pic:cNvPr id="0" name="Picture 31"/>
+                    <pic:cNvPr id="0" name="Picture 29"/>
                     <pic:cNvPicPr>
                       <a:picLocks noChangeAspect="1" noChangeArrowheads="1"/>
                     </pic:cNvPicPr>
@@ -3607,9 +3568,6 @@
     <w:p>
       <w:pPr>
         <w:jc w:val="both"/>
-        <w:rPr>
-          <w:lang w:val="es-ES"/>
-        </w:rPr>
       </w:pPr>
       <w:r>
         <w:rPr>
@@ -3620,62 +3578,714 @@
         <w:t>Análisis en performance:</w:t>
       </w:r>
       <w:r>
-        <w:rPr>
-          <w:lang w:val="es-ES"/>
-        </w:rPr>
-        <w:t xml:space="preserve"> este junto con </w:t>
-      </w:r>
-      <w:proofErr w:type="spellStart"/>
-      <w:r>
-        <w:rPr>
-          <w:i/>
-          <w:iCs/>
-          <w:lang w:val="es-ES"/>
-        </w:rPr>
-        <w:t>predict_fault</w:t>
-      </w:r>
-      <w:proofErr w:type="spellEnd"/>
-      <w:r>
-        <w:rPr>
-          <w:i/>
-          <w:iCs/>
+        <w:t xml:space="preserve"> se puede observar un salto en performance donde se redujo el porcentaje en el umbral de densidad, lo cual permitió captar 5 semillas candidatas, si bien no genero </w:t>
+      </w:r>
+      <w:proofErr w:type="spellStart"/>
+      <w:r>
+        <w:t>mas</w:t>
+      </w:r>
+      <w:proofErr w:type="spellEnd"/>
+      <w:r>
+        <w:t xml:space="preserve"> sintéticos, se redistribuyeron mejor la generación de sintéticos permitiendo generar esa mejora marginal en el rendimiento del clasificador. </w:t>
+      </w:r>
+    </w:p>
+    <w:p>
+      <w:pPr>
+        <w:jc w:val="both"/>
+      </w:pPr>
+      <w:r>
+        <w:t xml:space="preserve">Se puede observar también que, acá gano en performance ADASYN. </w:t>
+      </w:r>
+    </w:p>
+    <w:p>
+      <w:pPr>
+        <w:jc w:val="both"/>
+      </w:pPr>
+      <w:r>
+        <w:t>Es de destacar que otras configuraciones de PCSMOTE también tienen pequeños saltos de mejora en la generalización, lo cual da una noci</w:t>
+      </w:r>
+      <w:r>
+        <w:t>ó</w:t>
+      </w:r>
+      <w:r>
+        <w:t xml:space="preserve">n de que la técnica tiene </w:t>
+      </w:r>
+      <w:proofErr w:type="spellStart"/>
+      <w:r>
+        <w:t>mas</w:t>
+      </w:r>
+      <w:proofErr w:type="spellEnd"/>
+      <w:r>
+        <w:t xml:space="preserve"> de una manera de </w:t>
+      </w:r>
+      <w:r>
+        <w:t xml:space="preserve">trabajar y no solo una mejora aleatoria. </w:t>
+      </w:r>
+    </w:p>
+    <w:p>
+      <w:pPr>
+        <w:jc w:val="both"/>
+      </w:pPr>
+    </w:p>
+    <w:p>
+      <w:pPr>
+        <w:rPr>
+          <w:lang w:val="es-ES"/>
+        </w:rPr>
+      </w:pPr>
+      <w:r>
+        <w:rPr>
+          <w:noProof/>
+        </w:rPr>
+        <w:drawing>
+          <wp:inline distT="0" distB="0" distL="0" distR="0" wp14:anchorId="3D14ED5C" wp14:editId="18E3068B">
+            <wp:extent cx="6858000" cy="2191385"/>
+            <wp:effectExtent l="0" t="0" r="0" b="0"/>
+            <wp:docPr id="16" name="Imagen 16"/>
+            <wp:cNvGraphicFramePr>
+              <a:graphicFrameLocks xmlns:a="http://schemas.openxmlformats.org/drawingml/2006/main" noChangeAspect="1"/>
+            </wp:cNvGraphicFramePr>
+            <a:graphic xmlns:a="http://schemas.openxmlformats.org/drawingml/2006/main">
+              <a:graphicData uri="http://schemas.openxmlformats.org/drawingml/2006/picture">
+                <pic:pic xmlns:pic="http://schemas.openxmlformats.org/drawingml/2006/picture">
+                  <pic:nvPicPr>
+                    <pic:cNvPr id="0" name="Picture 19"/>
+                    <pic:cNvPicPr>
+                      <a:picLocks noChangeAspect="1" noChangeArrowheads="1"/>
+                    </pic:cNvPicPr>
+                  </pic:nvPicPr>
+                  <pic:blipFill>
+                    <a:blip r:embed="rId19">
+                      <a:extLst>
+                        <a:ext uri="{28A0092B-C50C-407E-A947-70E740481C1C}">
+                          <a14:useLocalDpi xmlns:a14="http://schemas.microsoft.com/office/drawing/2010/main" val="0"/>
+                        </a:ext>
+                      </a:extLst>
+                    </a:blip>
+                    <a:srcRect/>
+                    <a:stretch>
+                      <a:fillRect/>
+                    </a:stretch>
+                  </pic:blipFill>
+                  <pic:spPr bwMode="auto">
+                    <a:xfrm>
+                      <a:off x="0" y="0"/>
+                      <a:ext cx="6858000" cy="2191385"/>
+                    </a:xfrm>
+                    <a:prstGeom prst="rect">
+                      <a:avLst/>
+                    </a:prstGeom>
+                    <a:noFill/>
+                    <a:ln>
+                      <a:noFill/>
+                    </a:ln>
+                  </pic:spPr>
+                </pic:pic>
+              </a:graphicData>
+            </a:graphic>
+          </wp:inline>
+        </w:drawing>
+      </w:r>
+    </w:p>
+    <w:p>
+      <w:pPr>
+        <w:rPr>
+          <w:lang w:val="es-ES"/>
+        </w:rPr>
+      </w:pPr>
+    </w:p>
+    <w:p>
+      <w:pPr>
+        <w:rPr>
+          <w:lang w:val="es-ES"/>
+        </w:rPr>
+      </w:pPr>
+    </w:p>
+    <w:p>
+      <w:pPr>
+        <w:rPr>
+          <w:lang w:val="es-ES"/>
+        </w:rPr>
+      </w:pPr>
+    </w:p>
+    <w:p>
+      <w:pPr>
+        <w:rPr>
+          <w:lang w:val="es-ES"/>
+        </w:rPr>
+      </w:pPr>
+    </w:p>
+    <w:p>
+      <w:pPr>
+        <w:rPr>
+          <w:lang w:val="es-ES"/>
+        </w:rPr>
+      </w:pPr>
+    </w:p>
+    <w:p>
+      <w:pPr>
+        <w:rPr>
+          <w:lang w:val="es-ES"/>
+        </w:rPr>
+      </w:pPr>
+    </w:p>
+    <w:p>
+      <w:pPr>
+        <w:rPr>
+          <w:lang w:val="es-ES"/>
+        </w:rPr>
+      </w:pPr>
+    </w:p>
+    <w:p>
+      <w:pPr>
+        <w:rPr>
+          <w:lang w:val="es-ES"/>
+        </w:rPr>
+      </w:pPr>
+    </w:p>
+    <w:p>
+      <w:pPr>
+        <w:rPr>
+          <w:lang w:val="es-ES"/>
+        </w:rPr>
+      </w:pPr>
+    </w:p>
+    <w:p>
+      <w:pPr>
+        <w:rPr>
+          <w:lang w:val="es-ES"/>
+        </w:rPr>
+      </w:pPr>
+    </w:p>
+    <w:p>
+      <w:pPr>
+        <w:rPr>
+          <w:lang w:val="es-ES"/>
+        </w:rPr>
+      </w:pPr>
+    </w:p>
+    <w:p>
+      <w:pPr>
+        <w:rPr>
+          <w:lang w:val="es-ES"/>
+        </w:rPr>
+      </w:pPr>
+    </w:p>
+    <w:p>
+      <w:pPr>
+        <w:rPr>
+          <w:lang w:val="es-ES"/>
+        </w:rPr>
+      </w:pPr>
+    </w:p>
+    <w:tbl>
+      <w:tblPr>
+        <w:tblStyle w:val="Tablaconcuadrcula"/>
+        <w:tblW w:w="0" w:type="auto"/>
+        <w:tblLook w:val="04A0" w:firstRow="1" w:lastRow="0" w:firstColumn="1" w:lastColumn="0" w:noHBand="0" w:noVBand="1"/>
+      </w:tblPr>
+      <w:tblGrid>
+        <w:gridCol w:w="10456"/>
+      </w:tblGrid>
+      <w:tr>
+        <w:tc>
+          <w:tcPr>
+            <w:tcW w:w="10456" w:type="dxa"/>
+          </w:tcPr>
+          <w:p>
+            <w:pPr>
+              <w:rPr>
+                <w:lang w:val="es-ES"/>
+              </w:rPr>
+            </w:pPr>
+            <w:r>
+              <w:rPr>
+                <w:lang w:val="es-ES"/>
+              </w:rPr>
+              <w:t>HEART</w:t>
+            </w:r>
+          </w:p>
+        </w:tc>
+      </w:tr>
+      <w:tr>
+        <w:tc>
+          <w:tcPr>
+            <w:tcW w:w="10456" w:type="dxa"/>
+          </w:tcPr>
+          <w:p>
+            <w:pPr>
+              <w:pStyle w:val="Prrafodelista"/>
+              <w:numPr>
+                <w:ilvl w:val="0"/>
+                <w:numId w:val="3"/>
+              </w:numPr>
+            </w:pPr>
+            <w:r>
+              <w:t xml:space="preserve">Valores únicos del </w:t>
+            </w:r>
+            <w:proofErr w:type="gramStart"/>
+            <w:r>
+              <w:t>target</w:t>
+            </w:r>
+            <w:proofErr w:type="gramEnd"/>
+            <w:r>
+              <w:t>: [0, 1, 2, 3, 4]</w:t>
+            </w:r>
+          </w:p>
+          <w:p>
+            <w:pPr>
+              <w:pStyle w:val="Prrafodelista"/>
+              <w:numPr>
+                <w:ilvl w:val="0"/>
+                <w:numId w:val="3"/>
+              </w:numPr>
+            </w:pPr>
+            <w:r>
+              <w:t>Distribución de clases:</w:t>
+            </w:r>
+          </w:p>
+          <w:p>
+            <w:pPr>
+              <w:pStyle w:val="Prrafodelista"/>
+              <w:numPr>
+                <w:ilvl w:val="1"/>
+                <w:numId w:val="3"/>
+              </w:numPr>
+            </w:pPr>
+            <w:r>
+              <w:t>0: 164 (54.13%)</w:t>
+            </w:r>
+          </w:p>
+          <w:p>
+            <w:pPr>
+              <w:pStyle w:val="Prrafodelista"/>
+              <w:numPr>
+                <w:ilvl w:val="1"/>
+                <w:numId w:val="3"/>
+              </w:numPr>
+            </w:pPr>
+            <w:r>
+              <w:t>1: 55 (18.15%)</w:t>
+            </w:r>
+          </w:p>
+          <w:p>
+            <w:pPr>
+              <w:pStyle w:val="Prrafodelista"/>
+              <w:numPr>
+                <w:ilvl w:val="1"/>
+                <w:numId w:val="3"/>
+              </w:numPr>
+            </w:pPr>
+            <w:r>
+              <w:t>2: 36 (11.88%)</w:t>
+            </w:r>
+          </w:p>
+          <w:p>
+            <w:pPr>
+              <w:pStyle w:val="Prrafodelista"/>
+              <w:numPr>
+                <w:ilvl w:val="1"/>
+                <w:numId w:val="3"/>
+              </w:numPr>
+            </w:pPr>
+            <w:r>
+              <w:t>3: 35 (11.55%)</w:t>
+            </w:r>
+          </w:p>
+          <w:p>
+            <w:pPr>
+              <w:pStyle w:val="Prrafodelista"/>
+              <w:numPr>
+                <w:ilvl w:val="1"/>
+                <w:numId w:val="3"/>
+              </w:numPr>
+            </w:pPr>
+            <w:r>
+              <w:t>4: 13 (4.29%)</w:t>
+            </w:r>
+          </w:p>
+        </w:tc>
+      </w:tr>
+    </w:tbl>
+    <w:p>
+      <w:pPr>
+        <w:rPr>
+          <w:lang w:val="es-ES"/>
+        </w:rPr>
+      </w:pPr>
+    </w:p>
+    <w:p>
+      <w:pPr>
+        <w:rPr>
+          <w:lang w:val="es-ES"/>
+        </w:rPr>
+      </w:pPr>
+      <w:r>
+        <w:rPr>
+          <w:lang w:val="es-ES"/>
+        </w:rPr>
+        <w:t xml:space="preserve">Se puede observar </w:t>
+      </w:r>
+      <w:r>
+        <w:rPr>
+          <w:lang w:val="es-ES"/>
+        </w:rPr>
+        <w:t xml:space="preserve">una falta de cobertura de clases, más allá de que la generación sintética sea equitativa, pero deja sin </w:t>
+      </w:r>
+      <w:proofErr w:type="spellStart"/>
+      <w:r>
+        <w:rPr>
+          <w:lang w:val="es-ES"/>
+        </w:rPr>
+        <w:t>resamplear</w:t>
+      </w:r>
+      <w:proofErr w:type="spellEnd"/>
+      <w:r>
+        <w:rPr>
+          <w:lang w:val="es-ES"/>
+        </w:rPr>
+        <w:t xml:space="preserve"> las clases 3 y 4; esto ilustrado de una mejor manera en el grafico radar produce una baja representatividad del </w:t>
+      </w:r>
+      <w:proofErr w:type="spellStart"/>
+      <w:r>
+        <w:rPr>
+          <w:lang w:val="es-ES"/>
+        </w:rPr>
+        <w:t>dataset</w:t>
+      </w:r>
+      <w:proofErr w:type="spellEnd"/>
+      <w:r>
+        <w:rPr>
+          <w:lang w:val="es-ES"/>
+        </w:rPr>
+        <w:t xml:space="preserve">, y </w:t>
+      </w:r>
+      <w:proofErr w:type="gramStart"/>
+      <w:r>
+        <w:rPr>
+          <w:lang w:val="es-ES"/>
+        </w:rPr>
+        <w:t>poca efecto</w:t>
+      </w:r>
+      <w:proofErr w:type="gramEnd"/>
+      <w:r>
+        <w:rPr>
+          <w:lang w:val="es-ES"/>
+        </w:rPr>
+        <w:t xml:space="preserve"> de </w:t>
+      </w:r>
+      <w:proofErr w:type="spellStart"/>
+      <w:r>
+        <w:rPr>
+          <w:lang w:val="es-ES"/>
+        </w:rPr>
+        <w:t>pcsmote</w:t>
+      </w:r>
+      <w:proofErr w:type="spellEnd"/>
+      <w:r>
+        <w:rPr>
+          <w:lang w:val="es-ES"/>
+        </w:rPr>
+        <w:t xml:space="preserve">. </w:t>
+      </w:r>
+    </w:p>
+    <w:p>
+      <w:pPr>
+        <w:jc w:val="both"/>
+        <w:rPr>
+          <w:lang w:val="es-ES"/>
+        </w:rPr>
+      </w:pPr>
+      <w:r>
+        <w:rPr>
+          <w:lang w:val="es-ES"/>
+        </w:rPr>
+        <w:t xml:space="preserve">Asimismo, de manera análoga a lo observado en el </w:t>
+      </w:r>
+      <w:proofErr w:type="spellStart"/>
+      <w:r>
+        <w:rPr>
+          <w:lang w:val="es-ES"/>
+        </w:rPr>
+        <w:t>dataset</w:t>
+      </w:r>
+      <w:proofErr w:type="spellEnd"/>
+      <w:r>
+        <w:rPr>
           <w:lang w:val="es-ES"/>
         </w:rPr>
         <w:t xml:space="preserve"> </w:t>
       </w:r>
-      <w:r>
-        <w:rPr>
-          <w:lang w:val="es-ES"/>
-        </w:rPr>
-        <w:t xml:space="preserve">son </w:t>
-      </w:r>
-      <w:proofErr w:type="spellStart"/>
-      <w:r>
-        <w:rPr>
-          <w:lang w:val="es-ES"/>
-        </w:rPr>
-        <w:t>datasets</w:t>
-      </w:r>
-      <w:proofErr w:type="spellEnd"/>
-      <w:r>
-        <w:rPr>
-          <w:lang w:val="es-ES"/>
-        </w:rPr>
-        <w:t xml:space="preserve"> extremos donde </w:t>
+      <w:proofErr w:type="spellStart"/>
+      <w:r>
+        <w:rPr>
+          <w:lang w:val="es-ES"/>
+        </w:rPr>
+        <w:t>predict_faults</w:t>
+      </w:r>
+      <w:proofErr w:type="spellEnd"/>
+      <w:r>
+        <w:rPr>
+          <w:lang w:val="es-ES"/>
+        </w:rPr>
+        <w:t xml:space="preserve">, la muy baja cantidad de semillas que superan el filtro de pureza en </w:t>
+      </w:r>
+      <w:proofErr w:type="spellStart"/>
+      <w:r>
+        <w:rPr>
+          <w:lang w:val="es-ES"/>
+        </w:rPr>
+        <w:t>heart</w:t>
+      </w:r>
+      <w:proofErr w:type="spellEnd"/>
+      <w:r>
+        <w:rPr>
+          <w:lang w:val="es-ES"/>
+        </w:rPr>
+        <w:t xml:space="preserve"> evidencia que los vecindarios locales son altamente impuros desde el punto de vista geométrico. Esta condición limita severamente la capacidad del método para identificar regiones representativas de cada clase minoritaria, impidiendo una generación sintética efectiva. En consecuencia, aun cuando la generación resultante pueda parecer equitativa en términos relativos, la cobertura de clases es incompleta, dejando sin </w:t>
+      </w:r>
+      <w:proofErr w:type="spellStart"/>
+      <w:r>
+        <w:rPr>
+          <w:lang w:val="es-ES"/>
+        </w:rPr>
+        <w:t>sobremuestreo</w:t>
+      </w:r>
+      <w:proofErr w:type="spellEnd"/>
+      <w:r>
+        <w:rPr>
+          <w:lang w:val="es-ES"/>
+        </w:rPr>
+        <w:t xml:space="preserve"> a las clases 3 y 4, lo que deriva en una baja representatividad global del </w:t>
+      </w:r>
+      <w:proofErr w:type="spellStart"/>
+      <w:r>
+        <w:rPr>
+          <w:lang w:val="es-ES"/>
+        </w:rPr>
+        <w:t>dataset</w:t>
+      </w:r>
+      <w:proofErr w:type="spellEnd"/>
+      <w:r>
+        <w:rPr>
+          <w:lang w:val="es-ES"/>
+        </w:rPr>
+        <w:t xml:space="preserve"> y un impacto marginal del uso de PC-SMOTE.</w:t>
+      </w:r>
+      <w:r>
+        <w:rPr>
+          <w:lang w:val="es-ES"/>
+        </w:rPr>
+        <w:t xml:space="preserve">    </w:t>
+      </w:r>
+    </w:p>
+    <w:p>
+      <w:pPr>
+        <w:rPr>
+          <w:lang w:val="es-ES"/>
+        </w:rPr>
+      </w:pPr>
+      <w:r>
+        <w:rPr>
+          <w:noProof/>
+        </w:rPr>
+        <w:drawing>
+          <wp:inline distT="0" distB="0" distL="0" distR="0" wp14:anchorId="59B4695A" wp14:editId="6B1F2F56">
+            <wp:extent cx="3983178" cy="2369127"/>
+            <wp:effectExtent l="19050" t="19050" r="17780" b="12700"/>
+            <wp:docPr id="2073896208" name="Imagen 3" descr="Gráfico&#10;&#10;El contenido generado por IA puede ser incorrecto."/>
+            <wp:cNvGraphicFramePr>
+              <a:graphicFrameLocks xmlns:a="http://schemas.openxmlformats.org/drawingml/2006/main" noChangeAspect="1"/>
+            </wp:cNvGraphicFramePr>
+            <a:graphic xmlns:a="http://schemas.openxmlformats.org/drawingml/2006/main">
+              <a:graphicData uri="http://schemas.openxmlformats.org/drawingml/2006/picture">
+                <pic:pic xmlns:pic="http://schemas.openxmlformats.org/drawingml/2006/picture">
+                  <pic:nvPicPr>
+                    <pic:cNvPr id="2073896208" name="Imagen 3" descr="Gráfico&#10;&#10;El contenido generado por IA puede ser incorrecto."/>
+                    <pic:cNvPicPr>
+                      <a:picLocks noChangeAspect="1" noChangeArrowheads="1"/>
+                    </pic:cNvPicPr>
+                  </pic:nvPicPr>
+                  <pic:blipFill>
+                    <a:blip r:embed="rId20" cstate="print">
+                      <a:extLst>
+                        <a:ext uri="{28A0092B-C50C-407E-A947-70E740481C1C}">
+                          <a14:useLocalDpi xmlns:a14="http://schemas.microsoft.com/office/drawing/2010/main" val="0"/>
+                        </a:ext>
+                      </a:extLst>
+                    </a:blip>
+                    <a:srcRect/>
+                    <a:stretch>
+                      <a:fillRect/>
+                    </a:stretch>
+                  </pic:blipFill>
+                  <pic:spPr bwMode="auto">
+                    <a:xfrm>
+                      <a:off x="0" y="0"/>
+                      <a:ext cx="3995522" cy="2376469"/>
+                    </a:xfrm>
+                    <a:prstGeom prst="rect">
+                      <a:avLst/>
+                    </a:prstGeom>
+                    <a:noFill/>
+                    <a:ln>
+                      <a:solidFill>
+                        <a:schemeClr val="tx1"/>
+                      </a:solidFill>
+                    </a:ln>
+                  </pic:spPr>
+                </pic:pic>
+              </a:graphicData>
+            </a:graphic>
+          </wp:inline>
+        </w:drawing>
+      </w:r>
+    </w:p>
+    <w:p>
+      <w:pPr>
+        <w:rPr>
+          <w:b/>
+          <w:bCs/>
+          <w:lang w:val="es-ES"/>
+        </w:rPr>
+      </w:pPr>
+      <w:r>
+        <w:rPr>
+          <w:noProof/>
+        </w:rPr>
+        <w:drawing>
+          <wp:inline distT="0" distB="0" distL="0" distR="0" wp14:anchorId="6B399902" wp14:editId="2E3CD18B">
+            <wp:extent cx="6858000" cy="4023360"/>
+            <wp:effectExtent l="0" t="0" r="0" b="0"/>
+            <wp:docPr id="24" name="Imagen 24"/>
+            <wp:cNvGraphicFramePr>
+              <a:graphicFrameLocks xmlns:a="http://schemas.openxmlformats.org/drawingml/2006/main" noChangeAspect="1"/>
+            </wp:cNvGraphicFramePr>
+            <a:graphic xmlns:a="http://schemas.openxmlformats.org/drawingml/2006/main">
+              <a:graphicData uri="http://schemas.openxmlformats.org/drawingml/2006/picture">
+                <pic:pic xmlns:pic="http://schemas.openxmlformats.org/drawingml/2006/picture">
+                  <pic:nvPicPr>
+                    <pic:cNvPr id="0" name="Picture 31"/>
+                    <pic:cNvPicPr>
+                      <a:picLocks noChangeAspect="1" noChangeArrowheads="1"/>
+                    </pic:cNvPicPr>
+                  </pic:nvPicPr>
+                  <pic:blipFill>
+                    <a:blip r:embed="rId21">
+                      <a:extLst>
+                        <a:ext uri="{28A0092B-C50C-407E-A947-70E740481C1C}">
+                          <a14:useLocalDpi xmlns:a14="http://schemas.microsoft.com/office/drawing/2010/main" val="0"/>
+                        </a:ext>
+                      </a:extLst>
+                    </a:blip>
+                    <a:srcRect/>
+                    <a:stretch>
+                      <a:fillRect/>
+                    </a:stretch>
+                  </pic:blipFill>
+                  <pic:spPr bwMode="auto">
+                    <a:xfrm>
+                      <a:off x="0" y="0"/>
+                      <a:ext cx="6858000" cy="4023360"/>
+                    </a:xfrm>
+                    <a:prstGeom prst="rect">
+                      <a:avLst/>
+                    </a:prstGeom>
+                    <a:noFill/>
+                    <a:ln>
+                      <a:noFill/>
+                    </a:ln>
+                  </pic:spPr>
+                </pic:pic>
+              </a:graphicData>
+            </a:graphic>
+          </wp:inline>
+        </w:drawing>
+      </w:r>
+    </w:p>
+    <w:p>
+      <w:pPr>
+        <w:jc w:val="both"/>
+        <w:rPr>
+          <w:lang w:val="es-ES"/>
+        </w:rPr>
+      </w:pPr>
+      <w:r>
+        <w:rPr>
+          <w:b/>
+          <w:bCs/>
+          <w:lang w:val="es-ES"/>
+        </w:rPr>
+        <w:t>Análisis en performance:</w:t>
+      </w:r>
+      <w:r>
+        <w:rPr>
+          <w:lang w:val="es-ES"/>
+        </w:rPr>
+        <w:t xml:space="preserve"> </w:t>
+      </w:r>
+    </w:p>
+    <w:p>
+      <w:pPr>
+        <w:jc w:val="both"/>
+        <w:rPr>
+          <w:lang w:val="es-ES"/>
+        </w:rPr>
+      </w:pPr>
+      <w:r>
+        <w:rPr>
+          <w:lang w:val="es-ES"/>
+        </w:rPr>
+        <w:t xml:space="preserve">Se puede observar que ninguna de las técnicas de </w:t>
+      </w:r>
+      <w:proofErr w:type="spellStart"/>
+      <w:r>
+        <w:rPr>
+          <w:lang w:val="es-ES"/>
+        </w:rPr>
+        <w:t>sobremuestreo</w:t>
+      </w:r>
+      <w:proofErr w:type="spellEnd"/>
+      <w:r>
+        <w:rPr>
+          <w:lang w:val="es-ES"/>
+        </w:rPr>
+        <w:t xml:space="preserve"> evaluadas – incluyendo PC-SMOTE, </w:t>
+      </w:r>
+      <w:proofErr w:type="spellStart"/>
+      <w:r>
+        <w:rPr>
+          <w:lang w:val="es-ES"/>
+        </w:rPr>
+        <w:t>Borderline</w:t>
+      </w:r>
+      <w:proofErr w:type="spellEnd"/>
+      <w:r>
+        <w:rPr>
+          <w:lang w:val="es-ES"/>
+        </w:rPr>
+        <w:t xml:space="preserve">-SMOTE y ADASYN- logra una mejora consistente en términos de F1-macro respecto de los modelos base. Si bien algunas configuraciones alcanzan valores puntualmente similares o levemente superiores en validación cruzada, estas mejoras no </w:t>
+      </w:r>
+      <w:r>
+        <w:rPr>
+          <w:lang w:val="es-ES"/>
+        </w:rPr>
+        <w:lastRenderedPageBreak/>
+        <w:t xml:space="preserve">se sostienen de forma estable en </w:t>
       </w:r>
       <w:proofErr w:type="gramStart"/>
       <w:r>
         <w:rPr>
           <w:lang w:val="es-ES"/>
         </w:rPr>
-        <w:t>PCSMOTE  ni</w:t>
+        <w:t>el conjunta prueba</w:t>
       </w:r>
       <w:proofErr w:type="gramEnd"/>
       <w:r>
         <w:rPr>
           <w:lang w:val="es-ES"/>
         </w:rPr>
-        <w:t xml:space="preserve"> ningún otro método de </w:t>
+        <w:t xml:space="preserve">. Este comportamiento indica que la generación sintética no aporta información discriminativa adicional relevante para el clasificador. En este contexto, la baja cobertura efectiva de clases y la extrema escasez de semillas validas hacen que la estructura del espacio de características no sea compatible con métodos basados en vecindad, lo que imita severamente el impacto del </w:t>
       </w:r>
       <w:proofErr w:type="spellStart"/>
       <w:r>
@@ -3689,21 +4299,13 @@
         <w:rPr>
           <w:lang w:val="es-ES"/>
         </w:rPr>
-        <w:t xml:space="preserve"> logra mejorar la clasificación del modelo; esto se logra observar por la bajísima performance obtenida. En otras palabras, estos tipos de </w:t>
-      </w:r>
-      <w:proofErr w:type="spellStart"/>
-      <w:r>
-        <w:rPr>
-          <w:lang w:val="es-ES"/>
-        </w:rPr>
-        <w:t>datasets</w:t>
-      </w:r>
-      <w:proofErr w:type="spellEnd"/>
-      <w:r>
-        <w:rPr>
-          <w:lang w:val="es-ES"/>
-        </w:rPr>
-        <w:t xml:space="preserve"> no están hechos para funcionar con vecinos. </w:t>
+        <w:t xml:space="preserve"> sobre la performance final del modelo.</w:t>
+      </w:r>
+      <w:r>
+        <w:rPr>
+          <w:lang w:val="es-ES"/>
+        </w:rPr>
+        <w:t xml:space="preserve"> </w:t>
       </w:r>
     </w:p>
     <w:p>
@@ -3741,7 +4343,7 @@
                     </pic:cNvPicPr>
                   </pic:nvPicPr>
                   <pic:blipFill>
-                    <a:blip r:embed="rId19">
+                    <a:blip r:embed="rId22">
                       <a:extLst>
                         <a:ext uri="{28A0092B-C50C-407E-A947-70E740481C1C}">
                           <a14:useLocalDpi xmlns:a14="http://schemas.microsoft.com/office/drawing/2010/main" val="0"/>
@@ -3787,7 +4389,7 @@
         <w:tblLook w:val="04A0" w:firstRow="1" w:lastRow="0" w:firstColumn="1" w:lastColumn="0" w:noHBand="0" w:noVBand="1"/>
       </w:tblPr>
       <w:tblGrid>
-        <w:gridCol w:w="10456"/>
+        <w:gridCol w:w="10790"/>
       </w:tblGrid>
       <w:tr>
         <w:tc>
@@ -3879,7 +4481,6 @@
               </w:numPr>
             </w:pPr>
             <w:r>
-              <w:lastRenderedPageBreak/>
               <w:t>7: 29 (13.55%)</w:t>
             </w:r>
           </w:p>
@@ -3934,14 +4535,114 @@
     </w:p>
     <w:p>
       <w:pPr>
-        <w:rPr>
-          <w:lang w:val="es-ES"/>
-        </w:rPr>
-      </w:pPr>
+        <w:jc w:val="both"/>
+        <w:rPr>
+          <w:lang w:val="es-ES"/>
+        </w:rPr>
+      </w:pPr>
+      <w:r>
+        <w:t xml:space="preserve">La baja equidad de generación y la concentración de muestras sintéticas en pocas semillas implican que el aumento artificial de datos no se traduce en una expansión efectiva del espacio de decisión del clasificador. En lugar de mejorar la separabilidad entre clases, el </w:t>
+      </w:r>
+      <w:proofErr w:type="spellStart"/>
+      <w:r>
+        <w:t>sobremuestreo</w:t>
+      </w:r>
+      <w:proofErr w:type="spellEnd"/>
+      <w:r>
+        <w:t xml:space="preserve"> refuerza regiones locales ya dominantes, lo que limita el impacto positivo sobre la generalización.</w:t>
+      </w:r>
+    </w:p>
+    <w:p>
+      <w:pPr>
+        <w:jc w:val="both"/>
+        <w:rPr>
+          <w:lang w:val="es-ES"/>
+        </w:rPr>
+      </w:pPr>
+      <w:r>
+        <w:t xml:space="preserve">Asimismo, la cobertura incompleta de clases observada en varias configuraciones reduce el potencial beneficio del </w:t>
+      </w:r>
+      <w:proofErr w:type="spellStart"/>
+      <w:r>
+        <w:t>sobremuestreo</w:t>
+      </w:r>
+      <w:proofErr w:type="spellEnd"/>
+      <w:r>
+        <w:t>, ya que no todas las clases minoritarias logran una representación sintética suficiente como para influir de manera significativa en el proceso de entrenamiento. Esto explica por qué, aun cuando los criterios de pureza, densidad y riesgo se cumplen adecuadamente a nivel local, la mejora en performance global resulta marginal.</w:t>
+      </w:r>
       <w:r>
         <w:rPr>
           <w:noProof/>
         </w:rPr>
+        <w:drawing>
+          <wp:anchor distT="0" distB="0" distL="114300" distR="114300" simplePos="0" relativeHeight="251667456" behindDoc="0" locked="0" layoutInCell="1" allowOverlap="1" wp14:anchorId="1A34E990" wp14:editId="7E676E41">
+            <wp:simplePos x="457200" y="5988050"/>
+            <wp:positionH relativeFrom="margin">
+              <wp:align>left</wp:align>
+            </wp:positionH>
+            <wp:positionV relativeFrom="margin">
+              <wp:align>center</wp:align>
+            </wp:positionV>
+            <wp:extent cx="3834058" cy="2305050"/>
+            <wp:effectExtent l="0" t="0" r="0" b="0"/>
+            <wp:wrapSquare wrapText="bothSides"/>
+            <wp:docPr id="1390831473" name="Imagen 4" descr="Gráfico&#10;&#10;El contenido generado por IA puede ser incorrecto."/>
+            <wp:cNvGraphicFramePr>
+              <a:graphicFrameLocks xmlns:a="http://schemas.openxmlformats.org/drawingml/2006/main" noChangeAspect="1"/>
+            </wp:cNvGraphicFramePr>
+            <a:graphic xmlns:a="http://schemas.openxmlformats.org/drawingml/2006/main">
+              <a:graphicData uri="http://schemas.openxmlformats.org/drawingml/2006/picture">
+                <pic:pic xmlns:pic="http://schemas.openxmlformats.org/drawingml/2006/picture">
+                  <pic:nvPicPr>
+                    <pic:cNvPr id="1390831473" name="Imagen 4" descr="Gráfico&#10;&#10;El contenido generado por IA puede ser incorrecto."/>
+                    <pic:cNvPicPr>
+                      <a:picLocks noChangeAspect="1" noChangeArrowheads="1"/>
+                    </pic:cNvPicPr>
+                  </pic:nvPicPr>
+                  <pic:blipFill>
+                    <a:blip r:embed="rId23" cstate="print">
+                      <a:extLst>
+                        <a:ext uri="{28A0092B-C50C-407E-A947-70E740481C1C}">
+                          <a14:useLocalDpi xmlns:a14="http://schemas.microsoft.com/office/drawing/2010/main" val="0"/>
+                        </a:ext>
+                      </a:extLst>
+                    </a:blip>
+                    <a:srcRect/>
+                    <a:stretch>
+                      <a:fillRect/>
+                    </a:stretch>
+                  </pic:blipFill>
+                  <pic:spPr bwMode="auto">
+                    <a:xfrm>
+                      <a:off x="0" y="0"/>
+                      <a:ext cx="3834058" cy="2305050"/>
+                    </a:xfrm>
+                    <a:prstGeom prst="rect">
+                      <a:avLst/>
+                    </a:prstGeom>
+                    <a:noFill/>
+                    <a:ln>
+                      <a:noFill/>
+                    </a:ln>
+                  </pic:spPr>
+                </pic:pic>
+              </a:graphicData>
+            </a:graphic>
+          </wp:anchor>
+        </w:drawing>
+      </w:r>
+    </w:p>
+    <w:p>
+      <w:pPr>
+        <w:rPr>
+          <w:lang w:val="es-ES"/>
+        </w:rPr>
+      </w:pPr>
+      <w:r>
+        <w:rPr>
+          <w:noProof/>
+        </w:rPr>
+        <w:lastRenderedPageBreak/>
         <w:drawing>
           <wp:inline distT="0" distB="0" distL="0" distR="0" wp14:anchorId="0C1EBB5B" wp14:editId="0BFF8825">
             <wp:extent cx="6858000" cy="4023360"/>
@@ -3960,7 +4661,7 @@
                     </pic:cNvPicPr>
                   </pic:nvPicPr>
                   <pic:blipFill>
-                    <a:blip r:embed="rId20">
+                    <a:blip r:embed="rId24">
                       <a:extLst>
                         <a:ext uri="{28A0092B-C50C-407E-A947-70E740481C1C}">
                           <a14:useLocalDpi xmlns:a14="http://schemas.microsoft.com/office/drawing/2010/main" val="0"/>
@@ -4234,7 +4935,7 @@
                     </pic:cNvPicPr>
                   </pic:nvPicPr>
                   <pic:blipFill>
-                    <a:blip r:embed="rId21">
+                    <a:blip r:embed="rId25">
                       <a:extLst>
                         <a:ext uri="{28A0092B-C50C-407E-A947-70E740481C1C}">
                           <a14:useLocalDpi xmlns:a14="http://schemas.microsoft.com/office/drawing/2010/main" val="0"/>
@@ -4280,7 +4981,7 @@
         <w:tblLook w:val="04A0" w:firstRow="1" w:lastRow="0" w:firstColumn="1" w:lastColumn="0" w:noHBand="0" w:noVBand="1"/>
       </w:tblPr>
       <w:tblGrid>
-        <w:gridCol w:w="10456"/>
+        <w:gridCol w:w="10790"/>
       </w:tblGrid>
       <w:tr>
         <w:tc>
@@ -4447,6 +5148,7 @@
           <w:noProof/>
           <w:lang w:val="es-ES"/>
         </w:rPr>
+        <w:lastRenderedPageBreak/>
         <w:drawing>
           <wp:inline distT="0" distB="0" distL="0" distR="0" wp14:anchorId="6DBB3074" wp14:editId="222E3144">
             <wp:extent cx="6852285" cy="4019550"/>
@@ -4465,7 +5167,7 @@
                     </pic:cNvPicPr>
                   </pic:nvPicPr>
                   <pic:blipFill>
-                    <a:blip r:embed="rId22">
+                    <a:blip r:embed="rId26">
                       <a:extLst>
                         <a:ext uri="{28A0092B-C50C-407E-A947-70E740481C1C}">
                           <a14:useLocalDpi xmlns:a14="http://schemas.microsoft.com/office/drawing/2010/main" val="0"/>
@@ -4615,7 +5317,9 @@
         </w:rPr>
       </w:pPr>
       <w:r>
-        <w:lastRenderedPageBreak/>
+        <w:rPr>
+          <w:noProof/>
+        </w:rPr>
         <w:drawing>
           <wp:inline distT="0" distB="0" distL="0" distR="0" wp14:anchorId="61E19392" wp14:editId="63E75F31">
             <wp:extent cx="6858000" cy="2057400"/>
@@ -4634,7 +5338,7 @@
                     </pic:cNvPicPr>
                   </pic:nvPicPr>
                   <pic:blipFill>
-                    <a:blip r:embed="rId23">
+                    <a:blip r:embed="rId27">
                       <a:extLst>
                         <a:ext uri="{28A0092B-C50C-407E-A947-70E740481C1C}">
                           <a14:useLocalDpi xmlns:a14="http://schemas.microsoft.com/office/drawing/2010/main" val="0"/>
@@ -4667,7 +5371,7 @@
       </w:r>
     </w:p>
     <w:sectPr>
-      <w:pgSz w:w="11906" w:h="16838" w:code="9"/>
+      <w:pgSz w:w="12240" w:h="20160" w:code="5"/>
       <w:pgMar w:top="720" w:right="720" w:bottom="720" w:left="720" w:header="708" w:footer="708" w:gutter="0"/>
       <w:cols w:space="708"/>
       <w:docGrid w:linePitch="360"/>

</xml_diff>